<commit_message>
Add stakeholder section with semiconductor org mapping to BRD
New Section 2 with 15 functional areas mapped to semiconductor
organization structure: Technical Support Engineering, Applications
Engineering, Manufacturing/Fab Operations, Supply Chain/Sales Ops,
Quality & Reliability Engineering, Export Controls, Knowledge/Tech
Publications, and more. Includes RACI matrix with 11 decision areas.
Renumbered all subsequent sections (now 12 total).

Co-Authored-By: Claude Opus 4.6 <noreply@anthropic.com>
</commit_message>
<xml_diff>
--- a/docs/AI-Support-Assistant-BRD.docx
+++ b/docs/AI-Support-Assistant-BRD.docx
@@ -259,7 +259,2994 @@
         <w:pStyle w:val="Heading1"/>
       </w:pPr>
       <w:r>
-        <w:t xml:space="preserve">2. Business Objectives</w:t>
+        <w:t xml:space="preserve">2. Stakeholders</w:t>
+      </w:r>
+    </w:p>
+    <w:p>
+      <w:pPr>
+        <w:spacing w:after="200"/>
+      </w:pPr>
+      <w:r>
+        <w:rPr>
+          <w:rFonts w:ascii="Arial" w:cs="Arial" w:eastAsia="Arial" w:hAnsi="Arial"/>
+          <w:sz w:val="22"/>
+          <w:szCs w:val="22"/>
+        </w:rPr>
+        <w:t xml:space="preserve">Successful deployment of the AI Support Assistant requires engagement from the following functional areas. Each stakeholder group plays a critical role in requirements definition, validation, adoption, and ongoing governance. Functional areas are mapped to a semiconductor organization structure.</w:t>
+      </w:r>
+    </w:p>
+    <w:tbl>
+      <w:tblPr>
+        <w:tblW w:type="dxa" w:w="9360"/>
+        <w:tblBorders>
+          <w:top w:val="single" w:color="auto" w:sz="4"/>
+          <w:left w:val="single" w:color="auto" w:sz="4"/>
+          <w:bottom w:val="single" w:color="auto" w:sz="4"/>
+          <w:right w:val="single" w:color="auto" w:sz="4"/>
+          <w:insideH w:val="single" w:color="auto" w:sz="4"/>
+          <w:insideV w:val="single" w:color="auto" w:sz="4"/>
+        </w:tblBorders>
+      </w:tblPr>
+      <w:tblGrid>
+        <w:gridCol w:w="2200"/>
+        <w:gridCol w:w="1800"/>
+        <w:gridCol w:w="5360"/>
+      </w:tblGrid>
+      <w:tr>
+        <w:tc>
+          <w:tcPr>
+            <w:tcW w:type="dxa" w:w="2200"/>
+            <w:tcBorders>
+              <w:top w:val="single" w:color="CCCCCC" w:sz="1"/>
+              <w:left w:val="single" w:color="CCCCCC" w:sz="1"/>
+              <w:bottom w:val="single" w:color="CCCCCC" w:sz="1"/>
+              <w:right w:val="single" w:color="CCCCCC" w:sz="1"/>
+            </w:tcBorders>
+            <w:shd w:fill="86BC25" w:val="clear"/>
+            <w:tcMar>
+              <w:top w:type="dxa" w:w="80"/>
+              <w:left w:type="dxa" w:w="120"/>
+              <w:bottom w:type="dxa" w:w="80"/>
+              <w:right w:type="dxa" w:w="120"/>
+            </w:tcMar>
+          </w:tcPr>
+          <w:p>
+            <w:r>
+              <w:rPr>
+                <w:rFonts w:ascii="Arial" w:cs="Arial" w:eastAsia="Arial" w:hAnsi="Arial"/>
+                <w:b/>
+                <w:bCs/>
+                <w:color w:val="FFFFFF"/>
+                <w:sz w:val="20"/>
+                <w:szCs w:val="20"/>
+              </w:rPr>
+              <w:t xml:space="preserve">Functional Area</w:t>
+            </w:r>
+          </w:p>
+        </w:tc>
+        <w:tc>
+          <w:tcPr>
+            <w:tcW w:type="dxa" w:w="1800"/>
+            <w:tcBorders>
+              <w:top w:val="single" w:color="CCCCCC" w:sz="1"/>
+              <w:left w:val="single" w:color="CCCCCC" w:sz="1"/>
+              <w:bottom w:val="single" w:color="CCCCCC" w:sz="1"/>
+              <w:right w:val="single" w:color="CCCCCC" w:sz="1"/>
+            </w:tcBorders>
+            <w:shd w:fill="86BC25" w:val="clear"/>
+            <w:tcMar>
+              <w:top w:type="dxa" w:w="80"/>
+              <w:left w:type="dxa" w:w="120"/>
+              <w:bottom w:type="dxa" w:w="80"/>
+              <w:right w:type="dxa" w:w="120"/>
+            </w:tcMar>
+          </w:tcPr>
+          <w:p>
+            <w:r>
+              <w:rPr>
+                <w:rFonts w:ascii="Arial" w:cs="Arial" w:eastAsia="Arial" w:hAnsi="Arial"/>
+                <w:b/>
+                <w:bCs/>
+                <w:color w:val="FFFFFF"/>
+                <w:sz w:val="20"/>
+                <w:szCs w:val="20"/>
+              </w:rPr>
+              <w:t xml:space="preserve">Role(s)</w:t>
+            </w:r>
+          </w:p>
+        </w:tc>
+        <w:tc>
+          <w:tcPr>
+            <w:tcW w:type="dxa" w:w="5360"/>
+            <w:tcBorders>
+              <w:top w:val="single" w:color="CCCCCC" w:sz="1"/>
+              <w:left w:val="single" w:color="CCCCCC" w:sz="1"/>
+              <w:bottom w:val="single" w:color="CCCCCC" w:sz="1"/>
+              <w:right w:val="single" w:color="CCCCCC" w:sz="1"/>
+            </w:tcBorders>
+            <w:shd w:fill="86BC25" w:val="clear"/>
+            <w:tcMar>
+              <w:top w:type="dxa" w:w="80"/>
+              <w:left w:type="dxa" w:w="120"/>
+              <w:bottom w:type="dxa" w:w="80"/>
+              <w:right w:type="dxa" w:w="120"/>
+            </w:tcMar>
+          </w:tcPr>
+          <w:p>
+            <w:r>
+              <w:rPr>
+                <w:rFonts w:ascii="Arial" w:cs="Arial" w:eastAsia="Arial" w:hAnsi="Arial"/>
+                <w:b/>
+                <w:bCs/>
+                <w:color w:val="FFFFFF"/>
+                <w:sz w:val="20"/>
+                <w:szCs w:val="20"/>
+              </w:rPr>
+              <w:t xml:space="preserve">Responsibilities &amp; Demo Involvement</w:t>
+            </w:r>
+          </w:p>
+        </w:tc>
+      </w:tr>
+      <w:tr>
+        <w:tc>
+          <w:tcPr>
+            <w:tcW w:type="dxa" w:w="2200"/>
+            <w:tcBorders>
+              <w:top w:val="single" w:color="CCCCCC" w:sz="1"/>
+              <w:left w:val="single" w:color="CCCCCC" w:sz="1"/>
+              <w:bottom w:val="single" w:color="CCCCCC" w:sz="1"/>
+              <w:right w:val="single" w:color="CCCCCC" w:sz="1"/>
+            </w:tcBorders>
+            <w:tcMar>
+              <w:top w:type="dxa" w:w="80"/>
+              <w:left w:type="dxa" w:w="120"/>
+              <w:bottom w:type="dxa" w:w="80"/>
+              <w:right w:type="dxa" w:w="120"/>
+            </w:tcMar>
+          </w:tcPr>
+          <w:p>
+            <w:r>
+              <w:rPr>
+                <w:rFonts w:ascii="Arial" w:cs="Arial" w:eastAsia="Arial" w:hAnsi="Arial"/>
+                <w:b/>
+                <w:bCs/>
+                <w:sz w:val="20"/>
+                <w:szCs w:val="20"/>
+              </w:rPr>
+              <w:t xml:space="preserve">Executive Sponsor</w:t>
+            </w:r>
+          </w:p>
+        </w:tc>
+        <w:tc>
+          <w:tcPr>
+            <w:tcW w:type="dxa" w:w="1800"/>
+            <w:tcBorders>
+              <w:top w:val="single" w:color="CCCCCC" w:sz="1"/>
+              <w:left w:val="single" w:color="CCCCCC" w:sz="1"/>
+              <w:bottom w:val="single" w:color="CCCCCC" w:sz="1"/>
+              <w:right w:val="single" w:color="CCCCCC" w:sz="1"/>
+            </w:tcBorders>
+            <w:tcMar>
+              <w:top w:type="dxa" w:w="80"/>
+              <w:left w:type="dxa" w:w="120"/>
+              <w:bottom w:type="dxa" w:w="80"/>
+              <w:right w:type="dxa" w:w="120"/>
+            </w:tcMar>
+          </w:tcPr>
+          <w:p>
+            <w:r>
+              <w:rPr>
+                <w:rFonts w:ascii="Arial" w:cs="Arial" w:eastAsia="Arial" w:hAnsi="Arial"/>
+                <w:sz w:val="20"/>
+                <w:szCs w:val="20"/>
+              </w:rPr>
+              <w:t xml:space="preserve">CIO, CTO, SVP of Global Operations</w:t>
+            </w:r>
+          </w:p>
+        </w:tc>
+        <w:tc>
+          <w:tcPr>
+            <w:tcW w:type="dxa" w:w="5360"/>
+            <w:tcBorders>
+              <w:top w:val="single" w:color="CCCCCC" w:sz="1"/>
+              <w:left w:val="single" w:color="CCCCCC" w:sz="1"/>
+              <w:bottom w:val="single" w:color="CCCCCC" w:sz="1"/>
+              <w:right w:val="single" w:color="CCCCCC" w:sz="1"/>
+            </w:tcBorders>
+            <w:tcMar>
+              <w:top w:type="dxa" w:w="80"/>
+              <w:left w:type="dxa" w:w="120"/>
+              <w:bottom w:type="dxa" w:w="80"/>
+              <w:right w:type="dxa" w:w="120"/>
+            </w:tcMar>
+          </w:tcPr>
+          <w:p>
+            <w:r>
+              <w:rPr>
+                <w:rFonts w:ascii="Arial" w:cs="Arial" w:eastAsia="Arial" w:hAnsi="Arial"/>
+                <w:sz w:val="20"/>
+                <w:szCs w:val="20"/>
+              </w:rPr>
+              <w:t xml:space="preserve">Champions the initiative at the leadership level. Provides budget authority, resolves cross-functional conflicts between business units (DRAM, NAND, SSD), and validates strategic alignment with corporate digital transformation objectives. Approves phase gate transitions and final go-live.</w:t>
+            </w:r>
+          </w:p>
+        </w:tc>
+      </w:tr>
+      <w:tr>
+        <w:tc>
+          <w:tcPr>
+            <w:tcW w:type="dxa" w:w="2200"/>
+            <w:tcBorders>
+              <w:top w:val="single" w:color="CCCCCC" w:sz="1"/>
+              <w:left w:val="single" w:color="CCCCCC" w:sz="1"/>
+              <w:bottom w:val="single" w:color="CCCCCC" w:sz="1"/>
+              <w:right w:val="single" w:color="CCCCCC" w:sz="1"/>
+            </w:tcBorders>
+            <w:tcMar>
+              <w:top w:type="dxa" w:w="80"/>
+              <w:left w:type="dxa" w:w="120"/>
+              <w:bottom w:type="dxa" w:w="80"/>
+              <w:right w:type="dxa" w:w="120"/>
+            </w:tcMar>
+          </w:tcPr>
+          <w:p>
+            <w:r>
+              <w:rPr>
+                <w:rFonts w:ascii="Arial" w:cs="Arial" w:eastAsia="Arial" w:hAnsi="Arial"/>
+                <w:b/>
+                <w:bCs/>
+                <w:sz w:val="20"/>
+                <w:szCs w:val="20"/>
+              </w:rPr>
+              <w:t xml:space="preserve">Technical Support Engineering</w:t>
+            </w:r>
+          </w:p>
+        </w:tc>
+        <w:tc>
+          <w:tcPr>
+            <w:tcW w:type="dxa" w:w="1800"/>
+            <w:tcBorders>
+              <w:top w:val="single" w:color="CCCCCC" w:sz="1"/>
+              <w:left w:val="single" w:color="CCCCCC" w:sz="1"/>
+              <w:bottom w:val="single" w:color="CCCCCC" w:sz="1"/>
+              <w:right w:val="single" w:color="CCCCCC" w:sz="1"/>
+            </w:tcBorders>
+            <w:tcMar>
+              <w:top w:type="dxa" w:w="80"/>
+              <w:left w:type="dxa" w:w="120"/>
+              <w:bottom w:type="dxa" w:w="80"/>
+              <w:right w:type="dxa" w:w="120"/>
+            </w:tcMar>
+          </w:tcPr>
+          <w:p>
+            <w:r>
+              <w:rPr>
+                <w:rFonts w:ascii="Arial" w:cs="Arial" w:eastAsia="Arial" w:hAnsi="Arial"/>
+                <w:sz w:val="20"/>
+                <w:szCs w:val="20"/>
+              </w:rPr>
+              <w:t xml:space="preserve">VP of Technical Support, TSE Managers, FAE Team Leads</w:t>
+            </w:r>
+          </w:p>
+        </w:tc>
+        <w:tc>
+          <w:tcPr>
+            <w:tcW w:type="dxa" w:w="5360"/>
+            <w:tcBorders>
+              <w:top w:val="single" w:color="CCCCCC" w:sz="1"/>
+              <w:left w:val="single" w:color="CCCCCC" w:sz="1"/>
+              <w:bottom w:val="single" w:color="CCCCCC" w:sz="1"/>
+              <w:right w:val="single" w:color="CCCCCC" w:sz="1"/>
+            </w:tcBorders>
+            <w:tcMar>
+              <w:top w:type="dxa" w:w="80"/>
+              <w:left w:type="dxa" w:w="120"/>
+              <w:bottom w:type="dxa" w:w="80"/>
+              <w:right w:type="dxa" w:w="120"/>
+            </w:tcMar>
+          </w:tcPr>
+          <w:p>
+            <w:r>
+              <w:rPr>
+                <w:rFonts w:ascii="Arial" w:cs="Arial" w:eastAsia="Arial" w:hAnsi="Arial"/>
+                <w:sz w:val="20"/>
+                <w:szCs w:val="20"/>
+              </w:rPr>
+              <w:t xml:space="preserve">Primary business owners. Define knowledge base content covering product specifications, qualification data, reliability reports, and design-in guidance. Set escalation policies for Tier 1/2/3 support routing, call reason taxonomy (RMA, qualification, compatibility, firmware), and quality thresholds. Validate chat responses against product datasheets. Key users of the Analytics dashboard for case deflection and resolution metrics.</w:t>
+            </w:r>
+          </w:p>
+        </w:tc>
+      </w:tr>
+      <w:tr>
+        <w:tc>
+          <w:tcPr>
+            <w:tcW w:type="dxa" w:w="2200"/>
+            <w:tcBorders>
+              <w:top w:val="single" w:color="CCCCCC" w:sz="1"/>
+              <w:left w:val="single" w:color="CCCCCC" w:sz="1"/>
+              <w:bottom w:val="single" w:color="CCCCCC" w:sz="1"/>
+              <w:right w:val="single" w:color="CCCCCC" w:sz="1"/>
+            </w:tcBorders>
+            <w:tcMar>
+              <w:top w:type="dxa" w:w="80"/>
+              <w:left w:type="dxa" w:w="120"/>
+              <w:bottom w:type="dxa" w:w="80"/>
+              <w:right w:type="dxa" w:w="120"/>
+            </w:tcMar>
+          </w:tcPr>
+          <w:p>
+            <w:r>
+              <w:rPr>
+                <w:rFonts w:ascii="Arial" w:cs="Arial" w:eastAsia="Arial" w:hAnsi="Arial"/>
+                <w:b/>
+                <w:bCs/>
+                <w:sz w:val="20"/>
+                <w:szCs w:val="20"/>
+              </w:rPr>
+              <w:t xml:space="preserve">Applications Engineering</w:t>
+            </w:r>
+          </w:p>
+        </w:tc>
+        <w:tc>
+          <w:tcPr>
+            <w:tcW w:type="dxa" w:w="1800"/>
+            <w:tcBorders>
+              <w:top w:val="single" w:color="CCCCCC" w:sz="1"/>
+              <w:left w:val="single" w:color="CCCCCC" w:sz="1"/>
+              <w:bottom w:val="single" w:color="CCCCCC" w:sz="1"/>
+              <w:right w:val="single" w:color="CCCCCC" w:sz="1"/>
+            </w:tcBorders>
+            <w:tcMar>
+              <w:top w:type="dxa" w:w="80"/>
+              <w:left w:type="dxa" w:w="120"/>
+              <w:bottom w:type="dxa" w:w="80"/>
+              <w:right w:type="dxa" w:w="120"/>
+            </w:tcMar>
+          </w:tcPr>
+          <w:p>
+            <w:r>
+              <w:rPr>
+                <w:rFonts w:ascii="Arial" w:cs="Arial" w:eastAsia="Arial" w:hAnsi="Arial"/>
+                <w:sz w:val="20"/>
+                <w:szCs w:val="20"/>
+              </w:rPr>
+              <w:t xml:space="preserve">Applications Engineers, Solutions Architects, Design-In Support</w:t>
+            </w:r>
+          </w:p>
+        </w:tc>
+        <w:tc>
+          <w:tcPr>
+            <w:tcW w:type="dxa" w:w="5360"/>
+            <w:tcBorders>
+              <w:top w:val="single" w:color="CCCCCC" w:sz="1"/>
+              <w:left w:val="single" w:color="CCCCCC" w:sz="1"/>
+              <w:bottom w:val="single" w:color="CCCCCC" w:sz="1"/>
+              <w:right w:val="single" w:color="CCCCCC" w:sz="1"/>
+            </w:tcBorders>
+            <w:tcMar>
+              <w:top w:type="dxa" w:w="80"/>
+              <w:left w:type="dxa" w:w="120"/>
+              <w:bottom w:type="dxa" w:w="80"/>
+              <w:right w:type="dxa" w:w="120"/>
+            </w:tcMar>
+          </w:tcPr>
+          <w:p>
+            <w:r>
+              <w:rPr>
+                <w:rFonts w:ascii="Arial" w:cs="Arial" w:eastAsia="Arial" w:hAnsi="Arial"/>
+                <w:sz w:val="20"/>
+                <w:szCs w:val="20"/>
+              </w:rPr>
+              <w:t xml:space="preserve">Provide deep technical SME input for the knowledge base: memory interface design, signal integrity, thermal management, firmware integration, and platform compatibility. Validate that AI responses to technical queries meet engineering accuracy standards. Define when queries must escalate from AI to human AE (e.g., custom characterization requests, NDA-protected data).</w:t>
+            </w:r>
+          </w:p>
+        </w:tc>
+      </w:tr>
+      <w:tr>
+        <w:tc>
+          <w:tcPr>
+            <w:tcW w:type="dxa" w:w="2200"/>
+            <w:tcBorders>
+              <w:top w:val="single" w:color="CCCCCC" w:sz="1"/>
+              <w:left w:val="single" w:color="CCCCCC" w:sz="1"/>
+              <w:bottom w:val="single" w:color="CCCCCC" w:sz="1"/>
+              <w:right w:val="single" w:color="CCCCCC" w:sz="1"/>
+            </w:tcBorders>
+            <w:tcMar>
+              <w:top w:type="dxa" w:w="80"/>
+              <w:left w:type="dxa" w:w="120"/>
+              <w:bottom w:type="dxa" w:w="80"/>
+              <w:right w:type="dxa" w:w="120"/>
+            </w:tcMar>
+          </w:tcPr>
+          <w:p>
+            <w:r>
+              <w:rPr>
+                <w:rFonts w:ascii="Arial" w:cs="Arial" w:eastAsia="Arial" w:hAnsi="Arial"/>
+                <w:b/>
+                <w:bCs/>
+                <w:sz w:val="20"/>
+                <w:szCs w:val="20"/>
+              </w:rPr>
+              <w:t xml:space="preserve">Manufacturing / Fab Operations</w:t>
+            </w:r>
+          </w:p>
+        </w:tc>
+        <w:tc>
+          <w:tcPr>
+            <w:tcW w:type="dxa" w:w="1800"/>
+            <w:tcBorders>
+              <w:top w:val="single" w:color="CCCCCC" w:sz="1"/>
+              <w:left w:val="single" w:color="CCCCCC" w:sz="1"/>
+              <w:bottom w:val="single" w:color="CCCCCC" w:sz="1"/>
+              <w:right w:val="single" w:color="CCCCCC" w:sz="1"/>
+            </w:tcBorders>
+            <w:tcMar>
+              <w:top w:type="dxa" w:w="80"/>
+              <w:left w:type="dxa" w:w="120"/>
+              <w:bottom w:type="dxa" w:w="80"/>
+              <w:right w:type="dxa" w:w="120"/>
+            </w:tcMar>
+          </w:tcPr>
+          <w:p>
+            <w:r>
+              <w:rPr>
+                <w:rFonts w:ascii="Arial" w:cs="Arial" w:eastAsia="Arial" w:hAnsi="Arial"/>
+                <w:sz w:val="20"/>
+                <w:szCs w:val="20"/>
+              </w:rPr>
+              <w:t xml:space="preserve">VP of Manufacturing, Fab Managers, Process Engineers</w:t>
+            </w:r>
+          </w:p>
+        </w:tc>
+        <w:tc>
+          <w:tcPr>
+            <w:tcW w:type="dxa" w:w="5360"/>
+            <w:tcBorders>
+              <w:top w:val="single" w:color="CCCCCC" w:sz="1"/>
+              <w:left w:val="single" w:color="CCCCCC" w:sz="1"/>
+              <w:bottom w:val="single" w:color="CCCCCC" w:sz="1"/>
+              <w:right w:val="single" w:color="CCCCCC" w:sz="1"/>
+            </w:tcBorders>
+            <w:tcMar>
+              <w:top w:type="dxa" w:w="80"/>
+              <w:left w:type="dxa" w:w="120"/>
+              <w:bottom w:type="dxa" w:w="80"/>
+              <w:right w:type="dxa" w:w="120"/>
+            </w:tcMar>
+          </w:tcPr>
+          <w:p>
+            <w:r>
+              <w:rPr>
+                <w:rFonts w:ascii="Arial" w:cs="Arial" w:eastAsia="Arial" w:hAnsi="Arial"/>
+                <w:sz w:val="20"/>
+                <w:szCs w:val="20"/>
+              </w:rPr>
+              <w:t xml:space="preserve">Stakeholders for internal-facing support use cases: fab process documentation, equipment troubleshooting, yield analysis procedures, and clean room protocols. Define knowledge domains for internal engineer self-service. Validate that sensitive manufacturing IP is properly classified and access-controlled within the RAG pipeline.</w:t>
+            </w:r>
+          </w:p>
+        </w:tc>
+      </w:tr>
+      <w:tr>
+        <w:tc>
+          <w:tcPr>
+            <w:tcW w:type="dxa" w:w="2200"/>
+            <w:tcBorders>
+              <w:top w:val="single" w:color="CCCCCC" w:sz="1"/>
+              <w:left w:val="single" w:color="CCCCCC" w:sz="1"/>
+              <w:bottom w:val="single" w:color="CCCCCC" w:sz="1"/>
+              <w:right w:val="single" w:color="CCCCCC" w:sz="1"/>
+            </w:tcBorders>
+            <w:tcMar>
+              <w:top w:type="dxa" w:w="80"/>
+              <w:left w:type="dxa" w:w="120"/>
+              <w:bottom w:type="dxa" w:w="80"/>
+              <w:right w:type="dxa" w:w="120"/>
+            </w:tcMar>
+          </w:tcPr>
+          <w:p>
+            <w:r>
+              <w:rPr>
+                <w:rFonts w:ascii="Arial" w:cs="Arial" w:eastAsia="Arial" w:hAnsi="Arial"/>
+                <w:b/>
+                <w:bCs/>
+                <w:sz w:val="20"/>
+                <w:szCs w:val="20"/>
+              </w:rPr>
+              <w:t xml:space="preserve">IT / Cloud Infrastructure</w:t>
+            </w:r>
+          </w:p>
+        </w:tc>
+        <w:tc>
+          <w:tcPr>
+            <w:tcW w:type="dxa" w:w="1800"/>
+            <w:tcBorders>
+              <w:top w:val="single" w:color="CCCCCC" w:sz="1"/>
+              <w:left w:val="single" w:color="CCCCCC" w:sz="1"/>
+              <w:bottom w:val="single" w:color="CCCCCC" w:sz="1"/>
+              <w:right w:val="single" w:color="CCCCCC" w:sz="1"/>
+            </w:tcBorders>
+            <w:tcMar>
+              <w:top w:type="dxa" w:w="80"/>
+              <w:left w:type="dxa" w:w="120"/>
+              <w:bottom w:type="dxa" w:w="80"/>
+              <w:right w:type="dxa" w:w="120"/>
+            </w:tcMar>
+          </w:tcPr>
+          <w:p>
+            <w:r>
+              <w:rPr>
+                <w:rFonts w:ascii="Arial" w:cs="Arial" w:eastAsia="Arial" w:hAnsi="Arial"/>
+                <w:sz w:val="20"/>
+                <w:szCs w:val="20"/>
+              </w:rPr>
+              <w:t xml:space="preserve">Cloud Architect, Platform Engineer, DevOps Lead</w:t>
+            </w:r>
+          </w:p>
+        </w:tc>
+        <w:tc>
+          <w:tcPr>
+            <w:tcW w:type="dxa" w:w="5360"/>
+            <w:tcBorders>
+              <w:top w:val="single" w:color="CCCCCC" w:sz="1"/>
+              <w:left w:val="single" w:color="CCCCCC" w:sz="1"/>
+              <w:bottom w:val="single" w:color="CCCCCC" w:sz="1"/>
+              <w:right w:val="single" w:color="CCCCCC" w:sz="1"/>
+            </w:tcBorders>
+            <w:tcMar>
+              <w:top w:type="dxa" w:w="80"/>
+              <w:left w:type="dxa" w:w="120"/>
+              <w:bottom w:type="dxa" w:w="80"/>
+              <w:right w:type="dxa" w:w="120"/>
+            </w:tcMar>
+          </w:tcPr>
+          <w:p>
+            <w:r>
+              <w:rPr>
+                <w:rFonts w:ascii="Arial" w:cs="Arial" w:eastAsia="Arial" w:hAnsi="Arial"/>
+                <w:sz w:val="20"/>
+                <w:szCs w:val="20"/>
+              </w:rPr>
+              <w:t xml:space="preserve">Provision and manage Azure resources (OpenAI, AI Search, Cosmos DB, Fabric). Configure networking (private endpoints, VNets, ExpressRoute to on-prem fab systems), CI/CD pipelines, and monitoring. Integrate with existing semiconductor ERP (SAP) and PLM systems. Validate the Architecture tab for technical accuracy and feasibility.</w:t>
+            </w:r>
+          </w:p>
+        </w:tc>
+      </w:tr>
+      <w:tr>
+        <w:tc>
+          <w:tcPr>
+            <w:tcW w:type="dxa" w:w="2200"/>
+            <w:tcBorders>
+              <w:top w:val="single" w:color="CCCCCC" w:sz="1"/>
+              <w:left w:val="single" w:color="CCCCCC" w:sz="1"/>
+              <w:bottom w:val="single" w:color="CCCCCC" w:sz="1"/>
+              <w:right w:val="single" w:color="CCCCCC" w:sz="1"/>
+            </w:tcBorders>
+            <w:tcMar>
+              <w:top w:type="dxa" w:w="80"/>
+              <w:left w:type="dxa" w:w="120"/>
+              <w:bottom w:type="dxa" w:w="80"/>
+              <w:right w:type="dxa" w:w="120"/>
+            </w:tcMar>
+          </w:tcPr>
+          <w:p>
+            <w:r>
+              <w:rPr>
+                <w:rFonts w:ascii="Arial" w:cs="Arial" w:eastAsia="Arial" w:hAnsi="Arial"/>
+                <w:b/>
+                <w:bCs/>
+                <w:sz w:val="20"/>
+                <w:szCs w:val="20"/>
+              </w:rPr>
+              <w:t xml:space="preserve">Information Security &amp; Export Controls</w:t>
+            </w:r>
+          </w:p>
+        </w:tc>
+        <w:tc>
+          <w:tcPr>
+            <w:tcW w:type="dxa" w:w="1800"/>
+            <w:tcBorders>
+              <w:top w:val="single" w:color="CCCCCC" w:sz="1"/>
+              <w:left w:val="single" w:color="CCCCCC" w:sz="1"/>
+              <w:bottom w:val="single" w:color="CCCCCC" w:sz="1"/>
+              <w:right w:val="single" w:color="CCCCCC" w:sz="1"/>
+            </w:tcBorders>
+            <w:tcMar>
+              <w:top w:type="dxa" w:w="80"/>
+              <w:left w:type="dxa" w:w="120"/>
+              <w:bottom w:type="dxa" w:w="80"/>
+              <w:right w:type="dxa" w:w="120"/>
+            </w:tcMar>
+          </w:tcPr>
+          <w:p>
+            <w:r>
+              <w:rPr>
+                <w:rFonts w:ascii="Arial" w:cs="Arial" w:eastAsia="Arial" w:hAnsi="Arial"/>
+                <w:sz w:val="20"/>
+                <w:szCs w:val="20"/>
+              </w:rPr>
+              <w:t xml:space="preserve">CISO, Security Architect, Export Control Officer</w:t>
+            </w:r>
+          </w:p>
+        </w:tc>
+        <w:tc>
+          <w:tcPr>
+            <w:tcW w:type="dxa" w:w="5360"/>
+            <w:tcBorders>
+              <w:top w:val="single" w:color="CCCCCC" w:sz="1"/>
+              <w:left w:val="single" w:color="CCCCCC" w:sz="1"/>
+              <w:bottom w:val="single" w:color="CCCCCC" w:sz="1"/>
+              <w:right w:val="single" w:color="CCCCCC" w:sz="1"/>
+            </w:tcBorders>
+            <w:tcMar>
+              <w:top w:type="dxa" w:w="80"/>
+              <w:left w:type="dxa" w:w="120"/>
+              <w:bottom w:type="dxa" w:w="80"/>
+              <w:right w:type="dxa" w:w="120"/>
+            </w:tcMar>
+          </w:tcPr>
+          <w:p>
+            <w:r>
+              <w:rPr>
+                <w:rFonts w:ascii="Arial" w:cs="Arial" w:eastAsia="Arial" w:hAnsi="Arial"/>
+                <w:sz w:val="20"/>
+                <w:szCs w:val="20"/>
+              </w:rPr>
+              <w:t xml:space="preserve">Approve security architecture: Entra ID integration, RBAC policies, data residency controls, and encryption standards. Critical semiconductor-specific concerns: ITAR/EAR export control compliance for restricted product data, IP protection for process technology and design rules, CHIPS Act compliance for government-funded programs, and controlled unclassified information (CUI) handling. Review AI safety guardrails to prevent inadvertent disclosure of restricted technical data.</w:t>
+            </w:r>
+          </w:p>
+        </w:tc>
+      </w:tr>
+      <w:tr>
+        <w:tc>
+          <w:tcPr>
+            <w:tcW w:type="dxa" w:w="2200"/>
+            <w:tcBorders>
+              <w:top w:val="single" w:color="CCCCCC" w:sz="1"/>
+              <w:left w:val="single" w:color="CCCCCC" w:sz="1"/>
+              <w:bottom w:val="single" w:color="CCCCCC" w:sz="1"/>
+              <w:right w:val="single" w:color="CCCCCC" w:sz="1"/>
+            </w:tcBorders>
+            <w:tcMar>
+              <w:top w:type="dxa" w:w="80"/>
+              <w:left w:type="dxa" w:w="120"/>
+              <w:bottom w:type="dxa" w:w="80"/>
+              <w:right w:type="dxa" w:w="120"/>
+            </w:tcMar>
+          </w:tcPr>
+          <w:p>
+            <w:r>
+              <w:rPr>
+                <w:rFonts w:ascii="Arial" w:cs="Arial" w:eastAsia="Arial" w:hAnsi="Arial"/>
+                <w:b/>
+                <w:bCs/>
+                <w:sz w:val="20"/>
+                <w:szCs w:val="20"/>
+              </w:rPr>
+              <w:t xml:space="preserve">Supply Chain / Sales Operations</w:t>
+            </w:r>
+          </w:p>
+        </w:tc>
+        <w:tc>
+          <w:tcPr>
+            <w:tcW w:type="dxa" w:w="1800"/>
+            <w:tcBorders>
+              <w:top w:val="single" w:color="CCCCCC" w:sz="1"/>
+              <w:left w:val="single" w:color="CCCCCC" w:sz="1"/>
+              <w:bottom w:val="single" w:color="CCCCCC" w:sz="1"/>
+              <w:right w:val="single" w:color="CCCCCC" w:sz="1"/>
+            </w:tcBorders>
+            <w:tcMar>
+              <w:top w:type="dxa" w:w="80"/>
+              <w:left w:type="dxa" w:w="120"/>
+              <w:bottom w:type="dxa" w:w="80"/>
+              <w:right w:type="dxa" w:w="120"/>
+            </w:tcMar>
+          </w:tcPr>
+          <w:p>
+            <w:r>
+              <w:rPr>
+                <w:rFonts w:ascii="Arial" w:cs="Arial" w:eastAsia="Arial" w:hAnsi="Arial"/>
+                <w:sz w:val="20"/>
+                <w:szCs w:val="20"/>
+              </w:rPr>
+              <w:t xml:space="preserve">VP of Sales Ops, Supply Chain Manager, Order Management Lead</w:t>
+            </w:r>
+          </w:p>
+        </w:tc>
+        <w:tc>
+          <w:tcPr>
+            <w:tcW w:type="dxa" w:w="5360"/>
+            <w:tcBorders>
+              <w:top w:val="single" w:color="CCCCCC" w:sz="1"/>
+              <w:left w:val="single" w:color="CCCCCC" w:sz="1"/>
+              <w:bottom w:val="single" w:color="CCCCCC" w:sz="1"/>
+              <w:right w:val="single" w:color="CCCCCC" w:sz="1"/>
+            </w:tcBorders>
+            <w:tcMar>
+              <w:top w:type="dxa" w:w="80"/>
+              <w:left w:type="dxa" w:w="120"/>
+              <w:bottom w:type="dxa" w:w="80"/>
+              <w:right w:type="dxa" w:w="120"/>
+            </w:tcMar>
+          </w:tcPr>
+          <w:p>
+            <w:r>
+              <w:rPr>
+                <w:rFonts w:ascii="Arial" w:cs="Arial" w:eastAsia="Arial" w:hAnsi="Arial"/>
+                <w:sz w:val="20"/>
+                <w:szCs w:val="20"/>
+              </w:rPr>
+              <w:t xml:space="preserve">Define support workflows for customer-facing queries: order status, lead times, allocation updates, inventory availability, and pricing. Own the integration requirements with SAP and CRM (Dynamics 365) for real-time order data. Validate function calling for order lookup and shipment tracking. Key consumers of the Analytics dashboard for customer interaction trends.</w:t>
+            </w:r>
+          </w:p>
+        </w:tc>
+      </w:tr>
+      <w:tr>
+        <w:tc>
+          <w:tcPr>
+            <w:tcW w:type="dxa" w:w="2200"/>
+            <w:tcBorders>
+              <w:top w:val="single" w:color="CCCCCC" w:sz="1"/>
+              <w:left w:val="single" w:color="CCCCCC" w:sz="1"/>
+              <w:bottom w:val="single" w:color="CCCCCC" w:sz="1"/>
+              <w:right w:val="single" w:color="CCCCCC" w:sz="1"/>
+            </w:tcBorders>
+            <w:tcMar>
+              <w:top w:type="dxa" w:w="80"/>
+              <w:left w:type="dxa" w:w="120"/>
+              <w:bottom w:type="dxa" w:w="80"/>
+              <w:right w:type="dxa" w:w="120"/>
+            </w:tcMar>
+          </w:tcPr>
+          <w:p>
+            <w:r>
+              <w:rPr>
+                <w:rFonts w:ascii="Arial" w:cs="Arial" w:eastAsia="Arial" w:hAnsi="Arial"/>
+                <w:b/>
+                <w:bCs/>
+                <w:sz w:val="20"/>
+                <w:szCs w:val="20"/>
+              </w:rPr>
+              <w:t xml:space="preserve">Data &amp; Analytics</w:t>
+            </w:r>
+          </w:p>
+        </w:tc>
+        <w:tc>
+          <w:tcPr>
+            <w:tcW w:type="dxa" w:w="1800"/>
+            <w:tcBorders>
+              <w:top w:val="single" w:color="CCCCCC" w:sz="1"/>
+              <w:left w:val="single" w:color="CCCCCC" w:sz="1"/>
+              <w:bottom w:val="single" w:color="CCCCCC" w:sz="1"/>
+              <w:right w:val="single" w:color="CCCCCC" w:sz="1"/>
+            </w:tcBorders>
+            <w:tcMar>
+              <w:top w:type="dxa" w:w="80"/>
+              <w:left w:type="dxa" w:w="120"/>
+              <w:bottom w:type="dxa" w:w="80"/>
+              <w:right w:type="dxa" w:w="120"/>
+            </w:tcMar>
+          </w:tcPr>
+          <w:p>
+            <w:r>
+              <w:rPr>
+                <w:rFonts w:ascii="Arial" w:cs="Arial" w:eastAsia="Arial" w:hAnsi="Arial"/>
+                <w:sz w:val="20"/>
+                <w:szCs w:val="20"/>
+              </w:rPr>
+              <w:t xml:space="preserve">Chief Data Officer, Analytics Lead, BI Developer</w:t>
+            </w:r>
+          </w:p>
+        </w:tc>
+        <w:tc>
+          <w:tcPr>
+            <w:tcW w:type="dxa" w:w="5360"/>
+            <w:tcBorders>
+              <w:top w:val="single" w:color="CCCCCC" w:sz="1"/>
+              <w:left w:val="single" w:color="CCCCCC" w:sz="1"/>
+              <w:bottom w:val="single" w:color="CCCCCC" w:sz="1"/>
+              <w:right w:val="single" w:color="CCCCCC" w:sz="1"/>
+            </w:tcBorders>
+            <w:tcMar>
+              <w:top w:type="dxa" w:w="80"/>
+              <w:left w:type="dxa" w:w="120"/>
+              <w:bottom w:type="dxa" w:w="80"/>
+              <w:right w:type="dxa" w:w="120"/>
+            </w:tcMar>
+          </w:tcPr>
+          <w:p>
+            <w:r>
+              <w:rPr>
+                <w:rFonts w:ascii="Arial" w:cs="Arial" w:eastAsia="Arial" w:hAnsi="Arial"/>
+                <w:sz w:val="20"/>
+                <w:szCs w:val="20"/>
+              </w:rPr>
+              <w:t xml:space="preserve">Define KPIs, reporting requirements, and data governance policies. Own the Cosmos DB to Fabric to Power BI pipeline. Integrate with existing manufacturing intelligence and yield analytics platforms. Validate the Analytics tab for metric accuracy, sentiment scoring methodology, and dashboard design.</w:t>
+            </w:r>
+          </w:p>
+        </w:tc>
+      </w:tr>
+      <w:tr>
+        <w:tc>
+          <w:tcPr>
+            <w:tcW w:type="dxa" w:w="2200"/>
+            <w:tcBorders>
+              <w:top w:val="single" w:color="CCCCCC" w:sz="1"/>
+              <w:left w:val="single" w:color="CCCCCC" w:sz="1"/>
+              <w:bottom w:val="single" w:color="CCCCCC" w:sz="1"/>
+              <w:right w:val="single" w:color="CCCCCC" w:sz="1"/>
+            </w:tcBorders>
+            <w:tcMar>
+              <w:top w:type="dxa" w:w="80"/>
+              <w:left w:type="dxa" w:w="120"/>
+              <w:bottom w:type="dxa" w:w="80"/>
+              <w:right w:type="dxa" w:w="120"/>
+            </w:tcMar>
+          </w:tcPr>
+          <w:p>
+            <w:r>
+              <w:rPr>
+                <w:rFonts w:ascii="Arial" w:cs="Arial" w:eastAsia="Arial" w:hAnsi="Arial"/>
+                <w:b/>
+                <w:bCs/>
+                <w:sz w:val="20"/>
+                <w:szCs w:val="20"/>
+              </w:rPr>
+              <w:t xml:space="preserve">AI / Machine Learning</w:t>
+            </w:r>
+          </w:p>
+        </w:tc>
+        <w:tc>
+          <w:tcPr>
+            <w:tcW w:type="dxa" w:w="1800"/>
+            <w:tcBorders>
+              <w:top w:val="single" w:color="CCCCCC" w:sz="1"/>
+              <w:left w:val="single" w:color="CCCCCC" w:sz="1"/>
+              <w:bottom w:val="single" w:color="CCCCCC" w:sz="1"/>
+              <w:right w:val="single" w:color="CCCCCC" w:sz="1"/>
+            </w:tcBorders>
+            <w:tcMar>
+              <w:top w:type="dxa" w:w="80"/>
+              <w:left w:type="dxa" w:w="120"/>
+              <w:bottom w:type="dxa" w:w="80"/>
+              <w:right w:type="dxa" w:w="120"/>
+            </w:tcMar>
+          </w:tcPr>
+          <w:p>
+            <w:r>
+              <w:rPr>
+                <w:rFonts w:ascii="Arial" w:cs="Arial" w:eastAsia="Arial" w:hAnsi="Arial"/>
+                <w:sz w:val="20"/>
+                <w:szCs w:val="20"/>
+              </w:rPr>
+              <w:t xml:space="preserve">AI/ML Lead, Prompt Engineer, Data Scientist</w:t>
+            </w:r>
+          </w:p>
+        </w:tc>
+        <w:tc>
+          <w:tcPr>
+            <w:tcW w:type="dxa" w:w="5360"/>
+            <w:tcBorders>
+              <w:top w:val="single" w:color="CCCCCC" w:sz="1"/>
+              <w:left w:val="single" w:color="CCCCCC" w:sz="1"/>
+              <w:bottom w:val="single" w:color="CCCCCC" w:sz="1"/>
+              <w:right w:val="single" w:color="CCCCCC" w:sz="1"/>
+            </w:tcBorders>
+            <w:tcMar>
+              <w:top w:type="dxa" w:w="80"/>
+              <w:left w:type="dxa" w:w="120"/>
+              <w:bottom w:type="dxa" w:w="80"/>
+              <w:right w:type="dxa" w:w="120"/>
+            </w:tcMar>
+          </w:tcPr>
+          <w:p>
+            <w:r>
+              <w:rPr>
+                <w:rFonts w:ascii="Arial" w:cs="Arial" w:eastAsia="Arial" w:hAnsi="Arial"/>
+                <w:sz w:val="20"/>
+                <w:szCs w:val="20"/>
+              </w:rPr>
+              <w:t xml:space="preserve">Configure Azure OpenAI models, tune RAG pipeline parameters for semiconductor-specific terminology and part numbers, design function calling schemas, and optimize prompt templates. Evaluate model tier selection (Pro for complex technical queries, Basic for order status, Lite for FAQs). Coordinate with existing AI/ML teams working on yield prediction and defect detection.</w:t>
+            </w:r>
+          </w:p>
+        </w:tc>
+      </w:tr>
+      <w:tr>
+        <w:tc>
+          <w:tcPr>
+            <w:tcW w:type="dxa" w:w="2200"/>
+            <w:tcBorders>
+              <w:top w:val="single" w:color="CCCCCC" w:sz="1"/>
+              <w:left w:val="single" w:color="CCCCCC" w:sz="1"/>
+              <w:bottom w:val="single" w:color="CCCCCC" w:sz="1"/>
+              <w:right w:val="single" w:color="CCCCCC" w:sz="1"/>
+            </w:tcBorders>
+            <w:tcMar>
+              <w:top w:type="dxa" w:w="80"/>
+              <w:left w:type="dxa" w:w="120"/>
+              <w:bottom w:type="dxa" w:w="80"/>
+              <w:right w:type="dxa" w:w="120"/>
+            </w:tcMar>
+          </w:tcPr>
+          <w:p>
+            <w:r>
+              <w:rPr>
+                <w:rFonts w:ascii="Arial" w:cs="Arial" w:eastAsia="Arial" w:hAnsi="Arial"/>
+                <w:b/>
+                <w:bCs/>
+                <w:sz w:val="20"/>
+                <w:szCs w:val="20"/>
+              </w:rPr>
+              <w:t xml:space="preserve">Unified Communications / Telephony</w:t>
+            </w:r>
+          </w:p>
+        </w:tc>
+        <w:tc>
+          <w:tcPr>
+            <w:tcW w:type="dxa" w:w="1800"/>
+            <w:tcBorders>
+              <w:top w:val="single" w:color="CCCCCC" w:sz="1"/>
+              <w:left w:val="single" w:color="CCCCCC" w:sz="1"/>
+              <w:bottom w:val="single" w:color="CCCCCC" w:sz="1"/>
+              <w:right w:val="single" w:color="CCCCCC" w:sz="1"/>
+            </w:tcBorders>
+            <w:tcMar>
+              <w:top w:type="dxa" w:w="80"/>
+              <w:left w:type="dxa" w:w="120"/>
+              <w:bottom w:type="dxa" w:w="80"/>
+              <w:right w:type="dxa" w:w="120"/>
+            </w:tcMar>
+          </w:tcPr>
+          <w:p>
+            <w:r>
+              <w:rPr>
+                <w:rFonts w:ascii="Arial" w:cs="Arial" w:eastAsia="Arial" w:hAnsi="Arial"/>
+                <w:sz w:val="20"/>
+                <w:szCs w:val="20"/>
+              </w:rPr>
+              <w:t xml:space="preserve">UC Manager, Teams Administrator, Telephony Engineer</w:t>
+            </w:r>
+          </w:p>
+        </w:tc>
+        <w:tc>
+          <w:tcPr>
+            <w:tcW w:type="dxa" w:w="5360"/>
+            <w:tcBorders>
+              <w:top w:val="single" w:color="CCCCCC" w:sz="1"/>
+              <w:left w:val="single" w:color="CCCCCC" w:sz="1"/>
+              <w:bottom w:val="single" w:color="CCCCCC" w:sz="1"/>
+              <w:right w:val="single" w:color="CCCCCC" w:sz="1"/>
+            </w:tcBorders>
+            <w:tcMar>
+              <w:top w:type="dxa" w:w="80"/>
+              <w:left w:type="dxa" w:w="120"/>
+              <w:bottom w:type="dxa" w:w="80"/>
+              <w:right w:type="dxa" w:w="120"/>
+            </w:tcMar>
+          </w:tcPr>
+          <w:p>
+            <w:r>
+              <w:rPr>
+                <w:rFonts w:ascii="Arial" w:cs="Arial" w:eastAsia="Arial" w:hAnsi="Arial"/>
+                <w:sz w:val="20"/>
+                <w:szCs w:val="20"/>
+              </w:rPr>
+              <w:t xml:space="preserve">Configure Microsoft Teams voice channels, Azure Communication Services for PSTN/telephony, and browser widget deployment for customer portal integration. Validate the Voice tab for channel parity and Voice Live API integration. Coordinate with existing global telephony infrastructure across fab sites and regional offices.</w:t>
+            </w:r>
+          </w:p>
+        </w:tc>
+      </w:tr>
+      <w:tr>
+        <w:tc>
+          <w:tcPr>
+            <w:tcW w:type="dxa" w:w="2200"/>
+            <w:tcBorders>
+              <w:top w:val="single" w:color="CCCCCC" w:sz="1"/>
+              <w:left w:val="single" w:color="CCCCCC" w:sz="1"/>
+              <w:bottom w:val="single" w:color="CCCCCC" w:sz="1"/>
+              <w:right w:val="single" w:color="CCCCCC" w:sz="1"/>
+            </w:tcBorders>
+            <w:tcMar>
+              <w:top w:type="dxa" w:w="80"/>
+              <w:left w:type="dxa" w:w="120"/>
+              <w:bottom w:type="dxa" w:w="80"/>
+              <w:right w:type="dxa" w:w="120"/>
+            </w:tcMar>
+          </w:tcPr>
+          <w:p>
+            <w:r>
+              <w:rPr>
+                <w:rFonts w:ascii="Arial" w:cs="Arial" w:eastAsia="Arial" w:hAnsi="Arial"/>
+                <w:b/>
+                <w:bCs/>
+                <w:sz w:val="20"/>
+                <w:szCs w:val="20"/>
+              </w:rPr>
+              <w:t xml:space="preserve">Knowledge Management / Technical Publications</w:t>
+            </w:r>
+          </w:p>
+        </w:tc>
+        <w:tc>
+          <w:tcPr>
+            <w:tcW w:type="dxa" w:w="1800"/>
+            <w:tcBorders>
+              <w:top w:val="single" w:color="CCCCCC" w:sz="1"/>
+              <w:left w:val="single" w:color="CCCCCC" w:sz="1"/>
+              <w:bottom w:val="single" w:color="CCCCCC" w:sz="1"/>
+              <w:right w:val="single" w:color="CCCCCC" w:sz="1"/>
+            </w:tcBorders>
+            <w:tcMar>
+              <w:top w:type="dxa" w:w="80"/>
+              <w:left w:type="dxa" w:w="120"/>
+              <w:bottom w:type="dxa" w:w="80"/>
+              <w:right w:type="dxa" w:w="120"/>
+            </w:tcMar>
+          </w:tcPr>
+          <w:p>
+            <w:r>
+              <w:rPr>
+                <w:rFonts w:ascii="Arial" w:cs="Arial" w:eastAsia="Arial" w:hAnsi="Arial"/>
+                <w:sz w:val="20"/>
+                <w:szCs w:val="20"/>
+              </w:rPr>
+              <w:t xml:space="preserve">Knowledge Manager, Technical Writers, Product Marketing</w:t>
+            </w:r>
+          </w:p>
+        </w:tc>
+        <w:tc>
+          <w:tcPr>
+            <w:tcW w:type="dxa" w:w="5360"/>
+            <w:tcBorders>
+              <w:top w:val="single" w:color="CCCCCC" w:sz="1"/>
+              <w:left w:val="single" w:color="CCCCCC" w:sz="1"/>
+              <w:bottom w:val="single" w:color="CCCCCC" w:sz="1"/>
+              <w:right w:val="single" w:color="CCCCCC" w:sz="1"/>
+            </w:tcBorders>
+            <w:tcMar>
+              <w:top w:type="dxa" w:w="80"/>
+              <w:left w:type="dxa" w:w="120"/>
+              <w:bottom w:type="dxa" w:w="80"/>
+              <w:right w:type="dxa" w:w="120"/>
+            </w:tcMar>
+          </w:tcPr>
+          <w:p>
+            <w:r>
+              <w:rPr>
+                <w:rFonts w:ascii="Arial" w:cs="Arial" w:eastAsia="Arial" w:hAnsi="Arial"/>
+                <w:sz w:val="20"/>
+                <w:szCs w:val="20"/>
+              </w:rPr>
+              <w:t xml:space="preserve">Curate and index knowledge base content: product datasheets, technical notes, reliability qualification reports, application notes, JEDEC compliance documentation, firmware release notes, and design guides. Define content classification (public, customer NDA, internal only) for RAG access control. Manage update workflows as new product revisions and errata are published.</w:t>
+            </w:r>
+          </w:p>
+        </w:tc>
+      </w:tr>
+      <w:tr>
+        <w:tc>
+          <w:tcPr>
+            <w:tcW w:type="dxa" w:w="2200"/>
+            <w:tcBorders>
+              <w:top w:val="single" w:color="CCCCCC" w:sz="1"/>
+              <w:left w:val="single" w:color="CCCCCC" w:sz="1"/>
+              <w:bottom w:val="single" w:color="CCCCCC" w:sz="1"/>
+              <w:right w:val="single" w:color="CCCCCC" w:sz="1"/>
+            </w:tcBorders>
+            <w:tcMar>
+              <w:top w:type="dxa" w:w="80"/>
+              <w:left w:type="dxa" w:w="120"/>
+              <w:bottom w:type="dxa" w:w="80"/>
+              <w:right w:type="dxa" w:w="120"/>
+            </w:tcMar>
+          </w:tcPr>
+          <w:p>
+            <w:r>
+              <w:rPr>
+                <w:rFonts w:ascii="Arial" w:cs="Arial" w:eastAsia="Arial" w:hAnsi="Arial"/>
+                <w:b/>
+                <w:bCs/>
+                <w:sz w:val="20"/>
+                <w:szCs w:val="20"/>
+              </w:rPr>
+              <w:t xml:space="preserve">Product / Digital Experience</w:t>
+            </w:r>
+          </w:p>
+        </w:tc>
+        <w:tc>
+          <w:tcPr>
+            <w:tcW w:type="dxa" w:w="1800"/>
+            <w:tcBorders>
+              <w:top w:val="single" w:color="CCCCCC" w:sz="1"/>
+              <w:left w:val="single" w:color="CCCCCC" w:sz="1"/>
+              <w:bottom w:val="single" w:color="CCCCCC" w:sz="1"/>
+              <w:right w:val="single" w:color="CCCCCC" w:sz="1"/>
+            </w:tcBorders>
+            <w:tcMar>
+              <w:top w:type="dxa" w:w="80"/>
+              <w:left w:type="dxa" w:w="120"/>
+              <w:bottom w:type="dxa" w:w="80"/>
+              <w:right w:type="dxa" w:w="120"/>
+            </w:tcMar>
+          </w:tcPr>
+          <w:p>
+            <w:r>
+              <w:rPr>
+                <w:rFonts w:ascii="Arial" w:cs="Arial" w:eastAsia="Arial" w:hAnsi="Arial"/>
+                <w:sz w:val="20"/>
+                <w:szCs w:val="20"/>
+              </w:rPr>
+              <w:t xml:space="preserve">Product Owner, UX Designer, Digital Channel Lead</w:t>
+            </w:r>
+          </w:p>
+        </w:tc>
+        <w:tc>
+          <w:tcPr>
+            <w:tcW w:type="dxa" w:w="5360"/>
+            <w:tcBorders>
+              <w:top w:val="single" w:color="CCCCCC" w:sz="1"/>
+              <w:left w:val="single" w:color="CCCCCC" w:sz="1"/>
+              <w:bottom w:val="single" w:color="CCCCCC" w:sz="1"/>
+              <w:right w:val="single" w:color="CCCCCC" w:sz="1"/>
+            </w:tcBorders>
+            <w:tcMar>
+              <w:top w:type="dxa" w:w="80"/>
+              <w:left w:type="dxa" w:w="120"/>
+              <w:bottom w:type="dxa" w:w="80"/>
+              <w:right w:type="dxa" w:w="120"/>
+            </w:tcMar>
+          </w:tcPr>
+          <w:p>
+            <w:r>
+              <w:rPr>
+                <w:rFonts w:ascii="Arial" w:cs="Arial" w:eastAsia="Arial" w:hAnsi="Arial"/>
+                <w:sz w:val="20"/>
+                <w:szCs w:val="20"/>
+              </w:rPr>
+              <w:t xml:space="preserve">Define user experience requirements and branding guidelines for customer-facing and internal portals. Own the end-user journey across chat, voice, and self-service channels. Design conversation flows for product selection, cross-reference lookup, and parametric search. Validate branded UX, suggested questions, and response formatting.</w:t>
+            </w:r>
+          </w:p>
+        </w:tc>
+      </w:tr>
+      <w:tr>
+        <w:tc>
+          <w:tcPr>
+            <w:tcW w:type="dxa" w:w="2200"/>
+            <w:tcBorders>
+              <w:top w:val="single" w:color="CCCCCC" w:sz="1"/>
+              <w:left w:val="single" w:color="CCCCCC" w:sz="1"/>
+              <w:bottom w:val="single" w:color="CCCCCC" w:sz="1"/>
+              <w:right w:val="single" w:color="CCCCCC" w:sz="1"/>
+            </w:tcBorders>
+            <w:tcMar>
+              <w:top w:type="dxa" w:w="80"/>
+              <w:left w:type="dxa" w:w="120"/>
+              <w:bottom w:type="dxa" w:w="80"/>
+              <w:right w:type="dxa" w:w="120"/>
+            </w:tcMar>
+          </w:tcPr>
+          <w:p>
+            <w:r>
+              <w:rPr>
+                <w:rFonts w:ascii="Arial" w:cs="Arial" w:eastAsia="Arial" w:hAnsi="Arial"/>
+                <w:b/>
+                <w:bCs/>
+                <w:sz w:val="20"/>
+                <w:szCs w:val="20"/>
+              </w:rPr>
+              <w:t xml:space="preserve">Legal / Privacy / Trade Compliance</w:t>
+            </w:r>
+          </w:p>
+        </w:tc>
+        <w:tc>
+          <w:tcPr>
+            <w:tcW w:type="dxa" w:w="1800"/>
+            <w:tcBorders>
+              <w:top w:val="single" w:color="CCCCCC" w:sz="1"/>
+              <w:left w:val="single" w:color="CCCCCC" w:sz="1"/>
+              <w:bottom w:val="single" w:color="CCCCCC" w:sz="1"/>
+              <w:right w:val="single" w:color="CCCCCC" w:sz="1"/>
+            </w:tcBorders>
+            <w:tcMar>
+              <w:top w:type="dxa" w:w="80"/>
+              <w:left w:type="dxa" w:w="120"/>
+              <w:bottom w:type="dxa" w:w="80"/>
+              <w:right w:type="dxa" w:w="120"/>
+            </w:tcMar>
+          </w:tcPr>
+          <w:p>
+            <w:r>
+              <w:rPr>
+                <w:rFonts w:ascii="Arial" w:cs="Arial" w:eastAsia="Arial" w:hAnsi="Arial"/>
+                <w:sz w:val="20"/>
+                <w:szCs w:val="20"/>
+              </w:rPr>
+              <w:t xml:space="preserve">General Counsel, Privacy Officer, Trade Compliance Director</w:t>
+            </w:r>
+          </w:p>
+        </w:tc>
+        <w:tc>
+          <w:tcPr>
+            <w:tcW w:type="dxa" w:w="5360"/>
+            <w:tcBorders>
+              <w:top w:val="single" w:color="CCCCCC" w:sz="1"/>
+              <w:left w:val="single" w:color="CCCCCC" w:sz="1"/>
+              <w:bottom w:val="single" w:color="CCCCCC" w:sz="1"/>
+              <w:right w:val="single" w:color="CCCCCC" w:sz="1"/>
+            </w:tcBorders>
+            <w:tcMar>
+              <w:top w:type="dxa" w:w="80"/>
+              <w:left w:type="dxa" w:w="120"/>
+              <w:bottom w:type="dxa" w:w="80"/>
+              <w:right w:type="dxa" w:w="120"/>
+            </w:tcMar>
+          </w:tcPr>
+          <w:p>
+            <w:r>
+              <w:rPr>
+                <w:rFonts w:ascii="Arial" w:cs="Arial" w:eastAsia="Arial" w:hAnsi="Arial"/>
+                <w:sz w:val="20"/>
+                <w:szCs w:val="20"/>
+              </w:rPr>
+              <w:t xml:space="preserve">Review AI disclosure requirements, data retention policies, and conversation recording consent. Semiconductor-specific: export control screening for customer interactions, trade secret protection in AI responses, CHIPS Act reporting obligations, NDA enforcement for restricted product data, and anti-circumvention compliance. Approve terms of use for AI-assisted interactions.</w:t>
+            </w:r>
+          </w:p>
+        </w:tc>
+      </w:tr>
+      <w:tr>
+        <w:tc>
+          <w:tcPr>
+            <w:tcW w:type="dxa" w:w="2200"/>
+            <w:tcBorders>
+              <w:top w:val="single" w:color="CCCCCC" w:sz="1"/>
+              <w:left w:val="single" w:color="CCCCCC" w:sz="1"/>
+              <w:bottom w:val="single" w:color="CCCCCC" w:sz="1"/>
+              <w:right w:val="single" w:color="CCCCCC" w:sz="1"/>
+            </w:tcBorders>
+            <w:tcMar>
+              <w:top w:type="dxa" w:w="80"/>
+              <w:left w:type="dxa" w:w="120"/>
+              <w:bottom w:type="dxa" w:w="80"/>
+              <w:right w:type="dxa" w:w="120"/>
+            </w:tcMar>
+          </w:tcPr>
+          <w:p>
+            <w:r>
+              <w:rPr>
+                <w:rFonts w:ascii="Arial" w:cs="Arial" w:eastAsia="Arial" w:hAnsi="Arial"/>
+                <w:b/>
+                <w:bCs/>
+                <w:sz w:val="20"/>
+                <w:szCs w:val="20"/>
+              </w:rPr>
+              <w:t xml:space="preserve">Change Management / Training</w:t>
+            </w:r>
+          </w:p>
+        </w:tc>
+        <w:tc>
+          <w:tcPr>
+            <w:tcW w:type="dxa" w:w="1800"/>
+            <w:tcBorders>
+              <w:top w:val="single" w:color="CCCCCC" w:sz="1"/>
+              <w:left w:val="single" w:color="CCCCCC" w:sz="1"/>
+              <w:bottom w:val="single" w:color="CCCCCC" w:sz="1"/>
+              <w:right w:val="single" w:color="CCCCCC" w:sz="1"/>
+            </w:tcBorders>
+            <w:tcMar>
+              <w:top w:type="dxa" w:w="80"/>
+              <w:left w:type="dxa" w:w="120"/>
+              <w:bottom w:type="dxa" w:w="80"/>
+              <w:right w:type="dxa" w:w="120"/>
+            </w:tcMar>
+          </w:tcPr>
+          <w:p>
+            <w:r>
+              <w:rPr>
+                <w:rFonts w:ascii="Arial" w:cs="Arial" w:eastAsia="Arial" w:hAnsi="Arial"/>
+                <w:sz w:val="20"/>
+                <w:szCs w:val="20"/>
+              </w:rPr>
+              <w:t xml:space="preserve">Change Manager, Training Lead, Internal Comms</w:t>
+            </w:r>
+          </w:p>
+        </w:tc>
+        <w:tc>
+          <w:tcPr>
+            <w:tcW w:type="dxa" w:w="5360"/>
+            <w:tcBorders>
+              <w:top w:val="single" w:color="CCCCCC" w:sz="1"/>
+              <w:left w:val="single" w:color="CCCCCC" w:sz="1"/>
+              <w:bottom w:val="single" w:color="CCCCCC" w:sz="1"/>
+              <w:right w:val="single" w:color="CCCCCC" w:sz="1"/>
+            </w:tcBorders>
+            <w:tcMar>
+              <w:top w:type="dxa" w:w="80"/>
+              <w:left w:type="dxa" w:w="120"/>
+              <w:bottom w:type="dxa" w:w="80"/>
+              <w:right w:type="dxa" w:w="120"/>
+            </w:tcMar>
+          </w:tcPr>
+          <w:p>
+            <w:r>
+              <w:rPr>
+                <w:rFonts w:ascii="Arial" w:cs="Arial" w:eastAsia="Arial" w:hAnsi="Arial"/>
+                <w:sz w:val="20"/>
+                <w:szCs w:val="20"/>
+              </w:rPr>
+              <w:t xml:space="preserve">Plan organizational readiness across global sites (fabs, design centers, regional offices). Develop training materials for TSE agents, FAEs, and end users. Manage communication campaigns and track adoption metrics. Coordinate pilot group selection — recommended starting with one product line (e.g., DRAM or SSD) before expanding.</w:t>
+            </w:r>
+          </w:p>
+        </w:tc>
+      </w:tr>
+      <w:tr>
+        <w:tc>
+          <w:tcPr>
+            <w:tcW w:type="dxa" w:w="2200"/>
+            <w:tcBorders>
+              <w:top w:val="single" w:color="CCCCCC" w:sz="1"/>
+              <w:left w:val="single" w:color="CCCCCC" w:sz="1"/>
+              <w:bottom w:val="single" w:color="CCCCCC" w:sz="1"/>
+              <w:right w:val="single" w:color="CCCCCC" w:sz="1"/>
+            </w:tcBorders>
+            <w:tcMar>
+              <w:top w:type="dxa" w:w="80"/>
+              <w:left w:type="dxa" w:w="120"/>
+              <w:bottom w:type="dxa" w:w="80"/>
+              <w:right w:type="dxa" w:w="120"/>
+            </w:tcMar>
+          </w:tcPr>
+          <w:p>
+            <w:r>
+              <w:rPr>
+                <w:rFonts w:ascii="Arial" w:cs="Arial" w:eastAsia="Arial" w:hAnsi="Arial"/>
+                <w:b/>
+                <w:bCs/>
+                <w:sz w:val="20"/>
+                <w:szCs w:val="20"/>
+              </w:rPr>
+              <w:t xml:space="preserve">Quality &amp; Reliability Engineering</w:t>
+            </w:r>
+          </w:p>
+        </w:tc>
+        <w:tc>
+          <w:tcPr>
+            <w:tcW w:type="dxa" w:w="1800"/>
+            <w:tcBorders>
+              <w:top w:val="single" w:color="CCCCCC" w:sz="1"/>
+              <w:left w:val="single" w:color="CCCCCC" w:sz="1"/>
+              <w:bottom w:val="single" w:color="CCCCCC" w:sz="1"/>
+              <w:right w:val="single" w:color="CCCCCC" w:sz="1"/>
+            </w:tcBorders>
+            <w:tcMar>
+              <w:top w:type="dxa" w:w="80"/>
+              <w:left w:type="dxa" w:w="120"/>
+              <w:bottom w:type="dxa" w:w="80"/>
+              <w:right w:type="dxa" w:w="120"/>
+            </w:tcMar>
+          </w:tcPr>
+          <w:p>
+            <w:r>
+              <w:rPr>
+                <w:rFonts w:ascii="Arial" w:cs="Arial" w:eastAsia="Arial" w:hAnsi="Arial"/>
+                <w:sz w:val="20"/>
+                <w:szCs w:val="20"/>
+              </w:rPr>
+              <w:t xml:space="preserve">QA Director, Reliability Engineers, Test Engineers</w:t>
+            </w:r>
+          </w:p>
+        </w:tc>
+        <w:tc>
+          <w:tcPr>
+            <w:tcW w:type="dxa" w:w="5360"/>
+            <w:tcBorders>
+              <w:top w:val="single" w:color="CCCCCC" w:sz="1"/>
+              <w:left w:val="single" w:color="CCCCCC" w:sz="1"/>
+              <w:bottom w:val="single" w:color="CCCCCC" w:sz="1"/>
+              <w:right w:val="single" w:color="CCCCCC" w:sz="1"/>
+            </w:tcBorders>
+            <w:tcMar>
+              <w:top w:type="dxa" w:w="80"/>
+              <w:left w:type="dxa" w:w="120"/>
+              <w:bottom w:type="dxa" w:w="80"/>
+              <w:right w:type="dxa" w:w="120"/>
+            </w:tcMar>
+          </w:tcPr>
+          <w:p>
+            <w:r>
+              <w:rPr>
+                <w:rFonts w:ascii="Arial" w:cs="Arial" w:eastAsia="Arial" w:hAnsi="Arial"/>
+                <w:sz w:val="20"/>
+                <w:szCs w:val="20"/>
+              </w:rPr>
+              <w:t xml:space="preserve">Define test strategies for conversational AI accuracy against product specifications (ISO 9001, IATF 16949 automotive, AEC-Q100 qualification standards). Validate that AI responses citing reliability data, qualification reports, and failure analysis procedures meet engineering accuracy standards. Perform load testing for concurrent voice and chat sessions across global time zones.</w:t>
+            </w:r>
+          </w:p>
+        </w:tc>
+      </w:tr>
+    </w:tbl>
+    <w:p>
+      <w:pPr>
+        <w:spacing w:before="300"/>
+      </w:pPr>
+    </w:p>
+    <w:p>
+      <w:pPr>
+        <w:pStyle w:val="Heading2"/>
+      </w:pPr>
+      <w:r>
+        <w:t xml:space="preserve">2.1 RACI Summary</w:t>
+      </w:r>
+    </w:p>
+    <w:p>
+      <w:pPr>
+        <w:spacing w:after="200"/>
+      </w:pPr>
+      <w:r>
+        <w:rPr>
+          <w:rFonts w:ascii="Arial" w:cs="Arial" w:eastAsia="Arial" w:hAnsi="Arial"/>
+          <w:sz w:val="22"/>
+          <w:szCs w:val="22"/>
+        </w:rPr>
+        <w:t xml:space="preserve">The following matrix outlines key decision rights across the project lifecycle:</w:t>
+      </w:r>
+    </w:p>
+    <w:tbl>
+      <w:tblPr>
+        <w:tblW w:type="dxa" w:w="9360"/>
+        <w:tblBorders>
+          <w:top w:val="single" w:color="auto" w:sz="4"/>
+          <w:left w:val="single" w:color="auto" w:sz="4"/>
+          <w:bottom w:val="single" w:color="auto" w:sz="4"/>
+          <w:right w:val="single" w:color="auto" w:sz="4"/>
+          <w:insideH w:val="single" w:color="auto" w:sz="4"/>
+          <w:insideV w:val="single" w:color="auto" w:sz="4"/>
+        </w:tblBorders>
+      </w:tblPr>
+      <w:tblGrid>
+        <w:gridCol w:w="2800"/>
+        <w:gridCol w:w="1640"/>
+        <w:gridCol w:w="1640"/>
+        <w:gridCol w:w="1640"/>
+        <w:gridCol w:w="1640"/>
+      </w:tblGrid>
+      <w:tr>
+        <w:tc>
+          <w:tcPr>
+            <w:tcW w:type="dxa" w:w="2800"/>
+            <w:tcBorders>
+              <w:top w:val="single" w:color="CCCCCC" w:sz="1"/>
+              <w:left w:val="single" w:color="CCCCCC" w:sz="1"/>
+              <w:bottom w:val="single" w:color="CCCCCC" w:sz="1"/>
+              <w:right w:val="single" w:color="CCCCCC" w:sz="1"/>
+            </w:tcBorders>
+            <w:shd w:fill="86BC25" w:val="clear"/>
+            <w:tcMar>
+              <w:top w:type="dxa" w:w="80"/>
+              <w:left w:type="dxa" w:w="120"/>
+              <w:bottom w:type="dxa" w:w="80"/>
+              <w:right w:type="dxa" w:w="120"/>
+            </w:tcMar>
+          </w:tcPr>
+          <w:p>
+            <w:r>
+              <w:rPr>
+                <w:rFonts w:ascii="Arial" w:cs="Arial" w:eastAsia="Arial" w:hAnsi="Arial"/>
+                <w:b/>
+                <w:bCs/>
+                <w:color w:val="FFFFFF"/>
+                <w:sz w:val="20"/>
+                <w:szCs w:val="20"/>
+              </w:rPr>
+              <w:t xml:space="preserve">Decision Area</w:t>
+            </w:r>
+          </w:p>
+        </w:tc>
+        <w:tc>
+          <w:tcPr>
+            <w:tcW w:type="dxa" w:w="1640"/>
+            <w:tcBorders>
+              <w:top w:val="single" w:color="CCCCCC" w:sz="1"/>
+              <w:left w:val="single" w:color="CCCCCC" w:sz="1"/>
+              <w:bottom w:val="single" w:color="CCCCCC" w:sz="1"/>
+              <w:right w:val="single" w:color="CCCCCC" w:sz="1"/>
+            </w:tcBorders>
+            <w:shd w:fill="86BC25" w:val="clear"/>
+            <w:tcMar>
+              <w:top w:type="dxa" w:w="80"/>
+              <w:left w:type="dxa" w:w="120"/>
+              <w:bottom w:type="dxa" w:w="80"/>
+              <w:right w:type="dxa" w:w="120"/>
+            </w:tcMar>
+          </w:tcPr>
+          <w:p>
+            <w:r>
+              <w:rPr>
+                <w:rFonts w:ascii="Arial" w:cs="Arial" w:eastAsia="Arial" w:hAnsi="Arial"/>
+                <w:b/>
+                <w:bCs/>
+                <w:color w:val="FFFFFF"/>
+                <w:sz w:val="20"/>
+                <w:szCs w:val="20"/>
+              </w:rPr>
+              <w:t xml:space="preserve">Responsible</w:t>
+            </w:r>
+          </w:p>
+        </w:tc>
+        <w:tc>
+          <w:tcPr>
+            <w:tcW w:type="dxa" w:w="1640"/>
+            <w:tcBorders>
+              <w:top w:val="single" w:color="CCCCCC" w:sz="1"/>
+              <w:left w:val="single" w:color="CCCCCC" w:sz="1"/>
+              <w:bottom w:val="single" w:color="CCCCCC" w:sz="1"/>
+              <w:right w:val="single" w:color="CCCCCC" w:sz="1"/>
+            </w:tcBorders>
+            <w:shd w:fill="86BC25" w:val="clear"/>
+            <w:tcMar>
+              <w:top w:type="dxa" w:w="80"/>
+              <w:left w:type="dxa" w:w="120"/>
+              <w:bottom w:type="dxa" w:w="80"/>
+              <w:right w:type="dxa" w:w="120"/>
+            </w:tcMar>
+          </w:tcPr>
+          <w:p>
+            <w:r>
+              <w:rPr>
+                <w:rFonts w:ascii="Arial" w:cs="Arial" w:eastAsia="Arial" w:hAnsi="Arial"/>
+                <w:b/>
+                <w:bCs/>
+                <w:color w:val="FFFFFF"/>
+                <w:sz w:val="20"/>
+                <w:szCs w:val="20"/>
+              </w:rPr>
+              <w:t xml:space="preserve">Accountable</w:t>
+            </w:r>
+          </w:p>
+        </w:tc>
+        <w:tc>
+          <w:tcPr>
+            <w:tcW w:type="dxa" w:w="1640"/>
+            <w:tcBorders>
+              <w:top w:val="single" w:color="CCCCCC" w:sz="1"/>
+              <w:left w:val="single" w:color="CCCCCC" w:sz="1"/>
+              <w:bottom w:val="single" w:color="CCCCCC" w:sz="1"/>
+              <w:right w:val="single" w:color="CCCCCC" w:sz="1"/>
+            </w:tcBorders>
+            <w:shd w:fill="86BC25" w:val="clear"/>
+            <w:tcMar>
+              <w:top w:type="dxa" w:w="80"/>
+              <w:left w:type="dxa" w:w="120"/>
+              <w:bottom w:type="dxa" w:w="80"/>
+              <w:right w:type="dxa" w:w="120"/>
+            </w:tcMar>
+          </w:tcPr>
+          <w:p>
+            <w:r>
+              <w:rPr>
+                <w:rFonts w:ascii="Arial" w:cs="Arial" w:eastAsia="Arial" w:hAnsi="Arial"/>
+                <w:b/>
+                <w:bCs/>
+                <w:color w:val="FFFFFF"/>
+                <w:sz w:val="20"/>
+                <w:szCs w:val="20"/>
+              </w:rPr>
+              <w:t xml:space="preserve">Consulted</w:t>
+            </w:r>
+          </w:p>
+        </w:tc>
+        <w:tc>
+          <w:tcPr>
+            <w:tcW w:type="dxa" w:w="1640"/>
+            <w:tcBorders>
+              <w:top w:val="single" w:color="CCCCCC" w:sz="1"/>
+              <w:left w:val="single" w:color="CCCCCC" w:sz="1"/>
+              <w:bottom w:val="single" w:color="CCCCCC" w:sz="1"/>
+              <w:right w:val="single" w:color="CCCCCC" w:sz="1"/>
+            </w:tcBorders>
+            <w:shd w:fill="86BC25" w:val="clear"/>
+            <w:tcMar>
+              <w:top w:type="dxa" w:w="80"/>
+              <w:left w:type="dxa" w:w="120"/>
+              <w:bottom w:type="dxa" w:w="80"/>
+              <w:right w:type="dxa" w:w="120"/>
+            </w:tcMar>
+          </w:tcPr>
+          <w:p>
+            <w:r>
+              <w:rPr>
+                <w:rFonts w:ascii="Arial" w:cs="Arial" w:eastAsia="Arial" w:hAnsi="Arial"/>
+                <w:b/>
+                <w:bCs/>
+                <w:color w:val="FFFFFF"/>
+                <w:sz w:val="20"/>
+                <w:szCs w:val="20"/>
+              </w:rPr>
+              <w:t xml:space="preserve">Informed</w:t>
+            </w:r>
+          </w:p>
+        </w:tc>
+      </w:tr>
+      <w:tr>
+        <w:tc>
+          <w:tcPr>
+            <w:tcW w:type="dxa" w:w="2800"/>
+            <w:tcBorders>
+              <w:top w:val="single" w:color="CCCCCC" w:sz="1"/>
+              <w:left w:val="single" w:color="CCCCCC" w:sz="1"/>
+              <w:bottom w:val="single" w:color="CCCCCC" w:sz="1"/>
+              <w:right w:val="single" w:color="CCCCCC" w:sz="1"/>
+            </w:tcBorders>
+            <w:tcMar>
+              <w:top w:type="dxa" w:w="80"/>
+              <w:left w:type="dxa" w:w="120"/>
+              <w:bottom w:type="dxa" w:w="80"/>
+              <w:right w:type="dxa" w:w="120"/>
+            </w:tcMar>
+          </w:tcPr>
+          <w:p>
+            <w:r>
+              <w:rPr>
+                <w:rFonts w:ascii="Arial" w:cs="Arial" w:eastAsia="Arial" w:hAnsi="Arial"/>
+                <w:sz w:val="20"/>
+                <w:szCs w:val="20"/>
+              </w:rPr>
+              <w:t xml:space="preserve">Architecture &amp; technology selection</w:t>
+            </w:r>
+          </w:p>
+        </w:tc>
+        <w:tc>
+          <w:tcPr>
+            <w:tcW w:type="dxa" w:w="1640"/>
+            <w:tcBorders>
+              <w:top w:val="single" w:color="CCCCCC" w:sz="1"/>
+              <w:left w:val="single" w:color="CCCCCC" w:sz="1"/>
+              <w:bottom w:val="single" w:color="CCCCCC" w:sz="1"/>
+              <w:right w:val="single" w:color="CCCCCC" w:sz="1"/>
+            </w:tcBorders>
+            <w:tcMar>
+              <w:top w:type="dxa" w:w="80"/>
+              <w:left w:type="dxa" w:w="120"/>
+              <w:bottom w:type="dxa" w:w="80"/>
+              <w:right w:type="dxa" w:w="120"/>
+            </w:tcMar>
+          </w:tcPr>
+          <w:p>
+            <w:r>
+              <w:rPr>
+                <w:rFonts w:ascii="Arial" w:cs="Arial" w:eastAsia="Arial" w:hAnsi="Arial"/>
+                <w:sz w:val="20"/>
+                <w:szCs w:val="20"/>
+              </w:rPr>
+              <w:t xml:space="preserve">IT / Cloud</w:t>
+            </w:r>
+          </w:p>
+        </w:tc>
+        <w:tc>
+          <w:tcPr>
+            <w:tcW w:type="dxa" w:w="1640"/>
+            <w:tcBorders>
+              <w:top w:val="single" w:color="CCCCCC" w:sz="1"/>
+              <w:left w:val="single" w:color="CCCCCC" w:sz="1"/>
+              <w:bottom w:val="single" w:color="CCCCCC" w:sz="1"/>
+              <w:right w:val="single" w:color="CCCCCC" w:sz="1"/>
+            </w:tcBorders>
+            <w:tcMar>
+              <w:top w:type="dxa" w:w="80"/>
+              <w:left w:type="dxa" w:w="120"/>
+              <w:bottom w:type="dxa" w:w="80"/>
+              <w:right w:type="dxa" w:w="120"/>
+            </w:tcMar>
+          </w:tcPr>
+          <w:p>
+            <w:r>
+              <w:rPr>
+                <w:rFonts w:ascii="Arial" w:cs="Arial" w:eastAsia="Arial" w:hAnsi="Arial"/>
+                <w:sz w:val="20"/>
+                <w:szCs w:val="20"/>
+              </w:rPr>
+              <w:t xml:space="preserve">Executive Sponsor</w:t>
+            </w:r>
+          </w:p>
+        </w:tc>
+        <w:tc>
+          <w:tcPr>
+            <w:tcW w:type="dxa" w:w="1640"/>
+            <w:tcBorders>
+              <w:top w:val="single" w:color="CCCCCC" w:sz="1"/>
+              <w:left w:val="single" w:color="CCCCCC" w:sz="1"/>
+              <w:bottom w:val="single" w:color="CCCCCC" w:sz="1"/>
+              <w:right w:val="single" w:color="CCCCCC" w:sz="1"/>
+            </w:tcBorders>
+            <w:tcMar>
+              <w:top w:type="dxa" w:w="80"/>
+              <w:left w:type="dxa" w:w="120"/>
+              <w:bottom w:type="dxa" w:w="80"/>
+              <w:right w:type="dxa" w:w="120"/>
+            </w:tcMar>
+          </w:tcPr>
+          <w:p>
+            <w:r>
+              <w:rPr>
+                <w:rFonts w:ascii="Arial" w:cs="Arial" w:eastAsia="Arial" w:hAnsi="Arial"/>
+                <w:sz w:val="20"/>
+                <w:szCs w:val="20"/>
+              </w:rPr>
+              <w:t xml:space="preserve">Security, AI/ML</w:t>
+            </w:r>
+          </w:p>
+        </w:tc>
+        <w:tc>
+          <w:tcPr>
+            <w:tcW w:type="dxa" w:w="1640"/>
+            <w:tcBorders>
+              <w:top w:val="single" w:color="CCCCCC" w:sz="1"/>
+              <w:left w:val="single" w:color="CCCCCC" w:sz="1"/>
+              <w:bottom w:val="single" w:color="CCCCCC" w:sz="1"/>
+              <w:right w:val="single" w:color="CCCCCC" w:sz="1"/>
+            </w:tcBorders>
+            <w:tcMar>
+              <w:top w:type="dxa" w:w="80"/>
+              <w:left w:type="dxa" w:w="120"/>
+              <w:bottom w:type="dxa" w:w="80"/>
+              <w:right w:type="dxa" w:w="120"/>
+            </w:tcMar>
+          </w:tcPr>
+          <w:p>
+            <w:r>
+              <w:rPr>
+                <w:rFonts w:ascii="Arial" w:cs="Arial" w:eastAsia="Arial" w:hAnsi="Arial"/>
+                <w:sz w:val="20"/>
+                <w:szCs w:val="20"/>
+              </w:rPr>
+              <w:t xml:space="preserve">All</w:t>
+            </w:r>
+          </w:p>
+        </w:tc>
+      </w:tr>
+      <w:tr>
+        <w:tc>
+          <w:tcPr>
+            <w:tcW w:type="dxa" w:w="2800"/>
+            <w:tcBorders>
+              <w:top w:val="single" w:color="CCCCCC" w:sz="1"/>
+              <w:left w:val="single" w:color="CCCCCC" w:sz="1"/>
+              <w:bottom w:val="single" w:color="CCCCCC" w:sz="1"/>
+              <w:right w:val="single" w:color="CCCCCC" w:sz="1"/>
+            </w:tcBorders>
+            <w:tcMar>
+              <w:top w:type="dxa" w:w="80"/>
+              <w:left w:type="dxa" w:w="120"/>
+              <w:bottom w:type="dxa" w:w="80"/>
+              <w:right w:type="dxa" w:w="120"/>
+            </w:tcMar>
+          </w:tcPr>
+          <w:p>
+            <w:r>
+              <w:rPr>
+                <w:rFonts w:ascii="Arial" w:cs="Arial" w:eastAsia="Arial" w:hAnsi="Arial"/>
+                <w:sz w:val="20"/>
+                <w:szCs w:val="20"/>
+              </w:rPr>
+              <w:t xml:space="preserve">Knowledge base content &amp; classification</w:t>
+            </w:r>
+          </w:p>
+        </w:tc>
+        <w:tc>
+          <w:tcPr>
+            <w:tcW w:type="dxa" w:w="1640"/>
+            <w:tcBorders>
+              <w:top w:val="single" w:color="CCCCCC" w:sz="1"/>
+              <w:left w:val="single" w:color="CCCCCC" w:sz="1"/>
+              <w:bottom w:val="single" w:color="CCCCCC" w:sz="1"/>
+              <w:right w:val="single" w:color="CCCCCC" w:sz="1"/>
+            </w:tcBorders>
+            <w:tcMar>
+              <w:top w:type="dxa" w:w="80"/>
+              <w:left w:type="dxa" w:w="120"/>
+              <w:bottom w:type="dxa" w:w="80"/>
+              <w:right w:type="dxa" w:w="120"/>
+            </w:tcMar>
+          </w:tcPr>
+          <w:p>
+            <w:r>
+              <w:rPr>
+                <w:rFonts w:ascii="Arial" w:cs="Arial" w:eastAsia="Arial" w:hAnsi="Arial"/>
+                <w:sz w:val="20"/>
+                <w:szCs w:val="20"/>
+              </w:rPr>
+              <w:t xml:space="preserve">Knowledge Mgmt / Tech Pubs</w:t>
+            </w:r>
+          </w:p>
+        </w:tc>
+        <w:tc>
+          <w:tcPr>
+            <w:tcW w:type="dxa" w:w="1640"/>
+            <w:tcBorders>
+              <w:top w:val="single" w:color="CCCCCC" w:sz="1"/>
+              <w:left w:val="single" w:color="CCCCCC" w:sz="1"/>
+              <w:bottom w:val="single" w:color="CCCCCC" w:sz="1"/>
+              <w:right w:val="single" w:color="CCCCCC" w:sz="1"/>
+            </w:tcBorders>
+            <w:tcMar>
+              <w:top w:type="dxa" w:w="80"/>
+              <w:left w:type="dxa" w:w="120"/>
+              <w:bottom w:type="dxa" w:w="80"/>
+              <w:right w:type="dxa" w:w="120"/>
+            </w:tcMar>
+          </w:tcPr>
+          <w:p>
+            <w:r>
+              <w:rPr>
+                <w:rFonts w:ascii="Arial" w:cs="Arial" w:eastAsia="Arial" w:hAnsi="Arial"/>
+                <w:sz w:val="20"/>
+                <w:szCs w:val="20"/>
+              </w:rPr>
+              <w:t xml:space="preserve">Tech Support Eng</w:t>
+            </w:r>
+          </w:p>
+        </w:tc>
+        <w:tc>
+          <w:tcPr>
+            <w:tcW w:type="dxa" w:w="1640"/>
+            <w:tcBorders>
+              <w:top w:val="single" w:color="CCCCCC" w:sz="1"/>
+              <w:left w:val="single" w:color="CCCCCC" w:sz="1"/>
+              <w:bottom w:val="single" w:color="CCCCCC" w:sz="1"/>
+              <w:right w:val="single" w:color="CCCCCC" w:sz="1"/>
+            </w:tcBorders>
+            <w:tcMar>
+              <w:top w:type="dxa" w:w="80"/>
+              <w:left w:type="dxa" w:w="120"/>
+              <w:bottom w:type="dxa" w:w="80"/>
+              <w:right w:type="dxa" w:w="120"/>
+            </w:tcMar>
+          </w:tcPr>
+          <w:p>
+            <w:r>
+              <w:rPr>
+                <w:rFonts w:ascii="Arial" w:cs="Arial" w:eastAsia="Arial" w:hAnsi="Arial"/>
+                <w:sz w:val="20"/>
+                <w:szCs w:val="20"/>
+              </w:rPr>
+              <w:t xml:space="preserve">Apps Eng, Product</w:t>
+            </w:r>
+          </w:p>
+        </w:tc>
+        <w:tc>
+          <w:tcPr>
+            <w:tcW w:type="dxa" w:w="1640"/>
+            <w:tcBorders>
+              <w:top w:val="single" w:color="CCCCCC" w:sz="1"/>
+              <w:left w:val="single" w:color="CCCCCC" w:sz="1"/>
+              <w:bottom w:val="single" w:color="CCCCCC" w:sz="1"/>
+              <w:right w:val="single" w:color="CCCCCC" w:sz="1"/>
+            </w:tcBorders>
+            <w:tcMar>
+              <w:top w:type="dxa" w:w="80"/>
+              <w:left w:type="dxa" w:w="120"/>
+              <w:bottom w:type="dxa" w:w="80"/>
+              <w:right w:type="dxa" w:w="120"/>
+            </w:tcMar>
+          </w:tcPr>
+          <w:p>
+            <w:r>
+              <w:rPr>
+                <w:rFonts w:ascii="Arial" w:cs="Arial" w:eastAsia="Arial" w:hAnsi="Arial"/>
+                <w:sz w:val="20"/>
+                <w:szCs w:val="20"/>
+              </w:rPr>
+              <w:t xml:space="preserve">Legal, QA</w:t>
+            </w:r>
+          </w:p>
+        </w:tc>
+      </w:tr>
+      <w:tr>
+        <w:tc>
+          <w:tcPr>
+            <w:tcW w:type="dxa" w:w="2800"/>
+            <w:tcBorders>
+              <w:top w:val="single" w:color="CCCCCC" w:sz="1"/>
+              <w:left w:val="single" w:color="CCCCCC" w:sz="1"/>
+              <w:bottom w:val="single" w:color="CCCCCC" w:sz="1"/>
+              <w:right w:val="single" w:color="CCCCCC" w:sz="1"/>
+            </w:tcBorders>
+            <w:tcMar>
+              <w:top w:type="dxa" w:w="80"/>
+              <w:left w:type="dxa" w:w="120"/>
+              <w:bottom w:type="dxa" w:w="80"/>
+              <w:right w:type="dxa" w:w="120"/>
+            </w:tcMar>
+          </w:tcPr>
+          <w:p>
+            <w:r>
+              <w:rPr>
+                <w:rFonts w:ascii="Arial" w:cs="Arial" w:eastAsia="Arial" w:hAnsi="Arial"/>
+                <w:sz w:val="20"/>
+                <w:szCs w:val="20"/>
+              </w:rPr>
+              <w:t xml:space="preserve">Security, export controls &amp; IP protection</w:t>
+            </w:r>
+          </w:p>
+        </w:tc>
+        <w:tc>
+          <w:tcPr>
+            <w:tcW w:type="dxa" w:w="1640"/>
+            <w:tcBorders>
+              <w:top w:val="single" w:color="CCCCCC" w:sz="1"/>
+              <w:left w:val="single" w:color="CCCCCC" w:sz="1"/>
+              <w:bottom w:val="single" w:color="CCCCCC" w:sz="1"/>
+              <w:right w:val="single" w:color="CCCCCC" w:sz="1"/>
+            </w:tcBorders>
+            <w:tcMar>
+              <w:top w:type="dxa" w:w="80"/>
+              <w:left w:type="dxa" w:w="120"/>
+              <w:bottom w:type="dxa" w:w="80"/>
+              <w:right w:type="dxa" w:w="120"/>
+            </w:tcMar>
+          </w:tcPr>
+          <w:p>
+            <w:r>
+              <w:rPr>
+                <w:rFonts w:ascii="Arial" w:cs="Arial" w:eastAsia="Arial" w:hAnsi="Arial"/>
+                <w:sz w:val="20"/>
+                <w:szCs w:val="20"/>
+              </w:rPr>
+              <w:t xml:space="preserve">InfoSec / Export Control</w:t>
+            </w:r>
+          </w:p>
+        </w:tc>
+        <w:tc>
+          <w:tcPr>
+            <w:tcW w:type="dxa" w:w="1640"/>
+            <w:tcBorders>
+              <w:top w:val="single" w:color="CCCCCC" w:sz="1"/>
+              <w:left w:val="single" w:color="CCCCCC" w:sz="1"/>
+              <w:bottom w:val="single" w:color="CCCCCC" w:sz="1"/>
+              <w:right w:val="single" w:color="CCCCCC" w:sz="1"/>
+            </w:tcBorders>
+            <w:tcMar>
+              <w:top w:type="dxa" w:w="80"/>
+              <w:left w:type="dxa" w:w="120"/>
+              <w:bottom w:type="dxa" w:w="80"/>
+              <w:right w:type="dxa" w:w="120"/>
+            </w:tcMar>
+          </w:tcPr>
+          <w:p>
+            <w:r>
+              <w:rPr>
+                <w:rFonts w:ascii="Arial" w:cs="Arial" w:eastAsia="Arial" w:hAnsi="Arial"/>
+                <w:sz w:val="20"/>
+                <w:szCs w:val="20"/>
+              </w:rPr>
+              <w:t xml:space="preserve">CISO</w:t>
+            </w:r>
+          </w:p>
+        </w:tc>
+        <w:tc>
+          <w:tcPr>
+            <w:tcW w:type="dxa" w:w="1640"/>
+            <w:tcBorders>
+              <w:top w:val="single" w:color="CCCCCC" w:sz="1"/>
+              <w:left w:val="single" w:color="CCCCCC" w:sz="1"/>
+              <w:bottom w:val="single" w:color="CCCCCC" w:sz="1"/>
+              <w:right w:val="single" w:color="CCCCCC" w:sz="1"/>
+            </w:tcBorders>
+            <w:tcMar>
+              <w:top w:type="dxa" w:w="80"/>
+              <w:left w:type="dxa" w:w="120"/>
+              <w:bottom w:type="dxa" w:w="80"/>
+              <w:right w:type="dxa" w:w="120"/>
+            </w:tcMar>
+          </w:tcPr>
+          <w:p>
+            <w:r>
+              <w:rPr>
+                <w:rFonts w:ascii="Arial" w:cs="Arial" w:eastAsia="Arial" w:hAnsi="Arial"/>
+                <w:sz w:val="20"/>
+                <w:szCs w:val="20"/>
+              </w:rPr>
+              <w:t xml:space="preserve">Legal, IT</w:t>
+            </w:r>
+          </w:p>
+        </w:tc>
+        <w:tc>
+          <w:tcPr>
+            <w:tcW w:type="dxa" w:w="1640"/>
+            <w:tcBorders>
+              <w:top w:val="single" w:color="CCCCCC" w:sz="1"/>
+              <w:left w:val="single" w:color="CCCCCC" w:sz="1"/>
+              <w:bottom w:val="single" w:color="CCCCCC" w:sz="1"/>
+              <w:right w:val="single" w:color="CCCCCC" w:sz="1"/>
+            </w:tcBorders>
+            <w:tcMar>
+              <w:top w:type="dxa" w:w="80"/>
+              <w:left w:type="dxa" w:w="120"/>
+              <w:bottom w:type="dxa" w:w="80"/>
+              <w:right w:type="dxa" w:w="120"/>
+            </w:tcMar>
+          </w:tcPr>
+          <w:p>
+            <w:r>
+              <w:rPr>
+                <w:rFonts w:ascii="Arial" w:cs="Arial" w:eastAsia="Arial" w:hAnsi="Arial"/>
+                <w:sz w:val="20"/>
+                <w:szCs w:val="20"/>
+              </w:rPr>
+              <w:t xml:space="preserve">Executive Sponsor</w:t>
+            </w:r>
+          </w:p>
+        </w:tc>
+      </w:tr>
+      <w:tr>
+        <w:tc>
+          <w:tcPr>
+            <w:tcW w:type="dxa" w:w="2800"/>
+            <w:tcBorders>
+              <w:top w:val="single" w:color="CCCCCC" w:sz="1"/>
+              <w:left w:val="single" w:color="CCCCCC" w:sz="1"/>
+              <w:bottom w:val="single" w:color="CCCCCC" w:sz="1"/>
+              <w:right w:val="single" w:color="CCCCCC" w:sz="1"/>
+            </w:tcBorders>
+            <w:tcMar>
+              <w:top w:type="dxa" w:w="80"/>
+              <w:left w:type="dxa" w:w="120"/>
+              <w:bottom w:type="dxa" w:w="80"/>
+              <w:right w:type="dxa" w:w="120"/>
+            </w:tcMar>
+          </w:tcPr>
+          <w:p>
+            <w:r>
+              <w:rPr>
+                <w:rFonts w:ascii="Arial" w:cs="Arial" w:eastAsia="Arial" w:hAnsi="Arial"/>
+                <w:sz w:val="20"/>
+                <w:szCs w:val="20"/>
+              </w:rPr>
+              <w:t xml:space="preserve">AI model configuration &amp; tuning</w:t>
+            </w:r>
+          </w:p>
+        </w:tc>
+        <w:tc>
+          <w:tcPr>
+            <w:tcW w:type="dxa" w:w="1640"/>
+            <w:tcBorders>
+              <w:top w:val="single" w:color="CCCCCC" w:sz="1"/>
+              <w:left w:val="single" w:color="CCCCCC" w:sz="1"/>
+              <w:bottom w:val="single" w:color="CCCCCC" w:sz="1"/>
+              <w:right w:val="single" w:color="CCCCCC" w:sz="1"/>
+            </w:tcBorders>
+            <w:tcMar>
+              <w:top w:type="dxa" w:w="80"/>
+              <w:left w:type="dxa" w:w="120"/>
+              <w:bottom w:type="dxa" w:w="80"/>
+              <w:right w:type="dxa" w:w="120"/>
+            </w:tcMar>
+          </w:tcPr>
+          <w:p>
+            <w:r>
+              <w:rPr>
+                <w:rFonts w:ascii="Arial" w:cs="Arial" w:eastAsia="Arial" w:hAnsi="Arial"/>
+                <w:sz w:val="20"/>
+                <w:szCs w:val="20"/>
+              </w:rPr>
+              <w:t xml:space="preserve">AI/ML</w:t>
+            </w:r>
+          </w:p>
+        </w:tc>
+        <w:tc>
+          <w:tcPr>
+            <w:tcW w:type="dxa" w:w="1640"/>
+            <w:tcBorders>
+              <w:top w:val="single" w:color="CCCCCC" w:sz="1"/>
+              <w:left w:val="single" w:color="CCCCCC" w:sz="1"/>
+              <w:bottom w:val="single" w:color="CCCCCC" w:sz="1"/>
+              <w:right w:val="single" w:color="CCCCCC" w:sz="1"/>
+            </w:tcBorders>
+            <w:tcMar>
+              <w:top w:type="dxa" w:w="80"/>
+              <w:left w:type="dxa" w:w="120"/>
+              <w:bottom w:type="dxa" w:w="80"/>
+              <w:right w:type="dxa" w:w="120"/>
+            </w:tcMar>
+          </w:tcPr>
+          <w:p>
+            <w:r>
+              <w:rPr>
+                <w:rFonts w:ascii="Arial" w:cs="Arial" w:eastAsia="Arial" w:hAnsi="Arial"/>
+                <w:sz w:val="20"/>
+                <w:szCs w:val="20"/>
+              </w:rPr>
+              <w:t xml:space="preserve">IT / Cloud</w:t>
+            </w:r>
+          </w:p>
+        </w:tc>
+        <w:tc>
+          <w:tcPr>
+            <w:tcW w:type="dxa" w:w="1640"/>
+            <w:tcBorders>
+              <w:top w:val="single" w:color="CCCCCC" w:sz="1"/>
+              <w:left w:val="single" w:color="CCCCCC" w:sz="1"/>
+              <w:bottom w:val="single" w:color="CCCCCC" w:sz="1"/>
+              <w:right w:val="single" w:color="CCCCCC" w:sz="1"/>
+            </w:tcBorders>
+            <w:tcMar>
+              <w:top w:type="dxa" w:w="80"/>
+              <w:left w:type="dxa" w:w="120"/>
+              <w:bottom w:type="dxa" w:w="80"/>
+              <w:right w:type="dxa" w:w="120"/>
+            </w:tcMar>
+          </w:tcPr>
+          <w:p>
+            <w:r>
+              <w:rPr>
+                <w:rFonts w:ascii="Arial" w:cs="Arial" w:eastAsia="Arial" w:hAnsi="Arial"/>
+                <w:sz w:val="20"/>
+                <w:szCs w:val="20"/>
+              </w:rPr>
+              <w:t xml:space="preserve">Tech Support, Apps Eng</w:t>
+            </w:r>
+          </w:p>
+        </w:tc>
+        <w:tc>
+          <w:tcPr>
+            <w:tcW w:type="dxa" w:w="1640"/>
+            <w:tcBorders>
+              <w:top w:val="single" w:color="CCCCCC" w:sz="1"/>
+              <w:left w:val="single" w:color="CCCCCC" w:sz="1"/>
+              <w:bottom w:val="single" w:color="CCCCCC" w:sz="1"/>
+              <w:right w:val="single" w:color="CCCCCC" w:sz="1"/>
+            </w:tcBorders>
+            <w:tcMar>
+              <w:top w:type="dxa" w:w="80"/>
+              <w:left w:type="dxa" w:w="120"/>
+              <w:bottom w:type="dxa" w:w="80"/>
+              <w:right w:type="dxa" w:w="120"/>
+            </w:tcMar>
+          </w:tcPr>
+          <w:p>
+            <w:r>
+              <w:rPr>
+                <w:rFonts w:ascii="Arial" w:cs="Arial" w:eastAsia="Arial" w:hAnsi="Arial"/>
+                <w:sz w:val="20"/>
+                <w:szCs w:val="20"/>
+              </w:rPr>
+              <w:t xml:space="preserve">Product</w:t>
+            </w:r>
+          </w:p>
+        </w:tc>
+      </w:tr>
+      <w:tr>
+        <w:tc>
+          <w:tcPr>
+            <w:tcW w:type="dxa" w:w="2800"/>
+            <w:tcBorders>
+              <w:top w:val="single" w:color="CCCCCC" w:sz="1"/>
+              <w:left w:val="single" w:color="CCCCCC" w:sz="1"/>
+              <w:bottom w:val="single" w:color="CCCCCC" w:sz="1"/>
+              <w:right w:val="single" w:color="CCCCCC" w:sz="1"/>
+            </w:tcBorders>
+            <w:tcMar>
+              <w:top w:type="dxa" w:w="80"/>
+              <w:left w:type="dxa" w:w="120"/>
+              <w:bottom w:type="dxa" w:w="80"/>
+              <w:right w:type="dxa" w:w="120"/>
+            </w:tcMar>
+          </w:tcPr>
+          <w:p>
+            <w:r>
+              <w:rPr>
+                <w:rFonts w:ascii="Arial" w:cs="Arial" w:eastAsia="Arial" w:hAnsi="Arial"/>
+                <w:sz w:val="20"/>
+                <w:szCs w:val="20"/>
+              </w:rPr>
+              <w:t xml:space="preserve">User experience &amp; branding</w:t>
+            </w:r>
+          </w:p>
+        </w:tc>
+        <w:tc>
+          <w:tcPr>
+            <w:tcW w:type="dxa" w:w="1640"/>
+            <w:tcBorders>
+              <w:top w:val="single" w:color="CCCCCC" w:sz="1"/>
+              <w:left w:val="single" w:color="CCCCCC" w:sz="1"/>
+              <w:bottom w:val="single" w:color="CCCCCC" w:sz="1"/>
+              <w:right w:val="single" w:color="CCCCCC" w:sz="1"/>
+            </w:tcBorders>
+            <w:tcMar>
+              <w:top w:type="dxa" w:w="80"/>
+              <w:left w:type="dxa" w:w="120"/>
+              <w:bottom w:type="dxa" w:w="80"/>
+              <w:right w:type="dxa" w:w="120"/>
+            </w:tcMar>
+          </w:tcPr>
+          <w:p>
+            <w:r>
+              <w:rPr>
+                <w:rFonts w:ascii="Arial" w:cs="Arial" w:eastAsia="Arial" w:hAnsi="Arial"/>
+                <w:sz w:val="20"/>
+                <w:szCs w:val="20"/>
+              </w:rPr>
+              <w:t xml:space="preserve">Product / UX</w:t>
+            </w:r>
+          </w:p>
+        </w:tc>
+        <w:tc>
+          <w:tcPr>
+            <w:tcW w:type="dxa" w:w="1640"/>
+            <w:tcBorders>
+              <w:top w:val="single" w:color="CCCCCC" w:sz="1"/>
+              <w:left w:val="single" w:color="CCCCCC" w:sz="1"/>
+              <w:bottom w:val="single" w:color="CCCCCC" w:sz="1"/>
+              <w:right w:val="single" w:color="CCCCCC" w:sz="1"/>
+            </w:tcBorders>
+            <w:tcMar>
+              <w:top w:type="dxa" w:w="80"/>
+              <w:left w:type="dxa" w:w="120"/>
+              <w:bottom w:type="dxa" w:w="80"/>
+              <w:right w:type="dxa" w:w="120"/>
+            </w:tcMar>
+          </w:tcPr>
+          <w:p>
+            <w:r>
+              <w:rPr>
+                <w:rFonts w:ascii="Arial" w:cs="Arial" w:eastAsia="Arial" w:hAnsi="Arial"/>
+                <w:sz w:val="20"/>
+                <w:szCs w:val="20"/>
+              </w:rPr>
+              <w:t xml:space="preserve">Tech Support Eng</w:t>
+            </w:r>
+          </w:p>
+        </w:tc>
+        <w:tc>
+          <w:tcPr>
+            <w:tcW w:type="dxa" w:w="1640"/>
+            <w:tcBorders>
+              <w:top w:val="single" w:color="CCCCCC" w:sz="1"/>
+              <w:left w:val="single" w:color="CCCCCC" w:sz="1"/>
+              <w:bottom w:val="single" w:color="CCCCCC" w:sz="1"/>
+              <w:right w:val="single" w:color="CCCCCC" w:sz="1"/>
+            </w:tcBorders>
+            <w:tcMar>
+              <w:top w:type="dxa" w:w="80"/>
+              <w:left w:type="dxa" w:w="120"/>
+              <w:bottom w:type="dxa" w:w="80"/>
+              <w:right w:type="dxa" w:w="120"/>
+            </w:tcMar>
+          </w:tcPr>
+          <w:p>
+            <w:r>
+              <w:rPr>
+                <w:rFonts w:ascii="Arial" w:cs="Arial" w:eastAsia="Arial" w:hAnsi="Arial"/>
+                <w:sz w:val="20"/>
+                <w:szCs w:val="20"/>
+              </w:rPr>
+              <w:t xml:space="preserve">Change Mgmt</w:t>
+            </w:r>
+          </w:p>
+        </w:tc>
+        <w:tc>
+          <w:tcPr>
+            <w:tcW w:type="dxa" w:w="1640"/>
+            <w:tcBorders>
+              <w:top w:val="single" w:color="CCCCCC" w:sz="1"/>
+              <w:left w:val="single" w:color="CCCCCC" w:sz="1"/>
+              <w:bottom w:val="single" w:color="CCCCCC" w:sz="1"/>
+              <w:right w:val="single" w:color="CCCCCC" w:sz="1"/>
+            </w:tcBorders>
+            <w:tcMar>
+              <w:top w:type="dxa" w:w="80"/>
+              <w:left w:type="dxa" w:w="120"/>
+              <w:bottom w:type="dxa" w:w="80"/>
+              <w:right w:type="dxa" w:w="120"/>
+            </w:tcMar>
+          </w:tcPr>
+          <w:p>
+            <w:r>
+              <w:rPr>
+                <w:rFonts w:ascii="Arial" w:cs="Arial" w:eastAsia="Arial" w:hAnsi="Arial"/>
+                <w:sz w:val="20"/>
+                <w:szCs w:val="20"/>
+              </w:rPr>
+              <w:t xml:space="preserve">Legal</w:t>
+            </w:r>
+          </w:p>
+        </w:tc>
+      </w:tr>
+      <w:tr>
+        <w:tc>
+          <w:tcPr>
+            <w:tcW w:type="dxa" w:w="2800"/>
+            <w:tcBorders>
+              <w:top w:val="single" w:color="CCCCCC" w:sz="1"/>
+              <w:left w:val="single" w:color="CCCCCC" w:sz="1"/>
+              <w:bottom w:val="single" w:color="CCCCCC" w:sz="1"/>
+              <w:right w:val="single" w:color="CCCCCC" w:sz="1"/>
+            </w:tcBorders>
+            <w:tcMar>
+              <w:top w:type="dxa" w:w="80"/>
+              <w:left w:type="dxa" w:w="120"/>
+              <w:bottom w:type="dxa" w:w="80"/>
+              <w:right w:type="dxa" w:w="120"/>
+            </w:tcMar>
+          </w:tcPr>
+          <w:p>
+            <w:r>
+              <w:rPr>
+                <w:rFonts w:ascii="Arial" w:cs="Arial" w:eastAsia="Arial" w:hAnsi="Arial"/>
+                <w:sz w:val="20"/>
+                <w:szCs w:val="20"/>
+              </w:rPr>
+              <w:t xml:space="preserve">Go-live &amp; rollout (by product line)</w:t>
+            </w:r>
+          </w:p>
+        </w:tc>
+        <w:tc>
+          <w:tcPr>
+            <w:tcW w:type="dxa" w:w="1640"/>
+            <w:tcBorders>
+              <w:top w:val="single" w:color="CCCCCC" w:sz="1"/>
+              <w:left w:val="single" w:color="CCCCCC" w:sz="1"/>
+              <w:bottom w:val="single" w:color="CCCCCC" w:sz="1"/>
+              <w:right w:val="single" w:color="CCCCCC" w:sz="1"/>
+            </w:tcBorders>
+            <w:tcMar>
+              <w:top w:type="dxa" w:w="80"/>
+              <w:left w:type="dxa" w:w="120"/>
+              <w:bottom w:type="dxa" w:w="80"/>
+              <w:right w:type="dxa" w:w="120"/>
+            </w:tcMar>
+          </w:tcPr>
+          <w:p>
+            <w:r>
+              <w:rPr>
+                <w:rFonts w:ascii="Arial" w:cs="Arial" w:eastAsia="Arial" w:hAnsi="Arial"/>
+                <w:sz w:val="20"/>
+                <w:szCs w:val="20"/>
+              </w:rPr>
+              <w:t xml:space="preserve">Change Mgmt</w:t>
+            </w:r>
+          </w:p>
+        </w:tc>
+        <w:tc>
+          <w:tcPr>
+            <w:tcW w:type="dxa" w:w="1640"/>
+            <w:tcBorders>
+              <w:top w:val="single" w:color="CCCCCC" w:sz="1"/>
+              <w:left w:val="single" w:color="CCCCCC" w:sz="1"/>
+              <w:bottom w:val="single" w:color="CCCCCC" w:sz="1"/>
+              <w:right w:val="single" w:color="CCCCCC" w:sz="1"/>
+            </w:tcBorders>
+            <w:tcMar>
+              <w:top w:type="dxa" w:w="80"/>
+              <w:left w:type="dxa" w:w="120"/>
+              <w:bottom w:type="dxa" w:w="80"/>
+              <w:right w:type="dxa" w:w="120"/>
+            </w:tcMar>
+          </w:tcPr>
+          <w:p>
+            <w:r>
+              <w:rPr>
+                <w:rFonts w:ascii="Arial" w:cs="Arial" w:eastAsia="Arial" w:hAnsi="Arial"/>
+                <w:sz w:val="20"/>
+                <w:szCs w:val="20"/>
+              </w:rPr>
+              <w:t xml:space="preserve">Executive Sponsor</w:t>
+            </w:r>
+          </w:p>
+        </w:tc>
+        <w:tc>
+          <w:tcPr>
+            <w:tcW w:type="dxa" w:w="1640"/>
+            <w:tcBorders>
+              <w:top w:val="single" w:color="CCCCCC" w:sz="1"/>
+              <w:left w:val="single" w:color="CCCCCC" w:sz="1"/>
+              <w:bottom w:val="single" w:color="CCCCCC" w:sz="1"/>
+              <w:right w:val="single" w:color="CCCCCC" w:sz="1"/>
+            </w:tcBorders>
+            <w:tcMar>
+              <w:top w:type="dxa" w:w="80"/>
+              <w:left w:type="dxa" w:w="120"/>
+              <w:bottom w:type="dxa" w:w="80"/>
+              <w:right w:type="dxa" w:w="120"/>
+            </w:tcMar>
+          </w:tcPr>
+          <w:p>
+            <w:r>
+              <w:rPr>
+                <w:rFonts w:ascii="Arial" w:cs="Arial" w:eastAsia="Arial" w:hAnsi="Arial"/>
+                <w:sz w:val="20"/>
+                <w:szCs w:val="20"/>
+              </w:rPr>
+              <w:t xml:space="preserve">All functional areas</w:t>
+            </w:r>
+          </w:p>
+        </w:tc>
+        <w:tc>
+          <w:tcPr>
+            <w:tcW w:type="dxa" w:w="1640"/>
+            <w:tcBorders>
+              <w:top w:val="single" w:color="CCCCCC" w:sz="1"/>
+              <w:left w:val="single" w:color="CCCCCC" w:sz="1"/>
+              <w:bottom w:val="single" w:color="CCCCCC" w:sz="1"/>
+              <w:right w:val="single" w:color="CCCCCC" w:sz="1"/>
+            </w:tcBorders>
+            <w:tcMar>
+              <w:top w:type="dxa" w:w="80"/>
+              <w:left w:type="dxa" w:w="120"/>
+              <w:bottom w:type="dxa" w:w="80"/>
+              <w:right w:type="dxa" w:w="120"/>
+            </w:tcMar>
+          </w:tcPr>
+          <w:p>
+            <w:r>
+              <w:rPr>
+                <w:rFonts w:ascii="Arial" w:cs="Arial" w:eastAsia="Arial" w:hAnsi="Arial"/>
+                <w:sz w:val="20"/>
+                <w:szCs w:val="20"/>
+              </w:rPr>
+              <w:t xml:space="preserve">End Users</w:t>
+            </w:r>
+          </w:p>
+        </w:tc>
+      </w:tr>
+      <w:tr>
+        <w:tc>
+          <w:tcPr>
+            <w:tcW w:type="dxa" w:w="2800"/>
+            <w:tcBorders>
+              <w:top w:val="single" w:color="CCCCCC" w:sz="1"/>
+              <w:left w:val="single" w:color="CCCCCC" w:sz="1"/>
+              <w:bottom w:val="single" w:color="CCCCCC" w:sz="1"/>
+              <w:right w:val="single" w:color="CCCCCC" w:sz="1"/>
+            </w:tcBorders>
+            <w:tcMar>
+              <w:top w:type="dxa" w:w="80"/>
+              <w:left w:type="dxa" w:w="120"/>
+              <w:bottom w:type="dxa" w:w="80"/>
+              <w:right w:type="dxa" w:w="120"/>
+            </w:tcMar>
+          </w:tcPr>
+          <w:p>
+            <w:r>
+              <w:rPr>
+                <w:rFonts w:ascii="Arial" w:cs="Arial" w:eastAsia="Arial" w:hAnsi="Arial"/>
+                <w:sz w:val="20"/>
+                <w:szCs w:val="20"/>
+              </w:rPr>
+              <w:t xml:space="preserve">Analytics &amp; reporting</w:t>
+            </w:r>
+          </w:p>
+        </w:tc>
+        <w:tc>
+          <w:tcPr>
+            <w:tcW w:type="dxa" w:w="1640"/>
+            <w:tcBorders>
+              <w:top w:val="single" w:color="CCCCCC" w:sz="1"/>
+              <w:left w:val="single" w:color="CCCCCC" w:sz="1"/>
+              <w:bottom w:val="single" w:color="CCCCCC" w:sz="1"/>
+              <w:right w:val="single" w:color="CCCCCC" w:sz="1"/>
+            </w:tcBorders>
+            <w:tcMar>
+              <w:top w:type="dxa" w:w="80"/>
+              <w:left w:type="dxa" w:w="120"/>
+              <w:bottom w:type="dxa" w:w="80"/>
+              <w:right w:type="dxa" w:w="120"/>
+            </w:tcMar>
+          </w:tcPr>
+          <w:p>
+            <w:r>
+              <w:rPr>
+                <w:rFonts w:ascii="Arial" w:cs="Arial" w:eastAsia="Arial" w:hAnsi="Arial"/>
+                <w:sz w:val="20"/>
+                <w:szCs w:val="20"/>
+              </w:rPr>
+              <w:t xml:space="preserve">Data &amp; Analytics</w:t>
+            </w:r>
+          </w:p>
+        </w:tc>
+        <w:tc>
+          <w:tcPr>
+            <w:tcW w:type="dxa" w:w="1640"/>
+            <w:tcBorders>
+              <w:top w:val="single" w:color="CCCCCC" w:sz="1"/>
+              <w:left w:val="single" w:color="CCCCCC" w:sz="1"/>
+              <w:bottom w:val="single" w:color="CCCCCC" w:sz="1"/>
+              <w:right w:val="single" w:color="CCCCCC" w:sz="1"/>
+            </w:tcBorders>
+            <w:tcMar>
+              <w:top w:type="dxa" w:w="80"/>
+              <w:left w:type="dxa" w:w="120"/>
+              <w:bottom w:type="dxa" w:w="80"/>
+              <w:right w:type="dxa" w:w="120"/>
+            </w:tcMar>
+          </w:tcPr>
+          <w:p>
+            <w:r>
+              <w:rPr>
+                <w:rFonts w:ascii="Arial" w:cs="Arial" w:eastAsia="Arial" w:hAnsi="Arial"/>
+                <w:sz w:val="20"/>
+                <w:szCs w:val="20"/>
+              </w:rPr>
+              <w:t xml:space="preserve">Tech Support Eng</w:t>
+            </w:r>
+          </w:p>
+        </w:tc>
+        <w:tc>
+          <w:tcPr>
+            <w:tcW w:type="dxa" w:w="1640"/>
+            <w:tcBorders>
+              <w:top w:val="single" w:color="CCCCCC" w:sz="1"/>
+              <w:left w:val="single" w:color="CCCCCC" w:sz="1"/>
+              <w:bottom w:val="single" w:color="CCCCCC" w:sz="1"/>
+              <w:right w:val="single" w:color="CCCCCC" w:sz="1"/>
+            </w:tcBorders>
+            <w:tcMar>
+              <w:top w:type="dxa" w:w="80"/>
+              <w:left w:type="dxa" w:w="120"/>
+              <w:bottom w:type="dxa" w:w="80"/>
+              <w:right w:type="dxa" w:w="120"/>
+            </w:tcMar>
+          </w:tcPr>
+          <w:p>
+            <w:r>
+              <w:rPr>
+                <w:rFonts w:ascii="Arial" w:cs="Arial" w:eastAsia="Arial" w:hAnsi="Arial"/>
+                <w:sz w:val="20"/>
+                <w:szCs w:val="20"/>
+              </w:rPr>
+              <w:t xml:space="preserve">AI/ML, Supply Chain</w:t>
+            </w:r>
+          </w:p>
+        </w:tc>
+        <w:tc>
+          <w:tcPr>
+            <w:tcW w:type="dxa" w:w="1640"/>
+            <w:tcBorders>
+              <w:top w:val="single" w:color="CCCCCC" w:sz="1"/>
+              <w:left w:val="single" w:color="CCCCCC" w:sz="1"/>
+              <w:bottom w:val="single" w:color="CCCCCC" w:sz="1"/>
+              <w:right w:val="single" w:color="CCCCCC" w:sz="1"/>
+            </w:tcBorders>
+            <w:tcMar>
+              <w:top w:type="dxa" w:w="80"/>
+              <w:left w:type="dxa" w:w="120"/>
+              <w:bottom w:type="dxa" w:w="80"/>
+              <w:right w:type="dxa" w:w="120"/>
+            </w:tcMar>
+          </w:tcPr>
+          <w:p>
+            <w:r>
+              <w:rPr>
+                <w:rFonts w:ascii="Arial" w:cs="Arial" w:eastAsia="Arial" w:hAnsi="Arial"/>
+                <w:sz w:val="20"/>
+                <w:szCs w:val="20"/>
+              </w:rPr>
+              <w:t xml:space="preserve">Executive Sponsor</w:t>
+            </w:r>
+          </w:p>
+        </w:tc>
+      </w:tr>
+      <w:tr>
+        <w:tc>
+          <w:tcPr>
+            <w:tcW w:type="dxa" w:w="2800"/>
+            <w:tcBorders>
+              <w:top w:val="single" w:color="CCCCCC" w:sz="1"/>
+              <w:left w:val="single" w:color="CCCCCC" w:sz="1"/>
+              <w:bottom w:val="single" w:color="CCCCCC" w:sz="1"/>
+              <w:right w:val="single" w:color="CCCCCC" w:sz="1"/>
+            </w:tcBorders>
+            <w:tcMar>
+              <w:top w:type="dxa" w:w="80"/>
+              <w:left w:type="dxa" w:w="120"/>
+              <w:bottom w:type="dxa" w:w="80"/>
+              <w:right w:type="dxa" w:w="120"/>
+            </w:tcMar>
+          </w:tcPr>
+          <w:p>
+            <w:r>
+              <w:rPr>
+                <w:rFonts w:ascii="Arial" w:cs="Arial" w:eastAsia="Arial" w:hAnsi="Arial"/>
+                <w:sz w:val="20"/>
+                <w:szCs w:val="20"/>
+              </w:rPr>
+              <w:t xml:space="preserve">Voice &amp; telephony channels</w:t>
+            </w:r>
+          </w:p>
+        </w:tc>
+        <w:tc>
+          <w:tcPr>
+            <w:tcW w:type="dxa" w:w="1640"/>
+            <w:tcBorders>
+              <w:top w:val="single" w:color="CCCCCC" w:sz="1"/>
+              <w:left w:val="single" w:color="CCCCCC" w:sz="1"/>
+              <w:bottom w:val="single" w:color="CCCCCC" w:sz="1"/>
+              <w:right w:val="single" w:color="CCCCCC" w:sz="1"/>
+            </w:tcBorders>
+            <w:tcMar>
+              <w:top w:type="dxa" w:w="80"/>
+              <w:left w:type="dxa" w:w="120"/>
+              <w:bottom w:type="dxa" w:w="80"/>
+              <w:right w:type="dxa" w:w="120"/>
+            </w:tcMar>
+          </w:tcPr>
+          <w:p>
+            <w:r>
+              <w:rPr>
+                <w:rFonts w:ascii="Arial" w:cs="Arial" w:eastAsia="Arial" w:hAnsi="Arial"/>
+                <w:sz w:val="20"/>
+                <w:szCs w:val="20"/>
+              </w:rPr>
+              <w:t xml:space="preserve">UC / Telephony</w:t>
+            </w:r>
+          </w:p>
+        </w:tc>
+        <w:tc>
+          <w:tcPr>
+            <w:tcW w:type="dxa" w:w="1640"/>
+            <w:tcBorders>
+              <w:top w:val="single" w:color="CCCCCC" w:sz="1"/>
+              <w:left w:val="single" w:color="CCCCCC" w:sz="1"/>
+              <w:bottom w:val="single" w:color="CCCCCC" w:sz="1"/>
+              <w:right w:val="single" w:color="CCCCCC" w:sz="1"/>
+            </w:tcBorders>
+            <w:tcMar>
+              <w:top w:type="dxa" w:w="80"/>
+              <w:left w:type="dxa" w:w="120"/>
+              <w:bottom w:type="dxa" w:w="80"/>
+              <w:right w:type="dxa" w:w="120"/>
+            </w:tcMar>
+          </w:tcPr>
+          <w:p>
+            <w:r>
+              <w:rPr>
+                <w:rFonts w:ascii="Arial" w:cs="Arial" w:eastAsia="Arial" w:hAnsi="Arial"/>
+                <w:sz w:val="20"/>
+                <w:szCs w:val="20"/>
+              </w:rPr>
+              <w:t xml:space="preserve">IT / Cloud</w:t>
+            </w:r>
+          </w:p>
+        </w:tc>
+        <w:tc>
+          <w:tcPr>
+            <w:tcW w:type="dxa" w:w="1640"/>
+            <w:tcBorders>
+              <w:top w:val="single" w:color="CCCCCC" w:sz="1"/>
+              <w:left w:val="single" w:color="CCCCCC" w:sz="1"/>
+              <w:bottom w:val="single" w:color="CCCCCC" w:sz="1"/>
+              <w:right w:val="single" w:color="CCCCCC" w:sz="1"/>
+            </w:tcBorders>
+            <w:tcMar>
+              <w:top w:type="dxa" w:w="80"/>
+              <w:left w:type="dxa" w:w="120"/>
+              <w:bottom w:type="dxa" w:w="80"/>
+              <w:right w:type="dxa" w:w="120"/>
+            </w:tcMar>
+          </w:tcPr>
+          <w:p>
+            <w:r>
+              <w:rPr>
+                <w:rFonts w:ascii="Arial" w:cs="Arial" w:eastAsia="Arial" w:hAnsi="Arial"/>
+                <w:sz w:val="20"/>
+                <w:szCs w:val="20"/>
+              </w:rPr>
+              <w:t xml:space="preserve">Tech Support Eng</w:t>
+            </w:r>
+          </w:p>
+        </w:tc>
+        <w:tc>
+          <w:tcPr>
+            <w:tcW w:type="dxa" w:w="1640"/>
+            <w:tcBorders>
+              <w:top w:val="single" w:color="CCCCCC" w:sz="1"/>
+              <w:left w:val="single" w:color="CCCCCC" w:sz="1"/>
+              <w:bottom w:val="single" w:color="CCCCCC" w:sz="1"/>
+              <w:right w:val="single" w:color="CCCCCC" w:sz="1"/>
+            </w:tcBorders>
+            <w:tcMar>
+              <w:top w:type="dxa" w:w="80"/>
+              <w:left w:type="dxa" w:w="120"/>
+              <w:bottom w:type="dxa" w:w="80"/>
+              <w:right w:type="dxa" w:w="120"/>
+            </w:tcMar>
+          </w:tcPr>
+          <w:p>
+            <w:r>
+              <w:rPr>
+                <w:rFonts w:ascii="Arial" w:cs="Arial" w:eastAsia="Arial" w:hAnsi="Arial"/>
+                <w:sz w:val="20"/>
+                <w:szCs w:val="20"/>
+              </w:rPr>
+              <w:t xml:space="preserve">Product</w:t>
+            </w:r>
+          </w:p>
+        </w:tc>
+      </w:tr>
+      <w:tr>
+        <w:tc>
+          <w:tcPr>
+            <w:tcW w:type="dxa" w:w="2800"/>
+            <w:tcBorders>
+              <w:top w:val="single" w:color="CCCCCC" w:sz="1"/>
+              <w:left w:val="single" w:color="CCCCCC" w:sz="1"/>
+              <w:bottom w:val="single" w:color="CCCCCC" w:sz="1"/>
+              <w:right w:val="single" w:color="CCCCCC" w:sz="1"/>
+            </w:tcBorders>
+            <w:tcMar>
+              <w:top w:type="dxa" w:w="80"/>
+              <w:left w:type="dxa" w:w="120"/>
+              <w:bottom w:type="dxa" w:w="80"/>
+              <w:right w:type="dxa" w:w="120"/>
+            </w:tcMar>
+          </w:tcPr>
+          <w:p>
+            <w:r>
+              <w:rPr>
+                <w:rFonts w:ascii="Arial" w:cs="Arial" w:eastAsia="Arial" w:hAnsi="Arial"/>
+                <w:sz w:val="20"/>
+                <w:szCs w:val="20"/>
+              </w:rPr>
+              <w:t xml:space="preserve">Order &amp; supply chain integration</w:t>
+            </w:r>
+          </w:p>
+        </w:tc>
+        <w:tc>
+          <w:tcPr>
+            <w:tcW w:type="dxa" w:w="1640"/>
+            <w:tcBorders>
+              <w:top w:val="single" w:color="CCCCCC" w:sz="1"/>
+              <w:left w:val="single" w:color="CCCCCC" w:sz="1"/>
+              <w:bottom w:val="single" w:color="CCCCCC" w:sz="1"/>
+              <w:right w:val="single" w:color="CCCCCC" w:sz="1"/>
+            </w:tcBorders>
+            <w:tcMar>
+              <w:top w:type="dxa" w:w="80"/>
+              <w:left w:type="dxa" w:w="120"/>
+              <w:bottom w:type="dxa" w:w="80"/>
+              <w:right w:type="dxa" w:w="120"/>
+            </w:tcMar>
+          </w:tcPr>
+          <w:p>
+            <w:r>
+              <w:rPr>
+                <w:rFonts w:ascii="Arial" w:cs="Arial" w:eastAsia="Arial" w:hAnsi="Arial"/>
+                <w:sz w:val="20"/>
+                <w:szCs w:val="20"/>
+              </w:rPr>
+              <w:t xml:space="preserve">Supply Chain / Sales Ops</w:t>
+            </w:r>
+          </w:p>
+        </w:tc>
+        <w:tc>
+          <w:tcPr>
+            <w:tcW w:type="dxa" w:w="1640"/>
+            <w:tcBorders>
+              <w:top w:val="single" w:color="CCCCCC" w:sz="1"/>
+              <w:left w:val="single" w:color="CCCCCC" w:sz="1"/>
+              <w:bottom w:val="single" w:color="CCCCCC" w:sz="1"/>
+              <w:right w:val="single" w:color="CCCCCC" w:sz="1"/>
+            </w:tcBorders>
+            <w:tcMar>
+              <w:top w:type="dxa" w:w="80"/>
+              <w:left w:type="dxa" w:w="120"/>
+              <w:bottom w:type="dxa" w:w="80"/>
+              <w:right w:type="dxa" w:w="120"/>
+            </w:tcMar>
+          </w:tcPr>
+          <w:p>
+            <w:r>
+              <w:rPr>
+                <w:rFonts w:ascii="Arial" w:cs="Arial" w:eastAsia="Arial" w:hAnsi="Arial"/>
+                <w:sz w:val="20"/>
+                <w:szCs w:val="20"/>
+              </w:rPr>
+              <w:t xml:space="preserve">IT / Cloud</w:t>
+            </w:r>
+          </w:p>
+        </w:tc>
+        <w:tc>
+          <w:tcPr>
+            <w:tcW w:type="dxa" w:w="1640"/>
+            <w:tcBorders>
+              <w:top w:val="single" w:color="CCCCCC" w:sz="1"/>
+              <w:left w:val="single" w:color="CCCCCC" w:sz="1"/>
+              <w:bottom w:val="single" w:color="CCCCCC" w:sz="1"/>
+              <w:right w:val="single" w:color="CCCCCC" w:sz="1"/>
+            </w:tcBorders>
+            <w:tcMar>
+              <w:top w:type="dxa" w:w="80"/>
+              <w:left w:type="dxa" w:w="120"/>
+              <w:bottom w:type="dxa" w:w="80"/>
+              <w:right w:type="dxa" w:w="120"/>
+            </w:tcMar>
+          </w:tcPr>
+          <w:p>
+            <w:r>
+              <w:rPr>
+                <w:rFonts w:ascii="Arial" w:cs="Arial" w:eastAsia="Arial" w:hAnsi="Arial"/>
+                <w:sz w:val="20"/>
+                <w:szCs w:val="20"/>
+              </w:rPr>
+              <w:t xml:space="preserve">Tech Support, Apps Eng</w:t>
+            </w:r>
+          </w:p>
+        </w:tc>
+        <w:tc>
+          <w:tcPr>
+            <w:tcW w:type="dxa" w:w="1640"/>
+            <w:tcBorders>
+              <w:top w:val="single" w:color="CCCCCC" w:sz="1"/>
+              <w:left w:val="single" w:color="CCCCCC" w:sz="1"/>
+              <w:bottom w:val="single" w:color="CCCCCC" w:sz="1"/>
+              <w:right w:val="single" w:color="CCCCCC" w:sz="1"/>
+            </w:tcBorders>
+            <w:tcMar>
+              <w:top w:type="dxa" w:w="80"/>
+              <w:left w:type="dxa" w:w="120"/>
+              <w:bottom w:type="dxa" w:w="80"/>
+              <w:right w:type="dxa" w:w="120"/>
+            </w:tcMar>
+          </w:tcPr>
+          <w:p>
+            <w:r>
+              <w:rPr>
+                <w:rFonts w:ascii="Arial" w:cs="Arial" w:eastAsia="Arial" w:hAnsi="Arial"/>
+                <w:sz w:val="20"/>
+                <w:szCs w:val="20"/>
+              </w:rPr>
+              <w:t xml:space="preserve">Legal</w:t>
+            </w:r>
+          </w:p>
+        </w:tc>
+      </w:tr>
+      <w:tr>
+        <w:tc>
+          <w:tcPr>
+            <w:tcW w:type="dxa" w:w="2800"/>
+            <w:tcBorders>
+              <w:top w:val="single" w:color="CCCCCC" w:sz="1"/>
+              <w:left w:val="single" w:color="CCCCCC" w:sz="1"/>
+              <w:bottom w:val="single" w:color="CCCCCC" w:sz="1"/>
+              <w:right w:val="single" w:color="CCCCCC" w:sz="1"/>
+            </w:tcBorders>
+            <w:tcMar>
+              <w:top w:type="dxa" w:w="80"/>
+              <w:left w:type="dxa" w:w="120"/>
+              <w:bottom w:type="dxa" w:w="80"/>
+              <w:right w:type="dxa" w:w="120"/>
+            </w:tcMar>
+          </w:tcPr>
+          <w:p>
+            <w:r>
+              <w:rPr>
+                <w:rFonts w:ascii="Arial" w:cs="Arial" w:eastAsia="Arial" w:hAnsi="Arial"/>
+                <w:sz w:val="20"/>
+                <w:szCs w:val="20"/>
+              </w:rPr>
+              <w:t xml:space="preserve">Technical accuracy validation</w:t>
+            </w:r>
+          </w:p>
+        </w:tc>
+        <w:tc>
+          <w:tcPr>
+            <w:tcW w:type="dxa" w:w="1640"/>
+            <w:tcBorders>
+              <w:top w:val="single" w:color="CCCCCC" w:sz="1"/>
+              <w:left w:val="single" w:color="CCCCCC" w:sz="1"/>
+              <w:bottom w:val="single" w:color="CCCCCC" w:sz="1"/>
+              <w:right w:val="single" w:color="CCCCCC" w:sz="1"/>
+            </w:tcBorders>
+            <w:tcMar>
+              <w:top w:type="dxa" w:w="80"/>
+              <w:left w:type="dxa" w:w="120"/>
+              <w:bottom w:type="dxa" w:w="80"/>
+              <w:right w:type="dxa" w:w="120"/>
+            </w:tcMar>
+          </w:tcPr>
+          <w:p>
+            <w:r>
+              <w:rPr>
+                <w:rFonts w:ascii="Arial" w:cs="Arial" w:eastAsia="Arial" w:hAnsi="Arial"/>
+                <w:sz w:val="20"/>
+                <w:szCs w:val="20"/>
+              </w:rPr>
+              <w:t xml:space="preserve">Quality &amp; Reliability</w:t>
+            </w:r>
+          </w:p>
+        </w:tc>
+        <w:tc>
+          <w:tcPr>
+            <w:tcW w:type="dxa" w:w="1640"/>
+            <w:tcBorders>
+              <w:top w:val="single" w:color="CCCCCC" w:sz="1"/>
+              <w:left w:val="single" w:color="CCCCCC" w:sz="1"/>
+              <w:bottom w:val="single" w:color="CCCCCC" w:sz="1"/>
+              <w:right w:val="single" w:color="CCCCCC" w:sz="1"/>
+            </w:tcBorders>
+            <w:tcMar>
+              <w:top w:type="dxa" w:w="80"/>
+              <w:left w:type="dxa" w:w="120"/>
+              <w:bottom w:type="dxa" w:w="80"/>
+              <w:right w:type="dxa" w:w="120"/>
+            </w:tcMar>
+          </w:tcPr>
+          <w:p>
+            <w:r>
+              <w:rPr>
+                <w:rFonts w:ascii="Arial" w:cs="Arial" w:eastAsia="Arial" w:hAnsi="Arial"/>
+                <w:sz w:val="20"/>
+                <w:szCs w:val="20"/>
+              </w:rPr>
+              <w:t xml:space="preserve">Apps Engineering</w:t>
+            </w:r>
+          </w:p>
+        </w:tc>
+        <w:tc>
+          <w:tcPr>
+            <w:tcW w:type="dxa" w:w="1640"/>
+            <w:tcBorders>
+              <w:top w:val="single" w:color="CCCCCC" w:sz="1"/>
+              <w:left w:val="single" w:color="CCCCCC" w:sz="1"/>
+              <w:bottom w:val="single" w:color="CCCCCC" w:sz="1"/>
+              <w:right w:val="single" w:color="CCCCCC" w:sz="1"/>
+            </w:tcBorders>
+            <w:tcMar>
+              <w:top w:type="dxa" w:w="80"/>
+              <w:left w:type="dxa" w:w="120"/>
+              <w:bottom w:type="dxa" w:w="80"/>
+              <w:right w:type="dxa" w:w="120"/>
+            </w:tcMar>
+          </w:tcPr>
+          <w:p>
+            <w:r>
+              <w:rPr>
+                <w:rFonts w:ascii="Arial" w:cs="Arial" w:eastAsia="Arial" w:hAnsi="Arial"/>
+                <w:sz w:val="20"/>
+                <w:szCs w:val="20"/>
+              </w:rPr>
+              <w:t xml:space="preserve">Tech Support, AI/ML</w:t>
+            </w:r>
+          </w:p>
+        </w:tc>
+        <w:tc>
+          <w:tcPr>
+            <w:tcW w:type="dxa" w:w="1640"/>
+            <w:tcBorders>
+              <w:top w:val="single" w:color="CCCCCC" w:sz="1"/>
+              <w:left w:val="single" w:color="CCCCCC" w:sz="1"/>
+              <w:bottom w:val="single" w:color="CCCCCC" w:sz="1"/>
+              <w:right w:val="single" w:color="CCCCCC" w:sz="1"/>
+            </w:tcBorders>
+            <w:tcMar>
+              <w:top w:type="dxa" w:w="80"/>
+              <w:left w:type="dxa" w:w="120"/>
+              <w:bottom w:type="dxa" w:w="80"/>
+              <w:right w:type="dxa" w:w="120"/>
+            </w:tcMar>
+          </w:tcPr>
+          <w:p>
+            <w:r>
+              <w:rPr>
+                <w:rFonts w:ascii="Arial" w:cs="Arial" w:eastAsia="Arial" w:hAnsi="Arial"/>
+                <w:sz w:val="20"/>
+                <w:szCs w:val="20"/>
+              </w:rPr>
+              <w:t xml:space="preserve">Knowledge Mgmt</w:t>
+            </w:r>
+          </w:p>
+        </w:tc>
+      </w:tr>
+    </w:tbl>
+    <w:p>
+      <w:r>
+        <w:br w:type="page"/>
+      </w:r>
+    </w:p>
+    <w:p>
+      <w:pPr>
+        <w:pStyle w:val="Heading1"/>
+      </w:pPr>
+      <w:r>
+        <w:t xml:space="preserve">3. Business Objectives</w:t>
       </w:r>
     </w:p>
     <w:p>
@@ -434,7 +3421,7 @@
         <w:pStyle w:val="Heading1"/>
       </w:pPr>
       <w:r>
-        <w:t xml:space="preserve">3. Scope</w:t>
+        <w:t xml:space="preserve">4. Scope</w:t>
       </w:r>
     </w:p>
     <w:p>
@@ -442,7 +3429,7 @@
         <w:pStyle w:val="Heading2"/>
       </w:pPr>
       <w:r>
-        <w:t xml:space="preserve">3.1 In Scope</w:t>
+        <w:t xml:space="preserve">4.1 In Scope</w:t>
       </w:r>
     </w:p>
     <w:p>
@@ -620,7 +3607,7 @@
         <w:pStyle w:val="Heading2"/>
       </w:pPr>
       <w:r>
-        <w:t xml:space="preserve">3.2 Out of Scope</w:t>
+        <w:t xml:space="preserve">4.2 Out of Scope</w:t>
       </w:r>
     </w:p>
     <w:p>
@@ -735,7 +3722,7 @@
         <w:pStyle w:val="Heading1"/>
       </w:pPr>
       <w:r>
-        <w:t xml:space="preserve">4. Functional Requirements</w:t>
+        <w:t xml:space="preserve">5. Functional Requirements</w:t>
       </w:r>
     </w:p>
     <w:p>
@@ -4072,7 +7059,7 @@
         <w:pStyle w:val="Heading1"/>
       </w:pPr>
       <w:r>
-        <w:t xml:space="preserve">5. Non-Functional Requirements</w:t>
+        <w:t xml:space="preserve">6. Non-Functional Requirements</w:t>
       </w:r>
     </w:p>
     <w:p>
@@ -4372,7 +7359,7 @@
         <w:pStyle w:val="Heading1"/>
       </w:pPr>
       <w:r>
-        <w:t xml:space="preserve">6. Architecture Overview</w:t>
+        <w:t xml:space="preserve">7. Architecture Overview</w:t>
       </w:r>
     </w:p>
     <w:p>
@@ -4393,7 +7380,7 @@
         <w:pStyle w:val="Heading2"/>
       </w:pPr>
       <w:r>
-        <w:t xml:space="preserve">6.1 Architecture Layers</w:t>
+        <w:t xml:space="preserve">7.1 Architecture Layers</w:t>
       </w:r>
     </w:p>
     <w:p>
@@ -4509,7 +7496,7 @@
         <w:pStyle w:val="Heading2"/>
       </w:pPr>
       <w:r>
-        <w:t xml:space="preserve">6.2 Copilot Studio Path</w:t>
+        <w:t xml:space="preserve">7.2 Copilot Studio Path</w:t>
       </w:r>
     </w:p>
     <w:p>
@@ -4530,7 +7517,7 @@
         <w:pStyle w:val="Heading2"/>
       </w:pPr>
       <w:r>
-        <w:t xml:space="preserve">6.3 AI Foundry Path</w:t>
+        <w:t xml:space="preserve">7.3 AI Foundry Path</w:t>
       </w:r>
     </w:p>
     <w:p>
@@ -4551,7 +7538,7 @@
         <w:pStyle w:val="Heading2"/>
       </w:pPr>
       <w:r>
-        <w:t xml:space="preserve">6.4 Component Mapping</w:t>
+        <w:t xml:space="preserve">7.4 Component Mapping</w:t>
       </w:r>
     </w:p>
     <w:tbl>
@@ -5187,7 +8174,7 @@
         <w:pStyle w:val="Heading1"/>
       </w:pPr>
       <w:r>
-        <w:t xml:space="preserve">7. Success Criteria</w:t>
+        <w:t xml:space="preserve">8. Success Criteria</w:t>
       </w:r>
     </w:p>
     <w:p>
@@ -5195,7 +8182,7 @@
         <w:pStyle w:val="Heading2"/>
       </w:pPr>
       <w:r>
-        <w:t xml:space="preserve">7.1 POC Success Criteria</w:t>
+        <w:t xml:space="preserve">8.1 POC Success Criteria</w:t>
       </w:r>
     </w:p>
     <w:tbl>
@@ -5913,7 +8900,7 @@
         <w:pStyle w:val="Heading2"/>
       </w:pPr>
       <w:r>
-        <w:t xml:space="preserve">7.2 Gap Closure Metrics</w:t>
+        <w:t xml:space="preserve">8.2 Gap Closure Metrics</w:t>
       </w:r>
     </w:p>
     <w:p>
@@ -5939,7 +8926,7 @@
         <w:pStyle w:val="Heading1"/>
       </w:pPr>
       <w:r>
-        <w:t xml:space="preserve">8. Phased Delivery Roadmap</w:t>
+        <w:t xml:space="preserve">9. Phased Delivery Roadmap</w:t>
       </w:r>
     </w:p>
     <w:tbl>
@@ -6691,7 +9678,7 @@
         <w:pStyle w:val="Heading1"/>
       </w:pPr>
       <w:r>
-        <w:t xml:space="preserve">9. Resource Plan</w:t>
+        <w:t xml:space="preserve">10. Resource Plan</w:t>
       </w:r>
     </w:p>
     <w:p>
@@ -6712,7 +9699,7 @@
         <w:pStyle w:val="Heading2"/>
       </w:pPr>
       <w:r>
-        <w:t xml:space="preserve">9.1 Sprint Allocation by Role</w:t>
+        <w:t xml:space="preserve">10.1 Sprint Allocation by Role</w:t>
       </w:r>
     </w:p>
     <w:tbl>
@@ -8546,7 +11533,7 @@
         <w:pStyle w:val="Heading2"/>
       </w:pPr>
       <w:r>
-        <w:t xml:space="preserve">9.2 Cost Breakdown by Sprint</w:t>
+        <w:t xml:space="preserve">10.2 Cost Breakdown by Sprint</w:t>
       </w:r>
     </w:p>
     <w:tbl>
@@ -9778,7 +12765,7 @@
         <w:pStyle w:val="Heading2"/>
       </w:pPr>
       <w:r>
-        <w:t xml:space="preserve">9.3 Phase Summary</w:t>
+        <w:t xml:space="preserve">10.3 Phase Summary</w:t>
       </w:r>
     </w:p>
     <w:tbl>
@@ -10416,7 +13403,7 @@
         <w:pStyle w:val="Heading1"/>
       </w:pPr>
       <w:r>
-        <w:t xml:space="preserve">10. Assumptions &amp; Dependencies</w:t>
+        <w:t xml:space="preserve">11. Assumptions &amp; Dependencies</w:t>
       </w:r>
     </w:p>
     <w:p>
@@ -10424,7 +13411,7 @@
         <w:pStyle w:val="Heading2"/>
       </w:pPr>
       <w:r>
-        <w:t xml:space="preserve">10.1 Assumptions</w:t>
+        <w:t xml:space="preserve">11.1 Assumptions</w:t>
       </w:r>
     </w:p>
     <w:p>
@@ -10534,7 +13521,7 @@
         <w:pStyle w:val="Heading2"/>
       </w:pPr>
       <w:r>
-        <w:t xml:space="preserve">10.2 Dependencies</w:t>
+        <w:t xml:space="preserve">11.2 Dependencies</w:t>
       </w:r>
     </w:p>
     <w:p>
@@ -10649,7 +13636,7 @@
         <w:pStyle w:val="Heading1"/>
       </w:pPr>
       <w:r>
-        <w:t xml:space="preserve">11. Appendix: Gap Analysis Reference</w:t>
+        <w:t xml:space="preserve">12. Appendix: Gap Analysis Reference</w:t>
       </w:r>
     </w:p>
     <w:p>

</xml_diff>

<commit_message>
Add stakeholder engagement plan with priorities and talking points
New Appendix C with detailed engagement plan for all 15 functional
areas. Each section includes:
- Engagement priority and timing (Week 1-5)
- Key tasks for initial engagement
- 4-5 specific talking points with reference customer proof points

Organized by priority: Immediate (Exec Sponsor, Tech Support, IT,
InfoSec), High (Apps Eng, Supply Chain, AI/ML, Knowledge Mgmt,
Legal), Medium (Manufacturing, Data, UC, Product, Change Mgmt, QA).

BRD now 14 sections, 38 KB.

Co-Authored-By: Claude Opus 4.6 <noreply@anthropic.com>
</commit_message>
<xml_diff>
--- a/docs/AI-Support-Assistant-BRD.docx
+++ b/docs/AI-Support-Assistant-BRD.docx
@@ -21023,6 +21023,1844 @@
           <w:szCs w:val="20"/>
         </w:rPr>
         <w:t xml:space="preserve">Sources: Microsoft Customer Stories (microsoft.com/customers), Microsoft AI in Action (news.microsoft.com/ai-in-action), Microsoft Industry Blogs, verified case studies as of March 2026.</w:t>
+      </w:r>
+    </w:p>
+    <w:p>
+      <w:r>
+        <w:br w:type="page"/>
+      </w:r>
+    </w:p>
+    <w:p>
+      <w:pPr>
+        <w:pStyle w:val="Heading1"/>
+      </w:pPr>
+      <w:r>
+        <w:t xml:space="preserve">14. Appendix C: Stakeholder Engagement Plan</w:t>
+      </w:r>
+    </w:p>
+    <w:p>
+      <w:pPr>
+        <w:spacing w:after="200"/>
+      </w:pPr>
+      <w:r>
+        <w:rPr>
+          <w:rFonts w:ascii="Arial" w:cs="Arial" w:eastAsia="Arial" w:hAnsi="Arial"/>
+          <w:sz w:val="22"/>
+          <w:szCs w:val="22"/>
+        </w:rPr>
+        <w:t xml:space="preserve">This appendix provides a prioritized engagement plan for each functional area, including key tasks, discussion topics, and suggested talking points for initial stakeholder meetings. Use this as a playbook for building cross-functional alignment.</w:t>
+      </w:r>
+    </w:p>
+    <w:p>
+      <w:pPr>
+        <w:pStyle w:val="Heading2"/>
+      </w:pPr>
+      <w:r>
+        <w:t xml:space="preserve">14.1 Executive Sponsor (CIO / CTO / SVP Global Operations)</w:t>
+      </w:r>
+    </w:p>
+    <w:p>
+      <w:pPr>
+        <w:pStyle w:val="Heading3"/>
+      </w:pPr>
+      <w:r>
+        <w:t xml:space="preserve">Engagement Priority: Immediate — Week 1</w:t>
+      </w:r>
+    </w:p>
+    <w:p>
+      <w:pPr>
+        <w:spacing w:after="200"/>
+      </w:pPr>
+      <w:r>
+        <w:rPr>
+          <w:rFonts w:ascii="Arial" w:cs="Arial" w:eastAsia="Arial" w:hAnsi="Arial"/>
+          <w:b/>
+          <w:bCs/>
+          <w:sz w:val="22"/>
+          <w:szCs w:val="22"/>
+        </w:rPr>
+        <w:t xml:space="preserve">Key Tasks: </w:t>
+      </w:r>
+      <w:r>
+        <w:rPr>
+          <w:rFonts w:ascii="Arial" w:cs="Arial" w:eastAsia="Arial" w:hAnsi="Arial"/>
+          <w:sz w:val="22"/>
+          <w:szCs w:val="22"/>
+        </w:rPr>
+        <w:t xml:space="preserve">Secure executive sponsorship, confirm budget authority, align with corporate AI strategy, establish governance model, define success metrics for board reporting.</w:t>
+      </w:r>
+    </w:p>
+    <w:p>
+      <w:pPr>
+        <w:pStyle w:val="Heading3"/>
+      </w:pPr>
+      <w:r>
+        <w:t xml:space="preserve">Talking Points</w:t>
+      </w:r>
+    </w:p>
+    <w:p>
+      <w:pPr>
+        <w:pStyle w:val="ListParagraph"/>
+        <w:numPr>
+          <w:ilvl w:val="0"/>
+          <w:numId w:val="2"/>
+        </w:numPr>
+      </w:pPr>
+      <w:r>
+        <w:rPr>
+          <w:rFonts w:ascii="Arial" w:cs="Arial" w:eastAsia="Arial" w:hAnsi="Arial"/>
+          <w:sz w:val="22"/>
+          <w:szCs w:val="22"/>
+        </w:rPr>
+        <w:t xml:space="preserve">"We’ve built a proof-of-concept that demonstrates a 100% Microsoft-native AI support platform. Every component — from authentication to analytics — runs within your Azure tenant."</w:t>
+      </w:r>
+    </w:p>
+    <w:p>
+      <w:pPr>
+        <w:pStyle w:val="ListParagraph"/>
+        <w:numPr>
+          <w:ilvl w:val="0"/>
+          <w:numId w:val="2"/>
+        </w:numPr>
+      </w:pPr>
+      <w:r>
+        <w:rPr>
+          <w:rFonts w:ascii="Arial" w:cs="Arial" w:eastAsia="Arial" w:hAnsi="Arial"/>
+          <w:sz w:val="22"/>
+          <w:szCs w:val="22"/>
+        </w:rPr>
+        <w:t xml:space="preserve">"Lenovo achieved 15% productivity gains and record CSAT in just 45 days with the same Dynamics 365 + Copilot stack. Honeywell has 16+ generative AI use cases in production across 95,000 employees."</w:t>
+      </w:r>
+    </w:p>
+    <w:p>
+      <w:pPr>
+        <w:pStyle w:val="ListParagraph"/>
+        <w:numPr>
+          <w:ilvl w:val="0"/>
+          <w:numId w:val="2"/>
+        </w:numPr>
+      </w:pPr>
+      <w:r>
+        <w:rPr>
+          <w:rFonts w:ascii="Arial" w:cs="Arial" w:eastAsia="Arial" w:hAnsi="Arial"/>
+          <w:sz w:val="22"/>
+          <w:szCs w:val="22"/>
+        </w:rPr>
+        <w:t xml:space="preserve">"The phased approach (6 sprints, $235K) lets us validate value at each gate before committing to the next phase. Phase 2 alone delivers voice + function calling."</w:t>
+      </w:r>
+    </w:p>
+    <w:p>
+      <w:pPr>
+        <w:pStyle w:val="ListParagraph"/>
+        <w:numPr>
+          <w:ilvl w:val="0"/>
+          <w:numId w:val="2"/>
+        </w:numPr>
+      </w:pPr>
+      <w:r>
+        <w:rPr>
+          <w:rFonts w:ascii="Arial" w:cs="Arial" w:eastAsia="Arial" w:hAnsi="Arial"/>
+          <w:sz w:val="22"/>
+          <w:szCs w:val="22"/>
+        </w:rPr>
+        <w:t xml:space="preserve">"Which business unit should we pilot first — DRAM support, SSD technical services, or internal fab operations?"</w:t>
+      </w:r>
+    </w:p>
+    <w:p>
+      <w:pPr>
+        <w:spacing w:before="200"/>
+      </w:pPr>
+    </w:p>
+    <w:p>
+      <w:pPr>
+        <w:pStyle w:val="Heading2"/>
+      </w:pPr>
+      <w:r>
+        <w:t xml:space="preserve">14.2 Technical Support Engineering (VP Tech Support / TSE Managers)</w:t>
+      </w:r>
+    </w:p>
+    <w:p>
+      <w:pPr>
+        <w:pStyle w:val="Heading3"/>
+      </w:pPr>
+      <w:r>
+        <w:t xml:space="preserve">Engagement Priority: Immediate — Week 1</w:t>
+      </w:r>
+    </w:p>
+    <w:p>
+      <w:pPr>
+        <w:spacing w:after="200"/>
+      </w:pPr>
+      <w:r>
+        <w:rPr>
+          <w:rFonts w:ascii="Arial" w:cs="Arial" w:eastAsia="Arial" w:hAnsi="Arial"/>
+          <w:b/>
+          <w:bCs/>
+          <w:sz w:val="22"/>
+          <w:szCs w:val="22"/>
+        </w:rPr>
+        <w:t xml:space="preserve">Key Tasks: </w:t>
+      </w:r>
+      <w:r>
+        <w:rPr>
+          <w:rFonts w:ascii="Arial" w:cs="Arial" w:eastAsia="Arial" w:hAnsi="Arial"/>
+          <w:sz w:val="22"/>
+          <w:szCs w:val="22"/>
+        </w:rPr>
+        <w:t xml:space="preserve">Map current support workflows (Tier 1/2/3), inventory knowledge sources (datasheets, TN docs, qualification reports), define escalation rules, identify top 20 call reasons for AI training, establish accuracy benchmarks.</w:t>
+      </w:r>
+    </w:p>
+    <w:p>
+      <w:pPr>
+        <w:pStyle w:val="Heading3"/>
+      </w:pPr>
+      <w:r>
+        <w:t xml:space="preserve">Talking Points</w:t>
+      </w:r>
+    </w:p>
+    <w:p>
+      <w:pPr>
+        <w:pStyle w:val="ListParagraph"/>
+        <w:numPr>
+          <w:ilvl w:val="0"/>
+          <w:numId w:val="2"/>
+        </w:numPr>
+      </w:pPr>
+      <w:r>
+        <w:rPr>
+          <w:rFonts w:ascii="Arial" w:cs="Arial" w:eastAsia="Arial" w:hAnsi="Arial"/>
+          <w:sz w:val="22"/>
+          <w:szCs w:val="22"/>
+        </w:rPr>
+        <w:t xml:space="preserve">"Show me your top 20 support request types by volume. We’ll train the AI to handle the highest-volume, most repetitive queries first — freeing your TSEs for complex design-in work."</w:t>
+      </w:r>
+    </w:p>
+    <w:p>
+      <w:pPr>
+        <w:pStyle w:val="ListParagraph"/>
+        <w:numPr>
+          <w:ilvl w:val="0"/>
+          <w:numId w:val="2"/>
+        </w:numPr>
+      </w:pPr>
+      <w:r>
+        <w:rPr>
+          <w:rFonts w:ascii="Arial" w:cs="Arial" w:eastAsia="Arial" w:hAnsi="Arial"/>
+          <w:sz w:val="22"/>
+          <w:szCs w:val="22"/>
+        </w:rPr>
+        <w:t xml:space="preserve">"The AI won’t replace your team — it augments them. When confidence is low, it escalates with full context through Dynamics 365, so the human agent sees the entire conversation."</w:t>
+      </w:r>
+    </w:p>
+    <w:p>
+      <w:pPr>
+        <w:pStyle w:val="ListParagraph"/>
+        <w:numPr>
+          <w:ilvl w:val="0"/>
+          <w:numId w:val="2"/>
+        </w:numPr>
+      </w:pPr>
+      <w:r>
+        <w:rPr>
+          <w:rFonts w:ascii="Arial" w:cs="Arial" w:eastAsia="Arial" w:hAnsi="Arial"/>
+          <w:sz w:val="22"/>
+          <w:szCs w:val="22"/>
+        </w:rPr>
+        <w:t xml:space="preserve">"Schneider Electric cut troubleshooting time by 60–80% using the same Knowledge Bot + RAG pattern over their technical documentation."</w:t>
+      </w:r>
+    </w:p>
+    <w:p>
+      <w:pPr>
+        <w:pStyle w:val="ListParagraph"/>
+        <w:numPr>
+          <w:ilvl w:val="0"/>
+          <w:numId w:val="2"/>
+        </w:numPr>
+      </w:pPr>
+      <w:r>
+        <w:rPr>
+          <w:rFonts w:ascii="Arial" w:cs="Arial" w:eastAsia="Arial" w:hAnsi="Arial"/>
+          <w:sz w:val="22"/>
+          <w:szCs w:val="22"/>
+        </w:rPr>
+        <w:t xml:space="preserve">"What does your current escalation path look like from web form to Tier 3 engineering? Where are the bottlenecks?"</w:t>
+      </w:r>
+    </w:p>
+    <w:p>
+      <w:pPr>
+        <w:pStyle w:val="ListParagraph"/>
+        <w:numPr>
+          <w:ilvl w:val="0"/>
+          <w:numId w:val="2"/>
+        </w:numPr>
+      </w:pPr>
+      <w:r>
+        <w:rPr>
+          <w:rFonts w:ascii="Arial" w:cs="Arial" w:eastAsia="Arial" w:hAnsi="Arial"/>
+          <w:sz w:val="22"/>
+          <w:szCs w:val="22"/>
+        </w:rPr>
+        <w:t xml:space="preserve">"We need your team to validate the first 50 AI responses against your quality standards before we go live."</w:t>
+      </w:r>
+    </w:p>
+    <w:p>
+      <w:pPr>
+        <w:spacing w:before="200"/>
+      </w:pPr>
+    </w:p>
+    <w:p>
+      <w:pPr>
+        <w:pStyle w:val="Heading2"/>
+      </w:pPr>
+      <w:r>
+        <w:t xml:space="preserve">14.3 Applications Engineering (AEs / Solutions Architects)</w:t>
+      </w:r>
+    </w:p>
+    <w:p>
+      <w:pPr>
+        <w:pStyle w:val="Heading3"/>
+      </w:pPr>
+      <w:r>
+        <w:t xml:space="preserve">Engagement Priority: High — Weeks 2–3</w:t>
+      </w:r>
+    </w:p>
+    <w:p>
+      <w:pPr>
+        <w:spacing w:after="200"/>
+      </w:pPr>
+      <w:r>
+        <w:rPr>
+          <w:rFonts w:ascii="Arial" w:cs="Arial" w:eastAsia="Arial" w:hAnsi="Arial"/>
+          <w:b/>
+          <w:bCs/>
+          <w:sz w:val="22"/>
+          <w:szCs w:val="22"/>
+        </w:rPr>
+        <w:t xml:space="preserve">Key Tasks: </w:t>
+      </w:r>
+      <w:r>
+        <w:rPr>
+          <w:rFonts w:ascii="Arial" w:cs="Arial" w:eastAsia="Arial" w:hAnsi="Arial"/>
+          <w:sz w:val="22"/>
+          <w:szCs w:val="22"/>
+        </w:rPr>
+        <w:t xml:space="preserve">Identify technical domains for knowledge base (memory interfaces, signal integrity, firmware), define accuracy thresholds for engineering responses, establish NDA boundary rules for AI responses, create test suite of real customer queries.</w:t>
+      </w:r>
+    </w:p>
+    <w:p>
+      <w:pPr>
+        <w:pStyle w:val="Heading3"/>
+      </w:pPr>
+      <w:r>
+        <w:t xml:space="preserve">Talking Points</w:t>
+      </w:r>
+    </w:p>
+    <w:p>
+      <w:pPr>
+        <w:pStyle w:val="ListParagraph"/>
+        <w:numPr>
+          <w:ilvl w:val="0"/>
+          <w:numId w:val="2"/>
+        </w:numPr>
+      </w:pPr>
+      <w:r>
+        <w:rPr>
+          <w:rFonts w:ascii="Arial" w:cs="Arial" w:eastAsia="Arial" w:hAnsi="Arial"/>
+          <w:sz w:val="22"/>
+          <w:szCs w:val="22"/>
+        </w:rPr>
+        <w:t xml:space="preserve">"Your engineering expertise is what makes the knowledge base valuable. We need your help curating which technical notes, app notes, and design guides should be indexed."</w:t>
+      </w:r>
+    </w:p>
+    <w:p>
+      <w:pPr>
+        <w:pStyle w:val="ListParagraph"/>
+        <w:numPr>
+          <w:ilvl w:val="0"/>
+          <w:numId w:val="2"/>
+        </w:numPr>
+      </w:pPr>
+      <w:r>
+        <w:rPr>
+          <w:rFonts w:ascii="Arial" w:cs="Arial" w:eastAsia="Arial" w:hAnsi="Arial"/>
+          <w:sz w:val="22"/>
+          <w:szCs w:val="22"/>
+        </w:rPr>
+        <w:t xml:space="preserve">"The AI will show its source for every answer — ‘from TN-XX-XX, Section 4.2’ — so customers can verify against the original document. No hallucinated specs."</w:t>
+      </w:r>
+    </w:p>
+    <w:p>
+      <w:pPr>
+        <w:pStyle w:val="ListParagraph"/>
+        <w:numPr>
+          <w:ilvl w:val="0"/>
+          <w:numId w:val="2"/>
+        </w:numPr>
+      </w:pPr>
+      <w:r>
+        <w:rPr>
+          <w:rFonts w:ascii="Arial" w:cs="Arial" w:eastAsia="Arial" w:hAnsi="Arial"/>
+          <w:sz w:val="22"/>
+          <w:szCs w:val="22"/>
+        </w:rPr>
+        <w:t xml:space="preserve">"For queries that require custom characterization data, NDA-protected information, or judgment calls, the AI will escalate to a human AE — never attempt to answer beyond its confidence level."</w:t>
+      </w:r>
+    </w:p>
+    <w:p>
+      <w:pPr>
+        <w:pStyle w:val="ListParagraph"/>
+        <w:numPr>
+          <w:ilvl w:val="0"/>
+          <w:numId w:val="2"/>
+        </w:numPr>
+      </w:pPr>
+      <w:r>
+        <w:rPr>
+          <w:rFonts w:ascii="Arial" w:cs="Arial" w:eastAsia="Arial" w:hAnsi="Arial"/>
+          <w:sz w:val="22"/>
+          <w:szCs w:val="22"/>
+        </w:rPr>
+        <w:t xml:space="preserve">"Can you give us 30–50 real customer questions from the past quarter? We’ll use them as our accuracy test suite."</w:t>
+      </w:r>
+    </w:p>
+    <w:p>
+      <w:pPr>
+        <w:spacing w:before="200"/>
+      </w:pPr>
+    </w:p>
+    <w:p>
+      <w:pPr>
+        <w:pStyle w:val="Heading2"/>
+      </w:pPr>
+      <w:r>
+        <w:t xml:space="preserve">14.4 Manufacturing / Fab Operations (VP Manufacturing / Fab Managers)</w:t>
+      </w:r>
+    </w:p>
+    <w:p>
+      <w:pPr>
+        <w:pStyle w:val="Heading3"/>
+      </w:pPr>
+      <w:r>
+        <w:t xml:space="preserve">Engagement Priority: Medium — Weeks 3–4</w:t>
+      </w:r>
+    </w:p>
+    <w:p>
+      <w:pPr>
+        <w:spacing w:after="200"/>
+      </w:pPr>
+      <w:r>
+        <w:rPr>
+          <w:rFonts w:ascii="Arial" w:cs="Arial" w:eastAsia="Arial" w:hAnsi="Arial"/>
+          <w:b/>
+          <w:bCs/>
+          <w:sz w:val="22"/>
+          <w:szCs w:val="22"/>
+        </w:rPr>
+        <w:t xml:space="preserve">Key Tasks: </w:t>
+      </w:r>
+      <w:r>
+        <w:rPr>
+          <w:rFonts w:ascii="Arial" w:cs="Arial" w:eastAsia="Arial" w:hAnsi="Arial"/>
+          <w:sz w:val="22"/>
+          <w:szCs w:val="22"/>
+        </w:rPr>
+        <w:t xml:space="preserve">Scope internal support use case (fab process docs, equipment procedures, yield analysis), classify manufacturing IP sensitivity levels, validate clean room protocol documentation is indexable, assess integration with MES/yield systems.</w:t>
+      </w:r>
+    </w:p>
+    <w:p>
+      <w:pPr>
+        <w:pStyle w:val="Heading3"/>
+      </w:pPr>
+      <w:r>
+        <w:t xml:space="preserve">Talking Points</w:t>
+      </w:r>
+    </w:p>
+    <w:p>
+      <w:pPr>
+        <w:pStyle w:val="ListParagraph"/>
+        <w:numPr>
+          <w:ilvl w:val="0"/>
+          <w:numId w:val="2"/>
+        </w:numPr>
+      </w:pPr>
+      <w:r>
+        <w:rPr>
+          <w:rFonts w:ascii="Arial" w:cs="Arial" w:eastAsia="Arial" w:hAnsi="Arial"/>
+          <w:sz w:val="22"/>
+          <w:szCs w:val="22"/>
+        </w:rPr>
+        <w:t xml:space="preserve">"Internal engineers waste hours searching for process recipes, equipment SOPs, and yield troubleshooting docs. The AI can surface the right document in seconds."</w:t>
+      </w:r>
+    </w:p>
+    <w:p>
+      <w:pPr>
+        <w:pStyle w:val="ListParagraph"/>
+        <w:numPr>
+          <w:ilvl w:val="0"/>
+          <w:numId w:val="2"/>
+        </w:numPr>
+      </w:pPr>
+      <w:r>
+        <w:rPr>
+          <w:rFonts w:ascii="Arial" w:cs="Arial" w:eastAsia="Arial" w:hAnsi="Arial"/>
+          <w:sz w:val="22"/>
+          <w:szCs w:val="22"/>
+        </w:rPr>
+        <w:t xml:space="preserve">"ABB’s Genix Copilot on Azure OpenAI extended asset lifespan by 20% and reduced unplanned downtime by 60% in manufacturing environments."</w:t>
+      </w:r>
+    </w:p>
+    <w:p>
+      <w:pPr>
+        <w:pStyle w:val="ListParagraph"/>
+        <w:numPr>
+          <w:ilvl w:val="0"/>
+          <w:numId w:val="2"/>
+        </w:numPr>
+      </w:pPr>
+      <w:r>
+        <w:rPr>
+          <w:rFonts w:ascii="Arial" w:cs="Arial" w:eastAsia="Arial" w:hAnsi="Arial"/>
+          <w:sz w:val="22"/>
+          <w:szCs w:val="22"/>
+        </w:rPr>
+        <w:t xml:space="preserve">"We’ll classify all fab content by sensitivity level — public, internal, restricted — and enforce access control through Entra ID RBAC. No risk of process IP leaking to external channels."</w:t>
+      </w:r>
+    </w:p>
+    <w:p>
+      <w:pPr>
+        <w:pStyle w:val="ListParagraph"/>
+        <w:numPr>
+          <w:ilvl w:val="0"/>
+          <w:numId w:val="2"/>
+        </w:numPr>
+      </w:pPr>
+      <w:r>
+        <w:rPr>
+          <w:rFonts w:ascii="Arial" w:cs="Arial" w:eastAsia="Arial" w:hAnsi="Arial"/>
+          <w:sz w:val="22"/>
+          <w:szCs w:val="22"/>
+        </w:rPr>
+        <w:t xml:space="preserve">"Is there appetite to pilot this for equipment troubleshooting on one fab line before expanding?"</w:t>
+      </w:r>
+    </w:p>
+    <w:p>
+      <w:pPr>
+        <w:spacing w:before="200"/>
+      </w:pPr>
+    </w:p>
+    <w:p>
+      <w:pPr>
+        <w:pStyle w:val="Heading2"/>
+      </w:pPr>
+      <w:r>
+        <w:t xml:space="preserve">14.5 IT / Cloud Infrastructure (Cloud Architect / Platform Engineer)</w:t>
+      </w:r>
+    </w:p>
+    <w:p>
+      <w:pPr>
+        <w:pStyle w:val="Heading3"/>
+      </w:pPr>
+      <w:r>
+        <w:t xml:space="preserve">Engagement Priority: Immediate — Week 1</w:t>
+      </w:r>
+    </w:p>
+    <w:p>
+      <w:pPr>
+        <w:spacing w:after="200"/>
+      </w:pPr>
+      <w:r>
+        <w:rPr>
+          <w:rFonts w:ascii="Arial" w:cs="Arial" w:eastAsia="Arial" w:hAnsi="Arial"/>
+          <w:b/>
+          <w:bCs/>
+          <w:sz w:val="22"/>
+          <w:szCs w:val="22"/>
+        </w:rPr>
+        <w:t xml:space="preserve">Key Tasks: </w:t>
+      </w:r>
+      <w:r>
+        <w:rPr>
+          <w:rFonts w:ascii="Arial" w:cs="Arial" w:eastAsia="Arial" w:hAnsi="Arial"/>
+          <w:sz w:val="22"/>
+          <w:szCs w:val="22"/>
+        </w:rPr>
+        <w:t xml:space="preserve">Validate Azure resource requirements and quotas, confirm networking architecture (private endpoints, ExpressRoute), assess integration with existing SAP/PLM systems, plan CI/CD pipeline, establish dev/staging/prod environments.</w:t>
+      </w:r>
+    </w:p>
+    <w:p>
+      <w:pPr>
+        <w:pStyle w:val="Heading3"/>
+      </w:pPr>
+      <w:r>
+        <w:t xml:space="preserve">Talking Points</w:t>
+      </w:r>
+    </w:p>
+    <w:p>
+      <w:pPr>
+        <w:pStyle w:val="ListParagraph"/>
+        <w:numPr>
+          <w:ilvl w:val="0"/>
+          <w:numId w:val="2"/>
+        </w:numPr>
+      </w:pPr>
+      <w:r>
+        <w:rPr>
+          <w:rFonts w:ascii="Arial" w:cs="Arial" w:eastAsia="Arial" w:hAnsi="Arial"/>
+          <w:sz w:val="22"/>
+          <w:szCs w:val="22"/>
+        </w:rPr>
+        <w:t xml:space="preserve">"The entire solution runs on Azure PaaS services — no VMs to manage. OpenAI, AI Search, Cosmos DB, Fabric — all managed services within your tenant."</w:t>
+      </w:r>
+    </w:p>
+    <w:p>
+      <w:pPr>
+        <w:pStyle w:val="ListParagraph"/>
+        <w:numPr>
+          <w:ilvl w:val="0"/>
+          <w:numId w:val="2"/>
+        </w:numPr>
+      </w:pPr>
+      <w:r>
+        <w:rPr>
+          <w:rFonts w:ascii="Arial" w:cs="Arial" w:eastAsia="Arial" w:hAnsi="Arial"/>
+          <w:sz w:val="22"/>
+          <w:szCs w:val="22"/>
+        </w:rPr>
+        <w:t xml:space="preserve">"We need to confirm Azure OpenAI quota allocation for GPT-4o and GPT-4o-realtime models in your region. What’s your current Azure subscription structure?"</w:t>
+      </w:r>
+    </w:p>
+    <w:p>
+      <w:pPr>
+        <w:pStyle w:val="ListParagraph"/>
+        <w:numPr>
+          <w:ilvl w:val="0"/>
+          <w:numId w:val="2"/>
+        </w:numPr>
+      </w:pPr>
+      <w:r>
+        <w:rPr>
+          <w:rFonts w:ascii="Arial" w:cs="Arial" w:eastAsia="Arial" w:hAnsi="Arial"/>
+          <w:sz w:val="22"/>
+          <w:szCs w:val="22"/>
+        </w:rPr>
+        <w:t xml:space="preserve">"Private endpoints ensure no data leaves your VNet. We’ll need ExpressRoute or VPN for any on-prem integration (SAP, MES)."</w:t>
+      </w:r>
+    </w:p>
+    <w:p>
+      <w:pPr>
+        <w:pStyle w:val="ListParagraph"/>
+        <w:numPr>
+          <w:ilvl w:val="0"/>
+          <w:numId w:val="2"/>
+        </w:numPr>
+      </w:pPr>
+      <w:r>
+        <w:rPr>
+          <w:rFonts w:ascii="Arial" w:cs="Arial" w:eastAsia="Arial" w:hAnsi="Arial"/>
+          <w:sz w:val="22"/>
+          <w:szCs w:val="22"/>
+        </w:rPr>
+        <w:t xml:space="preserve">"What’s your current CI/CD toolchain? We’ll align with Azure DevOps or GitHub Actions — whichever you prefer."</w:t>
+      </w:r>
+    </w:p>
+    <w:p>
+      <w:pPr>
+        <w:spacing w:before="200"/>
+      </w:pPr>
+    </w:p>
+    <w:p>
+      <w:pPr>
+        <w:pStyle w:val="Heading2"/>
+      </w:pPr>
+      <w:r>
+        <w:t xml:space="preserve">14.6 Information Security &amp; Export Controls (CISO / Export Control Officer)</w:t>
+      </w:r>
+    </w:p>
+    <w:p>
+      <w:pPr>
+        <w:pStyle w:val="Heading3"/>
+      </w:pPr>
+      <w:r>
+        <w:t xml:space="preserve">Engagement Priority: Immediate — Week 1</w:t>
+      </w:r>
+    </w:p>
+    <w:p>
+      <w:pPr>
+        <w:spacing w:after="200"/>
+      </w:pPr>
+      <w:r>
+        <w:rPr>
+          <w:rFonts w:ascii="Arial" w:cs="Arial" w:eastAsia="Arial" w:hAnsi="Arial"/>
+          <w:b/>
+          <w:bCs/>
+          <w:sz w:val="22"/>
+          <w:szCs w:val="22"/>
+        </w:rPr>
+        <w:t xml:space="preserve">Key Tasks: </w:t>
+      </w:r>
+      <w:r>
+        <w:rPr>
+          <w:rFonts w:ascii="Arial" w:cs="Arial" w:eastAsia="Arial" w:hAnsi="Arial"/>
+          <w:sz w:val="22"/>
+          <w:szCs w:val="22"/>
+        </w:rPr>
+        <w:t xml:space="preserve">Review security architecture, validate Entra ID integration plan, assess ITAR/EAR compliance for AI-served content, define data classification schema for knowledge base, approve AI safety guardrails, review responsible AI policies.</w:t>
+      </w:r>
+    </w:p>
+    <w:p>
+      <w:pPr>
+        <w:pStyle w:val="Heading3"/>
+      </w:pPr>
+      <w:r>
+        <w:t xml:space="preserve">Talking Points</w:t>
+      </w:r>
+    </w:p>
+    <w:p>
+      <w:pPr>
+        <w:pStyle w:val="ListParagraph"/>
+        <w:numPr>
+          <w:ilvl w:val="0"/>
+          <w:numId w:val="2"/>
+        </w:numPr>
+      </w:pPr>
+      <w:r>
+        <w:rPr>
+          <w:rFonts w:ascii="Arial" w:cs="Arial" w:eastAsia="Arial" w:hAnsi="Arial"/>
+          <w:sz w:val="22"/>
+          <w:szCs w:val="22"/>
+        </w:rPr>
+        <w:t xml:space="preserve">"Zero-trust by design: Entra ID is mandatory (no API keys), all data stays in your Azure tenant, RBAC controls who sees what, and private endpoints eliminate public internet exposure."</w:t>
+      </w:r>
+    </w:p>
+    <w:p>
+      <w:pPr>
+        <w:pStyle w:val="ListParagraph"/>
+        <w:numPr>
+          <w:ilvl w:val="0"/>
+          <w:numId w:val="2"/>
+        </w:numPr>
+      </w:pPr>
+      <w:r>
+        <w:rPr>
+          <w:rFonts w:ascii="Arial" w:cs="Arial" w:eastAsia="Arial" w:hAnsi="Arial"/>
+          <w:sz w:val="22"/>
+          <w:szCs w:val="22"/>
+        </w:rPr>
+        <w:t xml:space="preserve">"For export-controlled content, we’ll implement content classification tags in Azure AI Search. The RAG pipeline will check user clearance level before returning restricted documents."</w:t>
+      </w:r>
+    </w:p>
+    <w:p>
+      <w:pPr>
+        <w:pStyle w:val="ListParagraph"/>
+        <w:numPr>
+          <w:ilvl w:val="0"/>
+          <w:numId w:val="2"/>
+        </w:numPr>
+      </w:pPr>
+      <w:r>
+        <w:rPr>
+          <w:rFonts w:ascii="Arial" w:cs="Arial" w:eastAsia="Arial" w:hAnsi="Arial"/>
+          <w:sz w:val="22"/>
+          <w:szCs w:val="22"/>
+        </w:rPr>
+        <w:t xml:space="preserve">"The AI has built-in guardrails — it will never expose raw source data, never combine information across classification levels, and every response cites its source document."</w:t>
+      </w:r>
+    </w:p>
+    <w:p>
+      <w:pPr>
+        <w:pStyle w:val="ListParagraph"/>
+        <w:numPr>
+          <w:ilvl w:val="0"/>
+          <w:numId w:val="2"/>
+        </w:numPr>
+      </w:pPr>
+      <w:r>
+        <w:rPr>
+          <w:rFonts w:ascii="Arial" w:cs="Arial" w:eastAsia="Arial" w:hAnsi="Arial"/>
+          <w:sz w:val="22"/>
+          <w:szCs w:val="22"/>
+        </w:rPr>
+        <w:t xml:space="preserve">"What’s your current content classification schema? We need to map ITAR/EAR categories to Azure AI Search access control filters."</w:t>
+      </w:r>
+    </w:p>
+    <w:p>
+      <w:pPr>
+        <w:pStyle w:val="ListParagraph"/>
+        <w:numPr>
+          <w:ilvl w:val="0"/>
+          <w:numId w:val="2"/>
+        </w:numPr>
+      </w:pPr>
+      <w:r>
+        <w:rPr>
+          <w:rFonts w:ascii="Arial" w:cs="Arial" w:eastAsia="Arial" w:hAnsi="Arial"/>
+          <w:sz w:val="22"/>
+          <w:szCs w:val="22"/>
+        </w:rPr>
+        <w:t xml:space="preserve">"Microsoft’s enterprise AI safety: customer data is never used for model training. Azure OpenAI runs in an isolated, SOC 2 / ISO 27001 certified environment."</w:t>
+      </w:r>
+    </w:p>
+    <w:p>
+      <w:pPr>
+        <w:spacing w:before="200"/>
+      </w:pPr>
+    </w:p>
+    <w:p>
+      <w:pPr>
+        <w:pStyle w:val="Heading2"/>
+      </w:pPr>
+      <w:r>
+        <w:t xml:space="preserve">14.7 Supply Chain / Sales Operations (VP Sales Ops / Order Management)</w:t>
+      </w:r>
+    </w:p>
+    <w:p>
+      <w:pPr>
+        <w:pStyle w:val="Heading3"/>
+      </w:pPr>
+      <w:r>
+        <w:t xml:space="preserve">Engagement Priority: High — Weeks 2–3</w:t>
+      </w:r>
+    </w:p>
+    <w:p>
+      <w:pPr>
+        <w:spacing w:after="200"/>
+      </w:pPr>
+      <w:r>
+        <w:rPr>
+          <w:rFonts w:ascii="Arial" w:cs="Arial" w:eastAsia="Arial" w:hAnsi="Arial"/>
+          <w:b/>
+          <w:bCs/>
+          <w:sz w:val="22"/>
+          <w:szCs w:val="22"/>
+        </w:rPr>
+        <w:t xml:space="preserve">Key Tasks: </w:t>
+      </w:r>
+      <w:r>
+        <w:rPr>
+          <w:rFonts w:ascii="Arial" w:cs="Arial" w:eastAsia="Arial" w:hAnsi="Arial"/>
+          <w:sz w:val="22"/>
+          <w:szCs w:val="22"/>
+        </w:rPr>
+        <w:t xml:space="preserve">Map customer-facing query types (order status, lead times, allocation, pricing), define SAP/CRM integration requirements for real-time order data, identify function calling use cases (order lookup, shipment tracking), establish data refresh cadence.</w:t>
+      </w:r>
+    </w:p>
+    <w:p>
+      <w:pPr>
+        <w:pStyle w:val="Heading3"/>
+      </w:pPr>
+      <w:r>
+        <w:t xml:space="preserve">Talking Points</w:t>
+      </w:r>
+    </w:p>
+    <w:p>
+      <w:pPr>
+        <w:pStyle w:val="ListParagraph"/>
+        <w:numPr>
+          <w:ilvl w:val="0"/>
+          <w:numId w:val="2"/>
+        </w:numPr>
+      </w:pPr>
+      <w:r>
+        <w:rPr>
+          <w:rFonts w:ascii="Arial" w:cs="Arial" w:eastAsia="Arial" w:hAnsi="Arial"/>
+          <w:sz w:val="22"/>
+          <w:szCs w:val="22"/>
+        </w:rPr>
+        <w:t xml:space="preserve">"Customers asking ‘where’s my order?’ or ‘what’s the lead time for part X?’ can get instant answers through the AI agent using function calling to query SAP in real-time."</w:t>
+      </w:r>
+    </w:p>
+    <w:p>
+      <w:pPr>
+        <w:pStyle w:val="ListParagraph"/>
+        <w:numPr>
+          <w:ilvl w:val="0"/>
+          <w:numId w:val="2"/>
+        </w:numPr>
+      </w:pPr>
+      <w:r>
+        <w:rPr>
+          <w:rFonts w:ascii="Arial" w:cs="Arial" w:eastAsia="Arial" w:hAnsi="Arial"/>
+          <w:sz w:val="22"/>
+          <w:szCs w:val="22"/>
+        </w:rPr>
+        <w:t xml:space="preserve">"The function calling pattern means the AI doesn’t just search documents — it executes actual lookups: check_order_status(PO=12345), get_lead_time(part=MT48AX), track_shipment(ID=...)."</w:t>
+      </w:r>
+    </w:p>
+    <w:p>
+      <w:pPr>
+        <w:pStyle w:val="ListParagraph"/>
+        <w:numPr>
+          <w:ilvl w:val="0"/>
+          <w:numId w:val="2"/>
+        </w:numPr>
+      </w:pPr>
+      <w:r>
+        <w:rPr>
+          <w:rFonts w:ascii="Arial" w:cs="Arial" w:eastAsia="Arial" w:hAnsi="Arial"/>
+          <w:sz w:val="22"/>
+          <w:szCs w:val="22"/>
+        </w:rPr>
+        <w:t xml:space="preserve">"Which data systems hold order status, inventory, and allocation data today? We need API access for the function calling integration."</w:t>
+      </w:r>
+    </w:p>
+    <w:p>
+      <w:pPr>
+        <w:pStyle w:val="ListParagraph"/>
+        <w:numPr>
+          <w:ilvl w:val="0"/>
+          <w:numId w:val="2"/>
+        </w:numPr>
+      </w:pPr>
+      <w:r>
+        <w:rPr>
+          <w:rFonts w:ascii="Arial" w:cs="Arial" w:eastAsia="Arial" w:hAnsi="Arial"/>
+          <w:sz w:val="22"/>
+          <w:szCs w:val="22"/>
+        </w:rPr>
+        <w:t xml:space="preserve">"What are your top 5 customer pain points in the order-to-delivery process? Those become our first function calling targets."</w:t>
+      </w:r>
+    </w:p>
+    <w:p>
+      <w:pPr>
+        <w:spacing w:before="200"/>
+      </w:pPr>
+    </w:p>
+    <w:p>
+      <w:pPr>
+        <w:pStyle w:val="Heading2"/>
+      </w:pPr>
+      <w:r>
+        <w:t xml:space="preserve">14.8 Data &amp; Analytics (CDO / Analytics Lead)</w:t>
+      </w:r>
+    </w:p>
+    <w:p>
+      <w:pPr>
+        <w:pStyle w:val="Heading3"/>
+      </w:pPr>
+      <w:r>
+        <w:t xml:space="preserve">Engagement Priority: Medium — Weeks 3–4 (Phase 3 focus)</w:t>
+      </w:r>
+    </w:p>
+    <w:p>
+      <w:pPr>
+        <w:spacing w:after="200"/>
+      </w:pPr>
+      <w:r>
+        <w:rPr>
+          <w:rFonts w:ascii="Arial" w:cs="Arial" w:eastAsia="Arial" w:hAnsi="Arial"/>
+          <w:b/>
+          <w:bCs/>
+          <w:sz w:val="22"/>
+          <w:szCs w:val="22"/>
+        </w:rPr>
+        <w:t xml:space="preserve">Key Tasks: </w:t>
+      </w:r>
+      <w:r>
+        <w:rPr>
+          <w:rFonts w:ascii="Arial" w:cs="Arial" w:eastAsia="Arial" w:hAnsi="Arial"/>
+          <w:sz w:val="22"/>
+          <w:szCs w:val="22"/>
+        </w:rPr>
+        <w:t xml:space="preserve">Define KPIs and reporting requirements, plan Cosmos DB schema for conversation data, configure Fabric mirroring, design Power BI dashboards, integrate with existing manufacturing intelligence platforms.</w:t>
+      </w:r>
+    </w:p>
+    <w:p>
+      <w:pPr>
+        <w:pStyle w:val="Heading3"/>
+      </w:pPr>
+      <w:r>
+        <w:t xml:space="preserve">Talking Points</w:t>
+      </w:r>
+    </w:p>
+    <w:p>
+      <w:pPr>
+        <w:pStyle w:val="ListParagraph"/>
+        <w:numPr>
+          <w:ilvl w:val="0"/>
+          <w:numId w:val="2"/>
+        </w:numPr>
+      </w:pPr>
+      <w:r>
+        <w:rPr>
+          <w:rFonts w:ascii="Arial" w:cs="Arial" w:eastAsia="Arial" w:hAnsi="Arial"/>
+          <w:sz w:val="22"/>
+          <w:szCs w:val="22"/>
+        </w:rPr>
+        <w:t xml:space="preserve">"Every conversation generates structured analytics: sentiment, call reason, resolution time, CSAT, and agent performance — all stored in Cosmos DB with real-time mirroring to Fabric."</w:t>
+      </w:r>
+    </w:p>
+    <w:p>
+      <w:pPr>
+        <w:pStyle w:val="ListParagraph"/>
+        <w:numPr>
+          <w:ilvl w:val="0"/>
+          <w:numId w:val="2"/>
+        </w:numPr>
+      </w:pPr>
+      <w:r>
+        <w:rPr>
+          <w:rFonts w:ascii="Arial" w:cs="Arial" w:eastAsia="Arial" w:hAnsi="Arial"/>
+          <w:sz w:val="22"/>
+          <w:szCs w:val="22"/>
+        </w:rPr>
+        <w:t xml:space="preserve">"Your BI team can build Power BI dashboards or use Fabric Data Agents to query conversation data in natural language: ‘Show me DRAM support trends this quarter.’"</w:t>
+      </w:r>
+    </w:p>
+    <w:p>
+      <w:pPr>
+        <w:pStyle w:val="ListParagraph"/>
+        <w:numPr>
+          <w:ilvl w:val="0"/>
+          <w:numId w:val="2"/>
+        </w:numPr>
+      </w:pPr>
+      <w:r>
+        <w:rPr>
+          <w:rFonts w:ascii="Arial" w:cs="Arial" w:eastAsia="Arial" w:hAnsi="Arial"/>
+          <w:sz w:val="22"/>
+          <w:szCs w:val="22"/>
+        </w:rPr>
+        <w:t xml:space="preserve">"What KPIs does leadership care about most? Resolution rate? First-contact resolution? Average handle time? We’ll design the analytics pipeline around those."</w:t>
+      </w:r>
+    </w:p>
+    <w:p>
+      <w:pPr>
+        <w:pStyle w:val="ListParagraph"/>
+        <w:numPr>
+          <w:ilvl w:val="0"/>
+          <w:numId w:val="2"/>
+        </w:numPr>
+      </w:pPr>
+      <w:r>
+        <w:rPr>
+          <w:rFonts w:ascii="Arial" w:cs="Arial" w:eastAsia="Arial" w:hAnsi="Arial"/>
+          <w:sz w:val="22"/>
+          <w:szCs w:val="22"/>
+        </w:rPr>
+        <w:t xml:space="preserve">"How does this integrate with your existing manufacturing intelligence and yield analytics platforms?"</w:t>
+      </w:r>
+    </w:p>
+    <w:p>
+      <w:pPr>
+        <w:spacing w:before="200"/>
+      </w:pPr>
+    </w:p>
+    <w:p>
+      <w:pPr>
+        <w:pStyle w:val="Heading2"/>
+      </w:pPr>
+      <w:r>
+        <w:t xml:space="preserve">14.9 AI / Machine Learning (AI/ML Lead / Prompt Engineer)</w:t>
+      </w:r>
+    </w:p>
+    <w:p>
+      <w:pPr>
+        <w:pStyle w:val="Heading3"/>
+      </w:pPr>
+      <w:r>
+        <w:t xml:space="preserve">Engagement Priority: High — Weeks 2–3</w:t>
+      </w:r>
+    </w:p>
+    <w:p>
+      <w:pPr>
+        <w:spacing w:after="200"/>
+      </w:pPr>
+      <w:r>
+        <w:rPr>
+          <w:rFonts w:ascii="Arial" w:cs="Arial" w:eastAsia="Arial" w:hAnsi="Arial"/>
+          <w:b/>
+          <w:bCs/>
+          <w:sz w:val="22"/>
+          <w:szCs w:val="22"/>
+        </w:rPr>
+        <w:t xml:space="preserve">Key Tasks: </w:t>
+      </w:r>
+      <w:r>
+        <w:rPr>
+          <w:rFonts w:ascii="Arial" w:cs="Arial" w:eastAsia="Arial" w:hAnsi="Arial"/>
+          <w:sz w:val="22"/>
+          <w:szCs w:val="22"/>
+        </w:rPr>
+        <w:t xml:space="preserve">Configure Azure OpenAI model deployments, tune RAG pipeline for semiconductor terminology and part numbers, design function calling schemas, optimize system prompts, establish model evaluation benchmarks, coordinate with existing AI/ML initiatives.</w:t>
+      </w:r>
+    </w:p>
+    <w:p>
+      <w:pPr>
+        <w:pStyle w:val="Heading3"/>
+      </w:pPr>
+      <w:r>
+        <w:t xml:space="preserve">Talking Points</w:t>
+      </w:r>
+    </w:p>
+    <w:p>
+      <w:pPr>
+        <w:pStyle w:val="ListParagraph"/>
+        <w:numPr>
+          <w:ilvl w:val="0"/>
+          <w:numId w:val="2"/>
+        </w:numPr>
+      </w:pPr>
+      <w:r>
+        <w:rPr>
+          <w:rFonts w:ascii="Arial" w:cs="Arial" w:eastAsia="Arial" w:hAnsi="Arial"/>
+          <w:sz w:val="22"/>
+          <w:szCs w:val="22"/>
+        </w:rPr>
+        <w:t xml:space="preserve">"The RAG pipeline needs to handle semiconductor-specific patterns: part numbers (MT48AX...), JEDEC standards (JESD79-5), process nodes (1α DRAM), and technical abbreviations."</w:t>
+      </w:r>
+    </w:p>
+    <w:p>
+      <w:pPr>
+        <w:pStyle w:val="ListParagraph"/>
+        <w:numPr>
+          <w:ilvl w:val="0"/>
+          <w:numId w:val="2"/>
+        </w:numPr>
+      </w:pPr>
+      <w:r>
+        <w:rPr>
+          <w:rFonts w:ascii="Arial" w:cs="Arial" w:eastAsia="Arial" w:hAnsi="Arial"/>
+          <w:sz w:val="22"/>
+          <w:szCs w:val="22"/>
+        </w:rPr>
+        <w:t xml:space="preserve">"We support 3 model tiers: Pro (GPT-4o for complex technical queries), Basic (GPT-4o-mini for standard support), Lite (phi-4 for high-volume FAQs). This optimizes cost by 40–60%."</w:t>
+      </w:r>
+    </w:p>
+    <w:p>
+      <w:pPr>
+        <w:pStyle w:val="ListParagraph"/>
+        <w:numPr>
+          <w:ilvl w:val="0"/>
+          <w:numId w:val="2"/>
+        </w:numPr>
+      </w:pPr>
+      <w:r>
+        <w:rPr>
+          <w:rFonts w:ascii="Arial" w:cs="Arial" w:eastAsia="Arial" w:hAnsi="Arial"/>
+          <w:sz w:val="22"/>
+          <w:szCs w:val="22"/>
+        </w:rPr>
+        <w:t xml:space="preserve">"How does this AI support initiative align with your existing ML workloads (yield prediction, defect detection)? Can we share Azure infrastructure?"</w:t>
+      </w:r>
+    </w:p>
+    <w:p>
+      <w:pPr>
+        <w:pStyle w:val="ListParagraph"/>
+        <w:numPr>
+          <w:ilvl w:val="0"/>
+          <w:numId w:val="2"/>
+        </w:numPr>
+      </w:pPr>
+      <w:r>
+        <w:rPr>
+          <w:rFonts w:ascii="Arial" w:cs="Arial" w:eastAsia="Arial" w:hAnsi="Arial"/>
+          <w:sz w:val="22"/>
+          <w:szCs w:val="22"/>
+        </w:rPr>
+        <w:t xml:space="preserve">"We’ll need your team to help tune the system prompt and evaluate response quality against your engineering accuracy standards."</w:t>
+      </w:r>
+    </w:p>
+    <w:p>
+      <w:pPr>
+        <w:spacing w:before="200"/>
+      </w:pPr>
+    </w:p>
+    <w:p>
+      <w:pPr>
+        <w:pStyle w:val="Heading2"/>
+      </w:pPr>
+      <w:r>
+        <w:t xml:space="preserve">14.10 Unified Communications / Telephony (UC Manager)</w:t>
+      </w:r>
+    </w:p>
+    <w:p>
+      <w:pPr>
+        <w:pStyle w:val="Heading3"/>
+      </w:pPr>
+      <w:r>
+        <w:t xml:space="preserve">Engagement Priority: Medium — Weeks 3–4</w:t>
+      </w:r>
+    </w:p>
+    <w:p>
+      <w:pPr>
+        <w:spacing w:after="200"/>
+      </w:pPr>
+      <w:r>
+        <w:rPr>
+          <w:rFonts w:ascii="Arial" w:cs="Arial" w:eastAsia="Arial" w:hAnsi="Arial"/>
+          <w:b/>
+          <w:bCs/>
+          <w:sz w:val="22"/>
+          <w:szCs w:val="22"/>
+        </w:rPr>
+        <w:t xml:space="preserve">Key Tasks: </w:t>
+      </w:r>
+      <w:r>
+        <w:rPr>
+          <w:rFonts w:ascii="Arial" w:cs="Arial" w:eastAsia="Arial" w:hAnsi="Arial"/>
+          <w:sz w:val="22"/>
+          <w:szCs w:val="22"/>
+        </w:rPr>
+        <w:t xml:space="preserve">Map existing telephony infrastructure, plan Teams voice channel configuration, assess Azure Communication Services for PSTN, coordinate Voice Live API integration with global telephony routing.</w:t>
+      </w:r>
+    </w:p>
+    <w:p>
+      <w:pPr>
+        <w:pStyle w:val="Heading3"/>
+      </w:pPr>
+      <w:r>
+        <w:t xml:space="preserve">Talking Points</w:t>
+      </w:r>
+    </w:p>
+    <w:p>
+      <w:pPr>
+        <w:pStyle w:val="ListParagraph"/>
+        <w:numPr>
+          <w:ilvl w:val="0"/>
+          <w:numId w:val="2"/>
+        </w:numPr>
+      </w:pPr>
+      <w:r>
+        <w:rPr>
+          <w:rFonts w:ascii="Arial" w:cs="Arial" w:eastAsia="Arial" w:hAnsi="Arial"/>
+          <w:sz w:val="22"/>
+          <w:szCs w:val="22"/>
+        </w:rPr>
+        <w:t xml:space="preserve">"The voice channel uses Azure Voice Live API with WebSocket-based real-time audio streaming — 24kHz quality, server-side VAD, noise suppression, and echo cancellation."</w:t>
+      </w:r>
+    </w:p>
+    <w:p>
+      <w:pPr>
+        <w:pStyle w:val="ListParagraph"/>
+        <w:numPr>
+          <w:ilvl w:val="0"/>
+          <w:numId w:val="2"/>
+        </w:numPr>
+      </w:pPr>
+      <w:r>
+        <w:rPr>
+          <w:rFonts w:ascii="Arial" w:cs="Arial" w:eastAsia="Arial" w:hAnsi="Arial"/>
+          <w:sz w:val="22"/>
+          <w:szCs w:val="22"/>
+        </w:rPr>
+        <w:t xml:space="preserve">"Vodafone handles 45 million queries per month across 15 languages using this same Azure voice + AI stack."</w:t>
+      </w:r>
+    </w:p>
+    <w:p>
+      <w:pPr>
+        <w:pStyle w:val="ListParagraph"/>
+        <w:numPr>
+          <w:ilvl w:val="0"/>
+          <w:numId w:val="2"/>
+        </w:numPr>
+      </w:pPr>
+      <w:r>
+        <w:rPr>
+          <w:rFonts w:ascii="Arial" w:cs="Arial" w:eastAsia="Arial" w:hAnsi="Arial"/>
+          <w:sz w:val="22"/>
+          <w:szCs w:val="22"/>
+        </w:rPr>
+        <w:t xml:space="preserve">"What does your current global telephony routing look like? We need to understand how voice calls reach support today before we add the AI layer."</w:t>
+      </w:r>
+    </w:p>
+    <w:p>
+      <w:pPr>
+        <w:pStyle w:val="ListParagraph"/>
+        <w:numPr>
+          <w:ilvl w:val="0"/>
+          <w:numId w:val="2"/>
+        </w:numPr>
+      </w:pPr>
+      <w:r>
+        <w:rPr>
+          <w:rFonts w:ascii="Arial" w:cs="Arial" w:eastAsia="Arial" w:hAnsi="Arial"/>
+          <w:sz w:val="22"/>
+          <w:szCs w:val="22"/>
+        </w:rPr>
+        <w:t xml:space="preserve">"The same AI agent handles Teams calls, browser voice, and PSTN telephony — no separate agent for each channel."</w:t>
+      </w:r>
+    </w:p>
+    <w:p>
+      <w:pPr>
+        <w:spacing w:before="200"/>
+      </w:pPr>
+    </w:p>
+    <w:p>
+      <w:pPr>
+        <w:pStyle w:val="Heading2"/>
+      </w:pPr>
+      <w:r>
+        <w:t xml:space="preserve">14.11 Knowledge Management / Technical Publications</w:t>
+      </w:r>
+    </w:p>
+    <w:p>
+      <w:pPr>
+        <w:pStyle w:val="Heading3"/>
+      </w:pPr>
+      <w:r>
+        <w:t xml:space="preserve">Engagement Priority: High — Weeks 2–3</w:t>
+      </w:r>
+    </w:p>
+    <w:p>
+      <w:pPr>
+        <w:spacing w:after="200"/>
+      </w:pPr>
+      <w:r>
+        <w:rPr>
+          <w:rFonts w:ascii="Arial" w:cs="Arial" w:eastAsia="Arial" w:hAnsi="Arial"/>
+          <w:b/>
+          <w:bCs/>
+          <w:sz w:val="22"/>
+          <w:szCs w:val="22"/>
+        </w:rPr>
+        <w:t xml:space="preserve">Key Tasks: </w:t>
+      </w:r>
+      <w:r>
+        <w:rPr>
+          <w:rFonts w:ascii="Arial" w:cs="Arial" w:eastAsia="Arial" w:hAnsi="Arial"/>
+          <w:sz w:val="22"/>
+          <w:szCs w:val="22"/>
+        </w:rPr>
+        <w:t xml:space="preserve">Inventory all knowledge sources (datasheets, technical notes, app notes, qualification reports, firmware release notes), define content classification levels (public/NDA/internal), establish indexing and update workflows, plan content migration to Azure AI Search.</w:t>
+      </w:r>
+    </w:p>
+    <w:p>
+      <w:pPr>
+        <w:pStyle w:val="Heading3"/>
+      </w:pPr>
+      <w:r>
+        <w:t xml:space="preserve">Talking Points</w:t>
+      </w:r>
+    </w:p>
+    <w:p>
+      <w:pPr>
+        <w:pStyle w:val="ListParagraph"/>
+        <w:numPr>
+          <w:ilvl w:val="0"/>
+          <w:numId w:val="2"/>
+        </w:numPr>
+      </w:pPr>
+      <w:r>
+        <w:rPr>
+          <w:rFonts w:ascii="Arial" w:cs="Arial" w:eastAsia="Arial" w:hAnsi="Arial"/>
+          <w:sz w:val="22"/>
+          <w:szCs w:val="22"/>
+        </w:rPr>
+        <w:t xml:space="preserve">"The AI is only as good as its knowledge base. We need a complete inventory of what your customers and engineers ask about, and where the answers live today."</w:t>
+      </w:r>
+    </w:p>
+    <w:p>
+      <w:pPr>
+        <w:pStyle w:val="ListParagraph"/>
+        <w:numPr>
+          <w:ilvl w:val="0"/>
+          <w:numId w:val="2"/>
+        </w:numPr>
+      </w:pPr>
+      <w:r>
+        <w:rPr>
+          <w:rFonts w:ascii="Arial" w:cs="Arial" w:eastAsia="Arial" w:hAnsi="Arial"/>
+          <w:sz w:val="22"/>
+          <w:szCs w:val="22"/>
+        </w:rPr>
+        <w:t xml:space="preserve">"Content classification is critical: public datasheets (anyone), NDA-protected specs (qualified customers), internal process docs (employees only). The AI enforces these boundaries."</w:t>
+      </w:r>
+    </w:p>
+    <w:p>
+      <w:pPr>
+        <w:pStyle w:val="ListParagraph"/>
+        <w:numPr>
+          <w:ilvl w:val="0"/>
+          <w:numId w:val="2"/>
+        </w:numPr>
+      </w:pPr>
+      <w:r>
+        <w:rPr>
+          <w:rFonts w:ascii="Arial" w:cs="Arial" w:eastAsia="Arial" w:hAnsi="Arial"/>
+          <w:sz w:val="22"/>
+          <w:szCs w:val="22"/>
+        </w:rPr>
+        <w:t xml:space="preserve">"When a new product revision or errata drops, how quickly does it need to appear in the AI’s knowledge? We’ll design the update pipeline around your publishing cadence."</w:t>
+      </w:r>
+    </w:p>
+    <w:p>
+      <w:pPr>
+        <w:pStyle w:val="ListParagraph"/>
+        <w:numPr>
+          <w:ilvl w:val="0"/>
+          <w:numId w:val="2"/>
+        </w:numPr>
+      </w:pPr>
+      <w:r>
+        <w:rPr>
+          <w:rFonts w:ascii="Arial" w:cs="Arial" w:eastAsia="Arial" w:hAnsi="Arial"/>
+          <w:sz w:val="22"/>
+          <w:szCs w:val="22"/>
+        </w:rPr>
+        <w:t xml:space="preserve">"Can you map your current document types: how many datasheets, technical notes, app notes, and design guides exist? What format are they in?"</w:t>
+      </w:r>
+    </w:p>
+    <w:p>
+      <w:pPr>
+        <w:spacing w:before="200"/>
+      </w:pPr>
+    </w:p>
+    <w:p>
+      <w:pPr>
+        <w:pStyle w:val="Heading2"/>
+      </w:pPr>
+      <w:r>
+        <w:t xml:space="preserve">14.12 Product / Digital Experience (Product Owner / UX)</w:t>
+      </w:r>
+    </w:p>
+    <w:p>
+      <w:pPr>
+        <w:pStyle w:val="Heading3"/>
+      </w:pPr>
+      <w:r>
+        <w:t xml:space="preserve">Engagement Priority: Medium — Weeks 3–4</w:t>
+      </w:r>
+    </w:p>
+    <w:p>
+      <w:pPr>
+        <w:spacing w:after="200"/>
+      </w:pPr>
+      <w:r>
+        <w:rPr>
+          <w:rFonts w:ascii="Arial" w:cs="Arial" w:eastAsia="Arial" w:hAnsi="Arial"/>
+          <w:b/>
+          <w:bCs/>
+          <w:sz w:val="22"/>
+          <w:szCs w:val="22"/>
+        </w:rPr>
+        <w:t xml:space="preserve">Key Tasks: </w:t>
+      </w:r>
+      <w:r>
+        <w:rPr>
+          <w:rFonts w:ascii="Arial" w:cs="Arial" w:eastAsia="Arial" w:hAnsi="Arial"/>
+          <w:sz w:val="22"/>
+          <w:szCs w:val="22"/>
+        </w:rPr>
+        <w:t xml:space="preserve">Define conversation flows and UX patterns, review branding guidelines for AI assistant, design parametric search and cross-reference features, plan customer portal integration.</w:t>
+      </w:r>
+    </w:p>
+    <w:p>
+      <w:pPr>
+        <w:pStyle w:val="Heading3"/>
+      </w:pPr>
+      <w:r>
+        <w:t xml:space="preserve">Talking Points</w:t>
+      </w:r>
+    </w:p>
+    <w:p>
+      <w:pPr>
+        <w:pStyle w:val="ListParagraph"/>
+        <w:numPr>
+          <w:ilvl w:val="0"/>
+          <w:numId w:val="2"/>
+        </w:numPr>
+      </w:pPr>
+      <w:r>
+        <w:rPr>
+          <w:rFonts w:ascii="Arial" w:cs="Arial" w:eastAsia="Arial" w:hAnsi="Arial"/>
+          <w:sz w:val="22"/>
+          <w:szCs w:val="22"/>
+        </w:rPr>
+        <w:t xml:space="preserve">"The demo shows a branded AI assistant with your visual identity, custom suggested questions, and structured responses. What adjustments does the UX need for your customers?"</w:t>
+      </w:r>
+    </w:p>
+    <w:p>
+      <w:pPr>
+        <w:pStyle w:val="ListParagraph"/>
+        <w:numPr>
+          <w:ilvl w:val="0"/>
+          <w:numId w:val="2"/>
+        </w:numPr>
+      </w:pPr>
+      <w:r>
+        <w:rPr>
+          <w:rFonts w:ascii="Arial" w:cs="Arial" w:eastAsia="Arial" w:hAnsi="Arial"/>
+          <w:sz w:val="22"/>
+          <w:szCs w:val="22"/>
+        </w:rPr>
+        <w:t xml:space="preserve">"We can design conversation flows for common product selection journeys: ‘I need a DDR5 module with X speed, Y capacity, Z temperature rating.’"</w:t>
+      </w:r>
+    </w:p>
+    <w:p>
+      <w:pPr>
+        <w:pStyle w:val="ListParagraph"/>
+        <w:numPr>
+          <w:ilvl w:val="0"/>
+          <w:numId w:val="2"/>
+        </w:numPr>
+      </w:pPr>
+      <w:r>
+        <w:rPr>
+          <w:rFonts w:ascii="Arial" w:cs="Arial" w:eastAsia="Arial" w:hAnsi="Arial"/>
+          <w:sz w:val="22"/>
+          <w:szCs w:val="22"/>
+        </w:rPr>
+        <w:t xml:space="preserve">"Where should the AI live in your digital experience? Embedded in the customer portal? As a Teams app? As a standalone browser widget?"</w:t>
+      </w:r>
+    </w:p>
+    <w:p>
+      <w:pPr>
+        <w:spacing w:before="200"/>
+      </w:pPr>
+    </w:p>
+    <w:p>
+      <w:pPr>
+        <w:pStyle w:val="Heading2"/>
+      </w:pPr>
+      <w:r>
+        <w:t xml:space="preserve">14.13 Legal / Privacy / Trade Compliance</w:t>
+      </w:r>
+    </w:p>
+    <w:p>
+      <w:pPr>
+        <w:pStyle w:val="Heading3"/>
+      </w:pPr>
+      <w:r>
+        <w:t xml:space="preserve">Engagement Priority: High — Weeks 2–3</w:t>
+      </w:r>
+    </w:p>
+    <w:p>
+      <w:pPr>
+        <w:spacing w:after="200"/>
+      </w:pPr>
+      <w:r>
+        <w:rPr>
+          <w:rFonts w:ascii="Arial" w:cs="Arial" w:eastAsia="Arial" w:hAnsi="Arial"/>
+          <w:b/>
+          <w:bCs/>
+          <w:sz w:val="22"/>
+          <w:szCs w:val="22"/>
+        </w:rPr>
+        <w:t xml:space="preserve">Key Tasks: </w:t>
+      </w:r>
+      <w:r>
+        <w:rPr>
+          <w:rFonts w:ascii="Arial" w:cs="Arial" w:eastAsia="Arial" w:hAnsi="Arial"/>
+          <w:sz w:val="22"/>
+          <w:szCs w:val="22"/>
+        </w:rPr>
+        <w:t xml:space="preserve">Review AI disclosure requirements, assess ITAR/EAR implications for AI-served technical content, define data retention policies for conversation logs, approve responsible AI usage terms, validate CHIPS Act compliance for any government-funded program data.</w:t>
+      </w:r>
+    </w:p>
+    <w:p>
+      <w:pPr>
+        <w:pStyle w:val="Heading3"/>
+      </w:pPr>
+      <w:r>
+        <w:t xml:space="preserve">Talking Points</w:t>
+      </w:r>
+    </w:p>
+    <w:p>
+      <w:pPr>
+        <w:pStyle w:val="ListParagraph"/>
+        <w:numPr>
+          <w:ilvl w:val="0"/>
+          <w:numId w:val="2"/>
+        </w:numPr>
+      </w:pPr>
+      <w:r>
+        <w:rPr>
+          <w:rFonts w:ascii="Arial" w:cs="Arial" w:eastAsia="Arial" w:hAnsi="Arial"/>
+          <w:sz w:val="22"/>
+          <w:szCs w:val="22"/>
+        </w:rPr>
+        <w:t xml:space="preserve">"Do we need to disclose to customers that they’re interacting with an AI? What language is required in your jurisdiction?"</w:t>
+      </w:r>
+    </w:p>
+    <w:p>
+      <w:pPr>
+        <w:pStyle w:val="ListParagraph"/>
+        <w:numPr>
+          <w:ilvl w:val="0"/>
+          <w:numId w:val="2"/>
+        </w:numPr>
+      </w:pPr>
+      <w:r>
+        <w:rPr>
+          <w:rFonts w:ascii="Arial" w:cs="Arial" w:eastAsia="Arial" w:hAnsi="Arial"/>
+          <w:sz w:val="22"/>
+          <w:szCs w:val="22"/>
+        </w:rPr>
+        <w:t xml:space="preserve">"For export-controlled content, the AI will never serve ITAR/EAR restricted data without identity verification through Entra ID and proper clearance classification."</w:t>
+      </w:r>
+    </w:p>
+    <w:p>
+      <w:pPr>
+        <w:pStyle w:val="ListParagraph"/>
+        <w:numPr>
+          <w:ilvl w:val="0"/>
+          <w:numId w:val="2"/>
+        </w:numPr>
+      </w:pPr>
+      <w:r>
+        <w:rPr>
+          <w:rFonts w:ascii="Arial" w:cs="Arial" w:eastAsia="Arial" w:hAnsi="Arial"/>
+          <w:sz w:val="22"/>
+          <w:szCs w:val="22"/>
+        </w:rPr>
+        <w:t xml:space="preserve">"Conversation logs will be retained for [X days/months] in Cosmos DB within your Azure tenant. What’s your data retention policy?"</w:t>
+      </w:r>
+    </w:p>
+    <w:p>
+      <w:pPr>
+        <w:pStyle w:val="ListParagraph"/>
+        <w:numPr>
+          <w:ilvl w:val="0"/>
+          <w:numId w:val="2"/>
+        </w:numPr>
+      </w:pPr>
+      <w:r>
+        <w:rPr>
+          <w:rFonts w:ascii="Arial" w:cs="Arial" w:eastAsia="Arial" w:hAnsi="Arial"/>
+          <w:sz w:val="22"/>
+          <w:szCs w:val="22"/>
+        </w:rPr>
+        <w:t xml:space="preserve">"Are there any CHIPS Act reporting obligations that affect how we handle AI interactions related to government-funded programs?"</w:t>
+      </w:r>
+    </w:p>
+    <w:p>
+      <w:pPr>
+        <w:spacing w:before="200"/>
+      </w:pPr>
+    </w:p>
+    <w:p>
+      <w:pPr>
+        <w:pStyle w:val="Heading2"/>
+      </w:pPr>
+      <w:r>
+        <w:t xml:space="preserve">14.14 Change Management / Training</w:t>
+      </w:r>
+    </w:p>
+    <w:p>
+      <w:pPr>
+        <w:pStyle w:val="Heading3"/>
+      </w:pPr>
+      <w:r>
+        <w:t xml:space="preserve">Engagement Priority: Medium — Weeks 4–5</w:t>
+      </w:r>
+    </w:p>
+    <w:p>
+      <w:pPr>
+        <w:spacing w:after="200"/>
+      </w:pPr>
+      <w:r>
+        <w:rPr>
+          <w:rFonts w:ascii="Arial" w:cs="Arial" w:eastAsia="Arial" w:hAnsi="Arial"/>
+          <w:b/>
+          <w:bCs/>
+          <w:sz w:val="22"/>
+          <w:szCs w:val="22"/>
+        </w:rPr>
+        <w:t xml:space="preserve">Key Tasks: </w:t>
+      </w:r>
+      <w:r>
+        <w:rPr>
+          <w:rFonts w:ascii="Arial" w:cs="Arial" w:eastAsia="Arial" w:hAnsi="Arial"/>
+          <w:sz w:val="22"/>
+          <w:szCs w:val="22"/>
+        </w:rPr>
+        <w:t xml:space="preserve">Develop adoption strategy, create training materials for TSEs and end users, plan pilot rollout (recommended: one product line first), design feedback collection mechanisms, set adoption KPIs.</w:t>
+      </w:r>
+    </w:p>
+    <w:p>
+      <w:pPr>
+        <w:pStyle w:val="Heading3"/>
+      </w:pPr>
+      <w:r>
+        <w:t xml:space="preserve">Talking Points</w:t>
+      </w:r>
+    </w:p>
+    <w:p>
+      <w:pPr>
+        <w:pStyle w:val="ListParagraph"/>
+        <w:numPr>
+          <w:ilvl w:val="0"/>
+          <w:numId w:val="2"/>
+        </w:numPr>
+      </w:pPr>
+      <w:r>
+        <w:rPr>
+          <w:rFonts w:ascii="Arial" w:cs="Arial" w:eastAsia="Arial" w:hAnsi="Arial"/>
+          <w:sz w:val="22"/>
+          <w:szCs w:val="22"/>
+        </w:rPr>
+        <w:t xml:space="preserve">"We recommend piloting with one product line — e.g., SSD technical support — before expanding. This limits blast radius and lets us tune the AI with a focused team."</w:t>
+      </w:r>
+    </w:p>
+    <w:p>
+      <w:pPr>
+        <w:pStyle w:val="ListParagraph"/>
+        <w:numPr>
+          <w:ilvl w:val="0"/>
+          <w:numId w:val="2"/>
+        </w:numPr>
+      </w:pPr>
+      <w:r>
+        <w:rPr>
+          <w:rFonts w:ascii="Arial" w:cs="Arial" w:eastAsia="Arial" w:hAnsi="Arial"/>
+          <w:sz w:val="22"/>
+          <w:szCs w:val="22"/>
+        </w:rPr>
+        <w:t xml:space="preserve">"Lenovo went from zero to second-largest Copilot user in 45 days. Fast adoption is possible when the tool genuinely saves time."</w:t>
+      </w:r>
+    </w:p>
+    <w:p>
+      <w:pPr>
+        <w:pStyle w:val="ListParagraph"/>
+        <w:numPr>
+          <w:ilvl w:val="0"/>
+          <w:numId w:val="2"/>
+        </w:numPr>
+      </w:pPr>
+      <w:r>
+        <w:rPr>
+          <w:rFonts w:ascii="Arial" w:cs="Arial" w:eastAsia="Arial" w:hAnsi="Arial"/>
+          <w:sz w:val="22"/>
+          <w:szCs w:val="22"/>
+        </w:rPr>
+        <w:t xml:space="preserve">"What’s your preferred training format? Hands-on workshops, video walkthroughs, or embedded guides within the tool?"</w:t>
+      </w:r>
+    </w:p>
+    <w:p>
+      <w:pPr>
+        <w:pStyle w:val="ListParagraph"/>
+        <w:numPr>
+          <w:ilvl w:val="0"/>
+          <w:numId w:val="2"/>
+        </w:numPr>
+      </w:pPr>
+      <w:r>
+        <w:rPr>
+          <w:rFonts w:ascii="Arial" w:cs="Arial" w:eastAsia="Arial" w:hAnsi="Arial"/>
+          <w:sz w:val="22"/>
+          <w:szCs w:val="22"/>
+        </w:rPr>
+        <w:t xml:space="preserve">"We’ll track adoption daily: queries per agent, AI-assisted resolution rate, and qualitative feedback from pilot users."</w:t>
+      </w:r>
+    </w:p>
+    <w:p>
+      <w:pPr>
+        <w:spacing w:before="200"/>
+      </w:pPr>
+    </w:p>
+    <w:p>
+      <w:pPr>
+        <w:pStyle w:val="Heading2"/>
+      </w:pPr>
+      <w:r>
+        <w:t xml:space="preserve">14.15 Quality &amp; Reliability Engineering</w:t>
+      </w:r>
+    </w:p>
+    <w:p>
+      <w:pPr>
+        <w:pStyle w:val="Heading3"/>
+      </w:pPr>
+      <w:r>
+        <w:t xml:space="preserve">Engagement Priority: Medium — Weeks 3–4</w:t>
+      </w:r>
+    </w:p>
+    <w:p>
+      <w:pPr>
+        <w:spacing w:after="200"/>
+      </w:pPr>
+      <w:r>
+        <w:rPr>
+          <w:rFonts w:ascii="Arial" w:cs="Arial" w:eastAsia="Arial" w:hAnsi="Arial"/>
+          <w:b/>
+          <w:bCs/>
+          <w:sz w:val="22"/>
+          <w:szCs w:val="22"/>
+        </w:rPr>
+        <w:t xml:space="preserve">Key Tasks: </w:t>
+      </w:r>
+      <w:r>
+        <w:rPr>
+          <w:rFonts w:ascii="Arial" w:cs="Arial" w:eastAsia="Arial" w:hAnsi="Arial"/>
+          <w:sz w:val="22"/>
+          <w:szCs w:val="22"/>
+        </w:rPr>
+        <w:t xml:space="preserve">Define accuracy test suite against product specifications, validate AI responses meet ISO 9001 / IATF 16949 / AEC-Q100 standards, establish regression testing protocol, plan load testing for global concurrent sessions.</w:t>
+      </w:r>
+    </w:p>
+    <w:p>
+      <w:pPr>
+        <w:pStyle w:val="Heading3"/>
+      </w:pPr>
+      <w:r>
+        <w:t xml:space="preserve">Talking Points</w:t>
+      </w:r>
+    </w:p>
+    <w:p>
+      <w:pPr>
+        <w:pStyle w:val="ListParagraph"/>
+        <w:numPr>
+          <w:ilvl w:val="0"/>
+          <w:numId w:val="2"/>
+        </w:numPr>
+      </w:pPr>
+      <w:r>
+        <w:rPr>
+          <w:rFonts w:ascii="Arial" w:cs="Arial" w:eastAsia="Arial" w:hAnsi="Arial"/>
+          <w:sz w:val="22"/>
+          <w:szCs w:val="22"/>
+        </w:rPr>
+        <w:t xml:space="preserve">"Every AI response citing reliability data, qualification reports, or failure analysis procedures must meet your engineering accuracy standards. We need your team to define ‘pass’ criteria."</w:t>
+      </w:r>
+    </w:p>
+    <w:p>
+      <w:pPr>
+        <w:pStyle w:val="ListParagraph"/>
+        <w:numPr>
+          <w:ilvl w:val="0"/>
+          <w:numId w:val="2"/>
+        </w:numPr>
+      </w:pPr>
+      <w:r>
+        <w:rPr>
+          <w:rFonts w:ascii="Arial" w:cs="Arial" w:eastAsia="Arial" w:hAnsi="Arial"/>
+          <w:sz w:val="22"/>
+          <w:szCs w:val="22"/>
+        </w:rPr>
+        <w:t xml:space="preserve">"We’ll build an automated test suite of 100+ verified Q&amp;A pairs that runs on every knowledge base update. Your team defines the golden answers."</w:t>
+      </w:r>
+    </w:p>
+    <w:p>
+      <w:pPr>
+        <w:pStyle w:val="ListParagraph"/>
+        <w:numPr>
+          <w:ilvl w:val="0"/>
+          <w:numId w:val="2"/>
+        </w:numPr>
+      </w:pPr>
+      <w:r>
+        <w:rPr>
+          <w:rFonts w:ascii="Arial" w:cs="Arial" w:eastAsia="Arial" w:hAnsi="Arial"/>
+          <w:sz w:val="22"/>
+          <w:szCs w:val="22"/>
+        </w:rPr>
+        <w:t xml:space="preserve">"For automotive-grade products (AEC-Q100), can the AI cite qualification data? Or must those queries always route to a human AE?"</w:t>
+      </w:r>
+    </w:p>
+    <w:p>
+      <w:pPr>
+        <w:pStyle w:val="ListParagraph"/>
+        <w:numPr>
+          <w:ilvl w:val="0"/>
+          <w:numId w:val="2"/>
+        </w:numPr>
+      </w:pPr>
+      <w:r>
+        <w:rPr>
+          <w:rFonts w:ascii="Arial" w:cs="Arial" w:eastAsia="Arial" w:hAnsi="Arial"/>
+          <w:sz w:val="22"/>
+          <w:szCs w:val="22"/>
+        </w:rPr>
+        <w:t xml:space="preserve">"What’s the target for concurrent sessions globally? We need to load test across Asia, Europe, and Americas time zones."</w:t>
       </w:r>
     </w:p>
     <w:sectPr>

</xml_diff>